<commit_message>
20.10 - Working on the workflow and timeline
</commit_message>
<xml_diff>
--- a/CA1-Strategic Thinking_with_AI_declaration.docx
+++ b/CA1-Strategic Thinking_with_AI_declaration.docx
@@ -2240,6 +2240,7 @@
           <w:szCs w:val="24"/>
         </w:rPr>
       </w:pPr>
+      <w:bookmarkStart w:id="78" w:name="_Toc243389953"/>
       <w:r>
         <w:rPr>
           <w:rFonts w:asciiTheme="minorHAnsi" w:eastAsia="Times New Roman" w:hAnsiTheme="minorHAnsi" w:cs="Times New Roman"/>
@@ -2251,6 +2252,7 @@
         </w:rPr>
         <w:t>Enabling Version Control in Microsoft Word:</w:t>
       </w:r>
+      <w:bookmarkEnd w:id="78"/>
     </w:p>
     <w:p>
       <w:pPr>
@@ -3452,24 +3454,6 @@
           <w:sz w:val="32"/>
           <w:szCs w:val="32"/>
           <w:lang w:val="pt-BR"/>
-          <w:rPrChange w:id="78" w:author="Eduardo Flach" w:date="2026-10-16T14:33:00Z">
-            <w:rPr>
-              <w:rFonts w:ascii="Play" w:eastAsia="Play" w:hAnsi="Play" w:cs="Play"/>
-              <w:color w:val="0F4761"/>
-              <w:sz w:val="32"/>
-              <w:szCs w:val="32"/>
-            </w:rPr>
-          </w:rPrChange>
-        </w:rPr>
-      </w:pPr>
-      <w:proofErr w:type="spellStart"/>
-      <w:r>
-        <w:rPr>
-          <w:rFonts w:ascii="Play" w:eastAsia="Play" w:hAnsi="Play" w:cs="Play"/>
-          <w:color w:val="0F4761"/>
-          <w:sz w:val="32"/>
-          <w:szCs w:val="32"/>
-          <w:lang w:val="pt-BR"/>
           <w:rPrChange w:id="79" w:author="Eduardo Flach" w:date="2026-10-16T14:33:00Z">
             <w:rPr>
               <w:rFonts w:ascii="Play" w:eastAsia="Play" w:hAnsi="Play" w:cs="Play"/>
@@ -3479,218 +3463,1127 @@
             </w:rPr>
           </w:rPrChange>
         </w:rPr>
+      </w:pPr>
+      <w:proofErr w:type="spellStart"/>
+      <w:r>
+        <w:rPr>
+          <w:rFonts w:ascii="Play" w:eastAsia="Play" w:hAnsi="Play" w:cs="Play"/>
+          <w:color w:val="0F4761"/>
+          <w:sz w:val="32"/>
+          <w:szCs w:val="32"/>
+          <w:lang w:val="pt-BR"/>
+          <w:rPrChange w:id="80" w:author="Eduardo Flach" w:date="2026-10-16T14:33:00Z">
+            <w:rPr>
+              <w:rFonts w:ascii="Play" w:eastAsia="Play" w:hAnsi="Play" w:cs="Play"/>
+              <w:color w:val="0F4761"/>
+              <w:sz w:val="32"/>
+              <w:szCs w:val="32"/>
+            </w:rPr>
+          </w:rPrChange>
+        </w:rPr>
         <w:lastRenderedPageBreak/>
         <w:t>Contents</w:t>
       </w:r>
       <w:proofErr w:type="spellEnd"/>
     </w:p>
+    <w:customXmlInsRangeStart w:id="81" w:author="Eduardo Flach" w:date="2026-10-20T11:58:00Z"/>
     <w:sdt>
       <w:sdtPr>
-        <w:id w:val="-1939593324"/>
+        <w:rPr>
+          <w:lang w:val="pt-BR"/>
+        </w:rPr>
+        <w:id w:val="970633227"/>
         <w:docPartObj>
           <w:docPartGallery w:val="Table of Contents"/>
           <w:docPartUnique/>
         </w:docPartObj>
       </w:sdtPr>
+      <w:sdtEndPr>
+        <w:rPr>
+          <w:rFonts w:ascii="Calibri" w:eastAsia="Calibri" w:hAnsi="Calibri" w:cs="Calibri"/>
+          <w:b/>
+          <w:bCs/>
+          <w:color w:val="auto"/>
+          <w:spacing w:val="0"/>
+          <w:sz w:val="22"/>
+          <w:szCs w:val="22"/>
+        </w:rPr>
+      </w:sdtEndPr>
       <w:sdtContent>
+        <w:customXmlInsRangeEnd w:id="81"/>
         <w:p>
           <w:pPr>
-            <w:pBdr>
-              <w:top w:val="nil"/>
-              <w:left w:val="nil"/>
-              <w:bottom w:val="nil"/>
-              <w:right w:val="nil"/>
-              <w:between w:val="nil"/>
-            </w:pBdr>
+            <w:pStyle w:val="CabealhodoSumrio"/>
+            <w:rPr>
+              <w:ins w:id="82" w:author="Eduardo Flach" w:date="2026-10-20T11:58:00Z"/>
+            </w:rPr>
+          </w:pPr>
+          <w:ins w:id="83" w:author="Eduardo Flach" w:date="2026-10-20T11:58:00Z">
+            <w:r>
+              <w:rPr>
+                <w:lang w:val="pt-BR"/>
+              </w:rPr>
+              <w:t>Sumário</w:t>
+            </w:r>
+          </w:ins>
+        </w:p>
+        <w:p>
+          <w:pPr>
+            <w:pStyle w:val="Sumrio3"/>
             <w:tabs>
               <w:tab w:val="right" w:leader="dot" w:pos="9016"/>
             </w:tabs>
-            <w:spacing w:after="100"/>
             <w:rPr>
-              <w:rFonts w:ascii="Aptos" w:eastAsia="Aptos" w:hAnsi="Aptos" w:cs="Aptos"/>
-              <w:color w:val="000000"/>
+              <w:rFonts w:asciiTheme="minorHAnsi" w:eastAsiaTheme="minorEastAsia" w:hAnsiTheme="minorHAnsi" w:cstheme="minorBidi"/>
+              <w:noProof/>
+              <w:kern w:val="2"/>
               <w:sz w:val="24"/>
               <w:szCs w:val="24"/>
+              <w14:ligatures w14:val="standardContextual"/>
             </w:rPr>
           </w:pPr>
-          <w:r>
-            <w:fldChar w:fldCharType="begin"/>
-          </w:r>
-          <w:r>
-            <w:instrText xml:space="preserve"> TOC \h \u \z \t "Heading 1,1,Heading 2,2,Heading 3,3,"</w:instrText>
-          </w:r>
-          <w:r>
-            <w:fldChar w:fldCharType="separate"/>
-          </w:r>
-          <w:hyperlink w:anchor="_heading=h.gjdgxs">
-            <w:r>
-              <w:rPr>
-                <w:color w:val="000000"/>
-              </w:rPr>
-              <w:t>Introduction</w:t>
-            </w:r>
-            <w:r>
-              <w:rPr>
-                <w:color w:val="000000"/>
+          <w:ins w:id="84" w:author="Eduardo Flach" w:date="2026-10-20T11:58:00Z">
+            <w:r>
+              <w:fldChar w:fldCharType="begin"/>
+            </w:r>
+            <w:r>
+              <w:instrText xml:space="preserve"> TOC \o "1-3" \h \z \u </w:instrText>
+            </w:r>
+            <w:r>
+              <w:fldChar w:fldCharType="separate"/>
+            </w:r>
+          </w:ins>
+          <w:hyperlink w:anchor="_Toc243389953" w:history="1">
+            <w:r>
+              <w:rPr>
+                <w:rStyle w:val="Hyperlink"/>
+                <w:rFonts w:eastAsia="Times New Roman" w:cs="Times New Roman"/>
+                <w:b/>
+                <w:bCs/>
+                <w:noProof/>
+              </w:rPr>
+              <w:t>Enabling Version Control in Microsoft Word:</w:t>
+            </w:r>
+            <w:r>
+              <w:rPr>
+                <w:noProof/>
+                <w:webHidden/>
               </w:rPr>
               <w:tab/>
-              <w:t>1</w:t>
+            </w:r>
+            <w:r>
+              <w:rPr>
+                <w:noProof/>
+                <w:webHidden/>
+              </w:rPr>
+              <w:fldChar w:fldCharType="begin"/>
+            </w:r>
+            <w:r>
+              <w:rPr>
+                <w:noProof/>
+                <w:webHidden/>
+              </w:rPr>
+              <w:instrText xml:space="preserve"> PAGEREF _Toc243389953 \h </w:instrText>
+            </w:r>
+            <w:r>
+              <w:rPr>
+                <w:noProof/>
+                <w:webHidden/>
+              </w:rPr>
+            </w:r>
+            <w:r>
+              <w:rPr>
+                <w:noProof/>
+                <w:webHidden/>
+              </w:rPr>
+              <w:fldChar w:fldCharType="separate"/>
+            </w:r>
+            <w:r>
+              <w:rPr>
+                <w:noProof/>
+                <w:webHidden/>
+              </w:rPr>
+              <w:t>4</w:t>
+            </w:r>
+            <w:r>
+              <w:rPr>
+                <w:noProof/>
+                <w:webHidden/>
+              </w:rPr>
+              <w:fldChar w:fldCharType="end"/>
             </w:r>
           </w:hyperlink>
         </w:p>
         <w:p>
           <w:pPr>
-            <w:pBdr>
-              <w:top w:val="nil"/>
-              <w:left w:val="nil"/>
-              <w:bottom w:val="nil"/>
-              <w:right w:val="nil"/>
-              <w:between w:val="nil"/>
-            </w:pBdr>
+            <w:pStyle w:val="Sumrio1"/>
             <w:tabs>
               <w:tab w:val="right" w:leader="dot" w:pos="9016"/>
             </w:tabs>
-            <w:spacing w:after="100"/>
             <w:rPr>
-              <w:rFonts w:ascii="Aptos" w:eastAsia="Aptos" w:hAnsi="Aptos" w:cs="Aptos"/>
-              <w:color w:val="000000"/>
+              <w:rFonts w:asciiTheme="minorHAnsi" w:eastAsiaTheme="minorEastAsia" w:hAnsiTheme="minorHAnsi" w:cstheme="minorBidi"/>
+              <w:noProof/>
+              <w:kern w:val="2"/>
               <w:sz w:val="24"/>
               <w:szCs w:val="24"/>
+              <w14:ligatures w14:val="standardContextual"/>
             </w:rPr>
           </w:pPr>
-          <w:hyperlink w:anchor="_heading=h.30j0zll">
-            <w:r>
-              <w:rPr>
-                <w:color w:val="000000"/>
-              </w:rPr>
-              <w:t>Chapter 1</w:t>
-            </w:r>
-            <w:r>
-              <w:rPr>
-                <w:color w:val="000000"/>
+          <w:hyperlink w:anchor="_Toc243389954" w:history="1">
+            <w:r>
+              <w:rPr>
+                <w:rStyle w:val="Hyperlink"/>
+                <w:noProof/>
+              </w:rPr>
+              <w:t>Introduction</w:t>
+            </w:r>
+            <w:r>
+              <w:rPr>
+                <w:noProof/>
+                <w:webHidden/>
               </w:rPr>
               <w:tab/>
+            </w:r>
+            <w:r>
+              <w:rPr>
+                <w:noProof/>
+                <w:webHidden/>
+              </w:rPr>
+              <w:fldChar w:fldCharType="begin"/>
+            </w:r>
+            <w:r>
+              <w:rPr>
+                <w:noProof/>
+                <w:webHidden/>
+              </w:rPr>
+              <w:instrText xml:space="preserve"> PAGEREF _Toc243389954 \h </w:instrText>
+            </w:r>
+            <w:r>
+              <w:rPr>
+                <w:noProof/>
+                <w:webHidden/>
+              </w:rPr>
+            </w:r>
+            <w:r>
+              <w:rPr>
+                <w:noProof/>
+                <w:webHidden/>
+              </w:rPr>
+              <w:fldChar w:fldCharType="separate"/>
+            </w:r>
+            <w:r>
+              <w:rPr>
+                <w:noProof/>
+                <w:webHidden/>
+              </w:rPr>
               <w:t>1</w:t>
+            </w:r>
+            <w:r>
+              <w:rPr>
+                <w:noProof/>
+                <w:webHidden/>
+              </w:rPr>
+              <w:fldChar w:fldCharType="end"/>
             </w:r>
           </w:hyperlink>
         </w:p>
         <w:p>
           <w:pPr>
-            <w:pBdr>
-              <w:top w:val="nil"/>
-              <w:left w:val="nil"/>
-              <w:bottom w:val="nil"/>
-              <w:right w:val="nil"/>
-              <w:between w:val="nil"/>
-            </w:pBdr>
+            <w:pStyle w:val="Sumrio1"/>
             <w:tabs>
               <w:tab w:val="right" w:leader="dot" w:pos="9016"/>
             </w:tabs>
-            <w:spacing w:after="100"/>
-            <w:ind w:left="220"/>
             <w:rPr>
-              <w:rFonts w:ascii="Aptos" w:eastAsia="Aptos" w:hAnsi="Aptos" w:cs="Aptos"/>
-              <w:color w:val="000000"/>
+              <w:rFonts w:asciiTheme="minorHAnsi" w:eastAsiaTheme="minorEastAsia" w:hAnsiTheme="minorHAnsi" w:cstheme="minorBidi"/>
+              <w:noProof/>
+              <w:kern w:val="2"/>
               <w:sz w:val="24"/>
               <w:szCs w:val="24"/>
+              <w14:ligatures w14:val="standardContextual"/>
             </w:rPr>
           </w:pPr>
-          <w:hyperlink w:anchor="_heading=h.1fob9te">
-            <w:r>
-              <w:rPr>
-                <w:color w:val="000000"/>
-              </w:rPr>
-              <w:t>Chapter 1.1</w:t>
-            </w:r>
-            <w:r>
-              <w:rPr>
-                <w:color w:val="000000"/>
+          <w:hyperlink w:anchor="_Toc243389955" w:history="1">
+            <w:r>
+              <w:rPr>
+                <w:rStyle w:val="Hyperlink"/>
+                <w:noProof/>
+              </w:rPr>
+              <w:t>Problem Definition</w:t>
+            </w:r>
+            <w:r>
+              <w:rPr>
+                <w:noProof/>
+                <w:webHidden/>
               </w:rPr>
               <w:tab/>
+            </w:r>
+            <w:r>
+              <w:rPr>
+                <w:noProof/>
+                <w:webHidden/>
+              </w:rPr>
+              <w:fldChar w:fldCharType="begin"/>
+            </w:r>
+            <w:r>
+              <w:rPr>
+                <w:noProof/>
+                <w:webHidden/>
+              </w:rPr>
+              <w:instrText xml:space="preserve"> PAGEREF _Toc243389955 \h </w:instrText>
+            </w:r>
+            <w:r>
+              <w:rPr>
+                <w:noProof/>
+                <w:webHidden/>
+              </w:rPr>
+            </w:r>
+            <w:r>
+              <w:rPr>
+                <w:noProof/>
+                <w:webHidden/>
+              </w:rPr>
+              <w:fldChar w:fldCharType="separate"/>
+            </w:r>
+            <w:r>
+              <w:rPr>
+                <w:noProof/>
+                <w:webHidden/>
+              </w:rPr>
               <w:t>1</w:t>
+            </w:r>
+            <w:r>
+              <w:rPr>
+                <w:noProof/>
+                <w:webHidden/>
+              </w:rPr>
+              <w:fldChar w:fldCharType="end"/>
             </w:r>
           </w:hyperlink>
         </w:p>
         <w:p>
           <w:pPr>
-            <w:pBdr>
-              <w:top w:val="nil"/>
-              <w:left w:val="nil"/>
-              <w:bottom w:val="nil"/>
-              <w:right w:val="nil"/>
-              <w:between w:val="nil"/>
-            </w:pBdr>
+            <w:pStyle w:val="Sumrio1"/>
             <w:tabs>
               <w:tab w:val="right" w:leader="dot" w:pos="9016"/>
             </w:tabs>
-            <w:spacing w:after="100"/>
-            <w:ind w:left="440"/>
             <w:rPr>
-              <w:rFonts w:ascii="Aptos" w:eastAsia="Aptos" w:hAnsi="Aptos" w:cs="Aptos"/>
-              <w:color w:val="000000"/>
+              <w:rFonts w:asciiTheme="minorHAnsi" w:eastAsiaTheme="minorEastAsia" w:hAnsiTheme="minorHAnsi" w:cstheme="minorBidi"/>
+              <w:noProof/>
+              <w:kern w:val="2"/>
               <w:sz w:val="24"/>
               <w:szCs w:val="24"/>
+              <w14:ligatures w14:val="standardContextual"/>
             </w:rPr>
           </w:pPr>
-          <w:hyperlink w:anchor="_heading=h.3znysh7">
-            <w:r>
-              <w:rPr>
-                <w:color w:val="000000"/>
-              </w:rPr>
-              <w:t>Chapter 1.1.1.</w:t>
-            </w:r>
-            <w:r>
-              <w:rPr>
-                <w:color w:val="000000"/>
+          <w:hyperlink w:anchor="_Toc243389956" w:history="1">
+            <w:r>
+              <w:rPr>
+                <w:rStyle w:val="Hyperlink"/>
+                <w:noProof/>
+              </w:rPr>
+              <w:t>Aim and Objectives</w:t>
+            </w:r>
+            <w:r>
+              <w:rPr>
+                <w:noProof/>
+                <w:webHidden/>
               </w:rPr>
               <w:tab/>
+            </w:r>
+            <w:r>
+              <w:rPr>
+                <w:noProof/>
+                <w:webHidden/>
+              </w:rPr>
+              <w:fldChar w:fldCharType="begin"/>
+            </w:r>
+            <w:r>
+              <w:rPr>
+                <w:noProof/>
+                <w:webHidden/>
+              </w:rPr>
+              <w:instrText xml:space="preserve"> PAGEREF _Toc243389956 \h </w:instrText>
+            </w:r>
+            <w:r>
+              <w:rPr>
+                <w:noProof/>
+                <w:webHidden/>
+              </w:rPr>
+            </w:r>
+            <w:r>
+              <w:rPr>
+                <w:noProof/>
+                <w:webHidden/>
+              </w:rPr>
+              <w:fldChar w:fldCharType="separate"/>
+            </w:r>
+            <w:r>
+              <w:rPr>
+                <w:noProof/>
+                <w:webHidden/>
+              </w:rPr>
               <w:t>1</w:t>
+            </w:r>
+            <w:r>
+              <w:rPr>
+                <w:noProof/>
+                <w:webHidden/>
+              </w:rPr>
+              <w:fldChar w:fldCharType="end"/>
             </w:r>
           </w:hyperlink>
         </w:p>
         <w:p>
           <w:pPr>
-            <w:pBdr>
-              <w:top w:val="nil"/>
-              <w:left w:val="nil"/>
-              <w:bottom w:val="nil"/>
-              <w:right w:val="nil"/>
-              <w:between w:val="nil"/>
-            </w:pBdr>
+            <w:pStyle w:val="Sumrio1"/>
             <w:tabs>
               <w:tab w:val="right" w:leader="dot" w:pos="9016"/>
             </w:tabs>
-            <w:spacing w:after="100"/>
             <w:rPr>
-              <w:rFonts w:ascii="Aptos" w:eastAsia="Aptos" w:hAnsi="Aptos" w:cs="Aptos"/>
-              <w:color w:val="000000"/>
+              <w:rFonts w:asciiTheme="minorHAnsi" w:eastAsiaTheme="minorEastAsia" w:hAnsiTheme="minorHAnsi" w:cstheme="minorBidi"/>
+              <w:noProof/>
+              <w:kern w:val="2"/>
               <w:sz w:val="24"/>
               <w:szCs w:val="24"/>
+              <w14:ligatures w14:val="standardContextual"/>
             </w:rPr>
           </w:pPr>
-          <w:hyperlink w:anchor="_heading=h.2et92p0">
-            <w:r>
-              <w:rPr>
-                <w:color w:val="000000"/>
-              </w:rPr>
-              <w:t>References</w:t>
-            </w:r>
-            <w:r>
-              <w:rPr>
-                <w:color w:val="000000"/>
+          <w:hyperlink w:anchor="_Toc243389957" w:history="1">
+            <w:r>
+              <w:rPr>
+                <w:rStyle w:val="Hyperlink"/>
+                <w:noProof/>
+              </w:rPr>
+              <w:t>Scope</w:t>
+            </w:r>
+            <w:r>
+              <w:rPr>
+                <w:noProof/>
+                <w:webHidden/>
               </w:rPr>
               <w:tab/>
-              <w:t>2</w:t>
+            </w:r>
+            <w:r>
+              <w:rPr>
+                <w:noProof/>
+                <w:webHidden/>
+              </w:rPr>
+              <w:fldChar w:fldCharType="begin"/>
+            </w:r>
+            <w:r>
+              <w:rPr>
+                <w:noProof/>
+                <w:webHidden/>
+              </w:rPr>
+              <w:instrText xml:space="preserve"> PAGEREF _Toc243389957 \h </w:instrText>
+            </w:r>
+            <w:r>
+              <w:rPr>
+                <w:noProof/>
+                <w:webHidden/>
+              </w:rPr>
+            </w:r>
+            <w:r>
+              <w:rPr>
+                <w:noProof/>
+                <w:webHidden/>
+              </w:rPr>
+              <w:fldChar w:fldCharType="separate"/>
+            </w:r>
+            <w:r>
+              <w:rPr>
+                <w:noProof/>
+                <w:webHidden/>
+              </w:rPr>
+              <w:t>1</w:t>
+            </w:r>
+            <w:r>
+              <w:rPr>
+                <w:noProof/>
+                <w:webHidden/>
+              </w:rPr>
+              <w:fldChar w:fldCharType="end"/>
             </w:r>
           </w:hyperlink>
         </w:p>
         <w:p>
-          <w:r>
-            <w:fldChar w:fldCharType="end"/>
-          </w:r>
+          <w:pPr>
+            <w:pStyle w:val="Sumrio1"/>
+            <w:tabs>
+              <w:tab w:val="right" w:leader="dot" w:pos="9016"/>
+            </w:tabs>
+            <w:rPr>
+              <w:rFonts w:asciiTheme="minorHAnsi" w:eastAsiaTheme="minorEastAsia" w:hAnsiTheme="minorHAnsi" w:cstheme="minorBidi"/>
+              <w:noProof/>
+              <w:kern w:val="2"/>
+              <w:sz w:val="24"/>
+              <w:szCs w:val="24"/>
+              <w14:ligatures w14:val="standardContextual"/>
+            </w:rPr>
+          </w:pPr>
+          <w:hyperlink w:anchor="_Toc243389958" w:history="1">
+            <w:r>
+              <w:rPr>
+                <w:rStyle w:val="Hyperlink"/>
+                <w:noProof/>
+              </w:rPr>
+              <w:t>Methodology</w:t>
+            </w:r>
+            <w:r>
+              <w:rPr>
+                <w:noProof/>
+                <w:webHidden/>
+              </w:rPr>
+              <w:tab/>
+            </w:r>
+            <w:r>
+              <w:rPr>
+                <w:noProof/>
+                <w:webHidden/>
+              </w:rPr>
+              <w:fldChar w:fldCharType="begin"/>
+            </w:r>
+            <w:r>
+              <w:rPr>
+                <w:noProof/>
+                <w:webHidden/>
+              </w:rPr>
+              <w:instrText xml:space="preserve"> PAGEREF _Toc243389958 \h </w:instrText>
+            </w:r>
+            <w:r>
+              <w:rPr>
+                <w:noProof/>
+                <w:webHidden/>
+              </w:rPr>
+            </w:r>
+            <w:r>
+              <w:rPr>
+                <w:noProof/>
+                <w:webHidden/>
+              </w:rPr>
+              <w:fldChar w:fldCharType="separate"/>
+            </w:r>
+            <w:r>
+              <w:rPr>
+                <w:noProof/>
+                <w:webHidden/>
+              </w:rPr>
+              <w:t>2</w:t>
+            </w:r>
+            <w:r>
+              <w:rPr>
+                <w:noProof/>
+                <w:webHidden/>
+              </w:rPr>
+              <w:fldChar w:fldCharType="end"/>
+            </w:r>
+          </w:hyperlink>
         </w:p>
+        <w:p>
+          <w:pPr>
+            <w:pStyle w:val="Sumrio1"/>
+            <w:tabs>
+              <w:tab w:val="right" w:leader="dot" w:pos="9016"/>
+            </w:tabs>
+            <w:rPr>
+              <w:rFonts w:asciiTheme="minorHAnsi" w:eastAsiaTheme="minorEastAsia" w:hAnsiTheme="minorHAnsi" w:cstheme="minorBidi"/>
+              <w:noProof/>
+              <w:kern w:val="2"/>
+              <w:sz w:val="24"/>
+              <w:szCs w:val="24"/>
+              <w14:ligatures w14:val="standardContextual"/>
+            </w:rPr>
+          </w:pPr>
+          <w:hyperlink w:anchor="_Toc243389959" w:history="1">
+            <w:r>
+              <w:rPr>
+                <w:rStyle w:val="Hyperlink"/>
+                <w:noProof/>
+              </w:rPr>
+              <w:t>Data Sources</w:t>
+            </w:r>
+            <w:r>
+              <w:rPr>
+                <w:noProof/>
+                <w:webHidden/>
+              </w:rPr>
+              <w:tab/>
+            </w:r>
+            <w:r>
+              <w:rPr>
+                <w:noProof/>
+                <w:webHidden/>
+              </w:rPr>
+              <w:fldChar w:fldCharType="begin"/>
+            </w:r>
+            <w:r>
+              <w:rPr>
+                <w:noProof/>
+                <w:webHidden/>
+              </w:rPr>
+              <w:instrText xml:space="preserve"> PAGEREF _Toc243389959 \h </w:instrText>
+            </w:r>
+            <w:r>
+              <w:rPr>
+                <w:noProof/>
+                <w:webHidden/>
+              </w:rPr>
+            </w:r>
+            <w:r>
+              <w:rPr>
+                <w:noProof/>
+                <w:webHidden/>
+              </w:rPr>
+              <w:fldChar w:fldCharType="separate"/>
+            </w:r>
+            <w:r>
+              <w:rPr>
+                <w:noProof/>
+                <w:webHidden/>
+              </w:rPr>
+              <w:t>2</w:t>
+            </w:r>
+            <w:r>
+              <w:rPr>
+                <w:noProof/>
+                <w:webHidden/>
+              </w:rPr>
+              <w:fldChar w:fldCharType="end"/>
+            </w:r>
+          </w:hyperlink>
+        </w:p>
+        <w:p>
+          <w:pPr>
+            <w:pStyle w:val="Sumrio1"/>
+            <w:tabs>
+              <w:tab w:val="right" w:leader="dot" w:pos="9016"/>
+            </w:tabs>
+            <w:rPr>
+              <w:rFonts w:asciiTheme="minorHAnsi" w:eastAsiaTheme="minorEastAsia" w:hAnsiTheme="minorHAnsi" w:cstheme="minorBidi"/>
+              <w:noProof/>
+              <w:kern w:val="2"/>
+              <w:sz w:val="24"/>
+              <w:szCs w:val="24"/>
+              <w14:ligatures w14:val="standardContextual"/>
+            </w:rPr>
+          </w:pPr>
+          <w:hyperlink w:anchor="_Toc243389960" w:history="1">
+            <w:r>
+              <w:rPr>
+                <w:rStyle w:val="Hyperlink"/>
+                <w:noProof/>
+              </w:rPr>
+              <w:t>Expected Deliverables</w:t>
+            </w:r>
+            <w:r>
+              <w:rPr>
+                <w:noProof/>
+                <w:webHidden/>
+              </w:rPr>
+              <w:tab/>
+            </w:r>
+            <w:r>
+              <w:rPr>
+                <w:noProof/>
+                <w:webHidden/>
+              </w:rPr>
+              <w:fldChar w:fldCharType="begin"/>
+            </w:r>
+            <w:r>
+              <w:rPr>
+                <w:noProof/>
+                <w:webHidden/>
+              </w:rPr>
+              <w:instrText xml:space="preserve"> PAGEREF _Toc243389960 \h </w:instrText>
+            </w:r>
+            <w:r>
+              <w:rPr>
+                <w:noProof/>
+                <w:webHidden/>
+              </w:rPr>
+            </w:r>
+            <w:r>
+              <w:rPr>
+                <w:noProof/>
+                <w:webHidden/>
+              </w:rPr>
+              <w:fldChar w:fldCharType="separate"/>
+            </w:r>
+            <w:r>
+              <w:rPr>
+                <w:noProof/>
+                <w:webHidden/>
+              </w:rPr>
+              <w:t>2</w:t>
+            </w:r>
+            <w:r>
+              <w:rPr>
+                <w:noProof/>
+                <w:webHidden/>
+              </w:rPr>
+              <w:fldChar w:fldCharType="end"/>
+            </w:r>
+          </w:hyperlink>
+        </w:p>
+        <w:p>
+          <w:pPr>
+            <w:pStyle w:val="Sumrio1"/>
+            <w:tabs>
+              <w:tab w:val="right" w:leader="dot" w:pos="9016"/>
+            </w:tabs>
+            <w:rPr>
+              <w:rFonts w:asciiTheme="minorHAnsi" w:eastAsiaTheme="minorEastAsia" w:hAnsiTheme="minorHAnsi" w:cstheme="minorBidi"/>
+              <w:noProof/>
+              <w:kern w:val="2"/>
+              <w:sz w:val="24"/>
+              <w:szCs w:val="24"/>
+              <w14:ligatures w14:val="standardContextual"/>
+            </w:rPr>
+          </w:pPr>
+          <w:hyperlink w:anchor="_Toc243389961" w:history="1">
+            <w:r>
+              <w:rPr>
+                <w:rStyle w:val="Hyperlink"/>
+                <w:noProof/>
+              </w:rPr>
+              <w:t>Project Timeline</w:t>
+            </w:r>
+            <w:r>
+              <w:rPr>
+                <w:noProof/>
+                <w:webHidden/>
+              </w:rPr>
+              <w:tab/>
+            </w:r>
+            <w:r>
+              <w:rPr>
+                <w:noProof/>
+                <w:webHidden/>
+              </w:rPr>
+              <w:fldChar w:fldCharType="begin"/>
+            </w:r>
+            <w:r>
+              <w:rPr>
+                <w:noProof/>
+                <w:webHidden/>
+              </w:rPr>
+              <w:instrText xml:space="preserve"> PAGEREF _Toc243389961 \h </w:instrText>
+            </w:r>
+            <w:r>
+              <w:rPr>
+                <w:noProof/>
+                <w:webHidden/>
+              </w:rPr>
+            </w:r>
+            <w:r>
+              <w:rPr>
+                <w:noProof/>
+                <w:webHidden/>
+              </w:rPr>
+              <w:fldChar w:fldCharType="separate"/>
+            </w:r>
+            <w:r>
+              <w:rPr>
+                <w:noProof/>
+                <w:webHidden/>
+              </w:rPr>
+              <w:t>3</w:t>
+            </w:r>
+            <w:r>
+              <w:rPr>
+                <w:noProof/>
+                <w:webHidden/>
+              </w:rPr>
+              <w:fldChar w:fldCharType="end"/>
+            </w:r>
+          </w:hyperlink>
+        </w:p>
+        <w:p>
+          <w:pPr>
+            <w:pStyle w:val="Sumrio1"/>
+            <w:tabs>
+              <w:tab w:val="right" w:leader="dot" w:pos="9016"/>
+            </w:tabs>
+            <w:rPr>
+              <w:rFonts w:asciiTheme="minorHAnsi" w:eastAsiaTheme="minorEastAsia" w:hAnsiTheme="minorHAnsi" w:cstheme="minorBidi"/>
+              <w:noProof/>
+              <w:kern w:val="2"/>
+              <w:sz w:val="24"/>
+              <w:szCs w:val="24"/>
+              <w14:ligatures w14:val="standardContextual"/>
+            </w:rPr>
+          </w:pPr>
+          <w:hyperlink w:anchor="_Toc243389962" w:history="1">
+            <w:r>
+              <w:rPr>
+                <w:rStyle w:val="Hyperlink"/>
+                <w:noProof/>
+              </w:rPr>
+              <w:t>Ethical and Legal Considerations</w:t>
+            </w:r>
+            <w:r>
+              <w:rPr>
+                <w:noProof/>
+                <w:webHidden/>
+              </w:rPr>
+              <w:tab/>
+            </w:r>
+            <w:r>
+              <w:rPr>
+                <w:noProof/>
+                <w:webHidden/>
+              </w:rPr>
+              <w:fldChar w:fldCharType="begin"/>
+            </w:r>
+            <w:r>
+              <w:rPr>
+                <w:noProof/>
+                <w:webHidden/>
+              </w:rPr>
+              <w:instrText xml:space="preserve"> PAGEREF _Toc243389962 \h </w:instrText>
+            </w:r>
+            <w:r>
+              <w:rPr>
+                <w:noProof/>
+                <w:webHidden/>
+              </w:rPr>
+            </w:r>
+            <w:r>
+              <w:rPr>
+                <w:noProof/>
+                <w:webHidden/>
+              </w:rPr>
+              <w:fldChar w:fldCharType="separate"/>
+            </w:r>
+            <w:r>
+              <w:rPr>
+                <w:noProof/>
+                <w:webHidden/>
+              </w:rPr>
+              <w:t>3</w:t>
+            </w:r>
+            <w:r>
+              <w:rPr>
+                <w:noProof/>
+                <w:webHidden/>
+              </w:rPr>
+              <w:fldChar w:fldCharType="end"/>
+            </w:r>
+          </w:hyperlink>
+        </w:p>
+        <w:p>
+          <w:pPr>
+            <w:pStyle w:val="Sumrio2"/>
+            <w:tabs>
+              <w:tab w:val="right" w:leader="dot" w:pos="9016"/>
+            </w:tabs>
+            <w:rPr>
+              <w:rFonts w:asciiTheme="minorHAnsi" w:eastAsiaTheme="minorEastAsia" w:hAnsiTheme="minorHAnsi" w:cstheme="minorBidi"/>
+              <w:noProof/>
+              <w:kern w:val="2"/>
+              <w:sz w:val="24"/>
+              <w:szCs w:val="24"/>
+              <w14:ligatures w14:val="standardContextual"/>
+            </w:rPr>
+          </w:pPr>
+          <w:hyperlink w:anchor="_Toc243389963" w:history="1">
+            <w:r>
+              <w:rPr>
+                <w:rStyle w:val="Hyperlink"/>
+                <w:noProof/>
+              </w:rPr>
+              <w:t>Chapter 1.1</w:t>
+            </w:r>
+            <w:r>
+              <w:rPr>
+                <w:noProof/>
+                <w:webHidden/>
+              </w:rPr>
+              <w:tab/>
+            </w:r>
+            <w:r>
+              <w:rPr>
+                <w:noProof/>
+                <w:webHidden/>
+              </w:rPr>
+              <w:fldChar w:fldCharType="begin"/>
+            </w:r>
+            <w:r>
+              <w:rPr>
+                <w:noProof/>
+                <w:webHidden/>
+              </w:rPr>
+              <w:instrText xml:space="preserve"> PAGEREF _Toc243389963 \h </w:instrText>
+            </w:r>
+            <w:r>
+              <w:rPr>
+                <w:noProof/>
+                <w:webHidden/>
+              </w:rPr>
+            </w:r>
+            <w:r>
+              <w:rPr>
+                <w:noProof/>
+                <w:webHidden/>
+              </w:rPr>
+              <w:fldChar w:fldCharType="separate"/>
+            </w:r>
+            <w:r>
+              <w:rPr>
+                <w:noProof/>
+                <w:webHidden/>
+              </w:rPr>
+              <w:t>3</w:t>
+            </w:r>
+            <w:r>
+              <w:rPr>
+                <w:noProof/>
+                <w:webHidden/>
+              </w:rPr>
+              <w:fldChar w:fldCharType="end"/>
+            </w:r>
+          </w:hyperlink>
+        </w:p>
+        <w:p>
+          <w:pPr>
+            <w:pStyle w:val="Sumrio3"/>
+            <w:tabs>
+              <w:tab w:val="right" w:leader="dot" w:pos="9016"/>
+            </w:tabs>
+            <w:rPr>
+              <w:rFonts w:asciiTheme="minorHAnsi" w:eastAsiaTheme="minorEastAsia" w:hAnsiTheme="minorHAnsi" w:cstheme="minorBidi"/>
+              <w:noProof/>
+              <w:kern w:val="2"/>
+              <w:sz w:val="24"/>
+              <w:szCs w:val="24"/>
+              <w14:ligatures w14:val="standardContextual"/>
+            </w:rPr>
+          </w:pPr>
+          <w:hyperlink w:anchor="_Toc243389964" w:history="1">
+            <w:r>
+              <w:rPr>
+                <w:rStyle w:val="Hyperlink"/>
+                <w:noProof/>
+              </w:rPr>
+              <w:t>Chapter 1.1.1.</w:t>
+            </w:r>
+            <w:r>
+              <w:rPr>
+                <w:noProof/>
+                <w:webHidden/>
+              </w:rPr>
+              <w:tab/>
+            </w:r>
+            <w:r>
+              <w:rPr>
+                <w:noProof/>
+                <w:webHidden/>
+              </w:rPr>
+              <w:fldChar w:fldCharType="begin"/>
+            </w:r>
+            <w:r>
+              <w:rPr>
+                <w:noProof/>
+                <w:webHidden/>
+              </w:rPr>
+              <w:instrText xml:space="preserve"> PAGEREF _Toc243389964 \h </w:instrText>
+            </w:r>
+            <w:r>
+              <w:rPr>
+                <w:noProof/>
+                <w:webHidden/>
+              </w:rPr>
+            </w:r>
+            <w:r>
+              <w:rPr>
+                <w:noProof/>
+                <w:webHidden/>
+              </w:rPr>
+              <w:fldChar w:fldCharType="separate"/>
+            </w:r>
+            <w:r>
+              <w:rPr>
+                <w:noProof/>
+                <w:webHidden/>
+              </w:rPr>
+              <w:t>3</w:t>
+            </w:r>
+            <w:r>
+              <w:rPr>
+                <w:noProof/>
+                <w:webHidden/>
+              </w:rPr>
+              <w:fldChar w:fldCharType="end"/>
+            </w:r>
+          </w:hyperlink>
+        </w:p>
+        <w:p>
+          <w:pPr>
+            <w:pStyle w:val="Sumrio1"/>
+            <w:tabs>
+              <w:tab w:val="right" w:leader="dot" w:pos="9016"/>
+            </w:tabs>
+            <w:rPr>
+              <w:rFonts w:asciiTheme="minorHAnsi" w:eastAsiaTheme="minorEastAsia" w:hAnsiTheme="minorHAnsi" w:cstheme="minorBidi"/>
+              <w:noProof/>
+              <w:kern w:val="2"/>
+              <w:sz w:val="24"/>
+              <w:szCs w:val="24"/>
+              <w14:ligatures w14:val="standardContextual"/>
+            </w:rPr>
+          </w:pPr>
+          <w:hyperlink w:anchor="_Toc243389965" w:history="1">
+            <w:r>
+              <w:rPr>
+                <w:rStyle w:val="Hyperlink"/>
+                <w:noProof/>
+              </w:rPr>
+              <w:t>References</w:t>
+            </w:r>
+            <w:r>
+              <w:rPr>
+                <w:noProof/>
+                <w:webHidden/>
+              </w:rPr>
+              <w:tab/>
+            </w:r>
+            <w:r>
+              <w:rPr>
+                <w:noProof/>
+                <w:webHidden/>
+              </w:rPr>
+              <w:fldChar w:fldCharType="begin"/>
+            </w:r>
+            <w:r>
+              <w:rPr>
+                <w:noProof/>
+                <w:webHidden/>
+              </w:rPr>
+              <w:instrText xml:space="preserve"> PAGEREF _Toc243389965 \h </w:instrText>
+            </w:r>
+            <w:r>
+              <w:rPr>
+                <w:noProof/>
+                <w:webHidden/>
+              </w:rPr>
+            </w:r>
+            <w:r>
+              <w:rPr>
+                <w:noProof/>
+                <w:webHidden/>
+              </w:rPr>
+              <w:fldChar w:fldCharType="separate"/>
+            </w:r>
+            <w:r>
+              <w:rPr>
+                <w:noProof/>
+                <w:webHidden/>
+              </w:rPr>
+              <w:t>4</w:t>
+            </w:r>
+            <w:r>
+              <w:rPr>
+                <w:noProof/>
+                <w:webHidden/>
+              </w:rPr>
+              <w:fldChar w:fldCharType="end"/>
+            </w:r>
+          </w:hyperlink>
+        </w:p>
+        <w:p>
+          <w:pPr>
+            <w:pStyle w:val="Sumrio1"/>
+            <w:tabs>
+              <w:tab w:val="right" w:leader="dot" w:pos="9016"/>
+            </w:tabs>
+            <w:rPr>
+              <w:rFonts w:asciiTheme="minorHAnsi" w:eastAsiaTheme="minorEastAsia" w:hAnsiTheme="minorHAnsi" w:cstheme="minorBidi"/>
+              <w:noProof/>
+              <w:kern w:val="2"/>
+              <w:sz w:val="24"/>
+              <w:szCs w:val="24"/>
+              <w14:ligatures w14:val="standardContextual"/>
+            </w:rPr>
+          </w:pPr>
+          <w:hyperlink w:anchor="_Toc243389966" w:history="1">
+            <w:r>
+              <w:rPr>
+                <w:rStyle w:val="Hyperlink"/>
+                <w:noProof/>
+              </w:rPr>
+              <w:t>Appendix</w:t>
+            </w:r>
+            <w:r>
+              <w:rPr>
+                <w:noProof/>
+                <w:webHidden/>
+              </w:rPr>
+              <w:tab/>
+            </w:r>
+            <w:r>
+              <w:rPr>
+                <w:noProof/>
+                <w:webHidden/>
+              </w:rPr>
+              <w:fldChar w:fldCharType="begin"/>
+            </w:r>
+            <w:r>
+              <w:rPr>
+                <w:noProof/>
+                <w:webHidden/>
+              </w:rPr>
+              <w:instrText xml:space="preserve"> PAGEREF _Toc243389966 \h </w:instrText>
+            </w:r>
+            <w:r>
+              <w:rPr>
+                <w:noProof/>
+                <w:webHidden/>
+              </w:rPr>
+            </w:r>
+            <w:r>
+              <w:rPr>
+                <w:noProof/>
+                <w:webHidden/>
+              </w:rPr>
+              <w:fldChar w:fldCharType="separate"/>
+            </w:r>
+            <w:r>
+              <w:rPr>
+                <w:noProof/>
+                <w:webHidden/>
+              </w:rPr>
+              <w:t>5</w:t>
+            </w:r>
+            <w:r>
+              <w:rPr>
+                <w:noProof/>
+                <w:webHidden/>
+              </w:rPr>
+              <w:fldChar w:fldCharType="end"/>
+            </w:r>
+          </w:hyperlink>
+        </w:p>
+        <w:p>
+          <w:pPr>
+            <w:rPr>
+              <w:ins w:id="85" w:author="Eduardo Flach" w:date="2026-10-20T11:58:00Z"/>
+            </w:rPr>
+          </w:pPr>
+          <w:ins w:id="86" w:author="Eduardo Flach" w:date="2026-10-20T11:58:00Z">
+            <w:r>
+              <w:rPr>
+                <w:b/>
+                <w:bCs/>
+                <w:lang w:val="pt-BR"/>
+              </w:rPr>
+              <w:fldChar w:fldCharType="end"/>
+            </w:r>
+          </w:ins>
+        </w:p>
+        <w:customXmlInsRangeStart w:id="87" w:author="Eduardo Flach" w:date="2026-10-20T11:58:00Z"/>
       </w:sdtContent>
     </w:sdt>
+    <w:customXmlInsRangeEnd w:id="87"/>
     <w:p/>
     <w:p>
       <w:pPr>
@@ -3721,211 +4614,218 @@
       <w:pPr>
         <w:pStyle w:val="Ttulo1"/>
         <w:spacing w:after="0"/>
-        <w:rPr>
-          <w:ins w:id="80" w:author="Eduardo Flach" w:date="2026-10-09T11:16:00Z"/>
-        </w:rPr>
-      </w:pPr>
-      <w:bookmarkStart w:id="81" w:name="_heading=h.gjdgxs" w:colFirst="0" w:colLast="0"/>
-      <w:bookmarkEnd w:id="81"/>
-      <w:r>
-        <w:lastRenderedPageBreak/>
-        <w:t>Introduction</w:t>
-      </w:r>
-    </w:p>
-    <w:p>
-      <w:pPr>
         <w:jc w:val="both"/>
         <w:rPr>
-          <w:ins w:id="82" w:author="Eduardo Flach" w:date="2026-10-09T11:26:00Z"/>
-        </w:rPr>
-        <w:pPrChange w:id="83" w:author="Eduardo Flach" w:date="2026-10-09T11:27:00Z">
-          <w:pPr/>
-        </w:pPrChange>
-      </w:pPr>
-      <w:ins w:id="84" w:author="Eduardo Flach" w:date="2026-10-09T11:16:00Z">
-        <w:r>
-          <w:tab/>
-          <w:t xml:space="preserve">The proposal project is </w:t>
-        </w:r>
-      </w:ins>
-      <w:ins w:id="85" w:author="Eduardo Flach" w:date="2026-10-09T11:17:00Z">
-        <w:r>
-          <w:t>to an</w:t>
-        </w:r>
-      </w:ins>
-      <w:ins w:id="86" w:author="Eduardo Flach" w:date="2026-10-09T11:18:00Z">
-        <w:r>
-          <w:t xml:space="preserve">alyse the raw data from a family e-commerce company. </w:t>
-        </w:r>
-      </w:ins>
-      <w:ins w:id="87" w:author="Eduardo Flach" w:date="2026-10-09T11:19:00Z">
-        <w:r>
-          <w:t xml:space="preserve">The company was founded in 2020 and started to make </w:t>
-        </w:r>
-        <w:r>
-          <w:t>handcraft</w:t>
-        </w:r>
-      </w:ins>
-      <w:ins w:id="88" w:author="Eduardo Flach" w:date="2026-10-09T11:20:00Z">
-        <w:r>
-          <w:t>ed</w:t>
-        </w:r>
-      </w:ins>
-      <w:ins w:id="89" w:author="Eduardo Flach" w:date="2026-10-09T11:19:00Z">
-        <w:r>
-          <w:t xml:space="preserve"> product</w:t>
-        </w:r>
-      </w:ins>
-      <w:ins w:id="90" w:author="Eduardo Flach" w:date="2026-10-09T11:20:00Z">
-        <w:r>
-          <w:t>s</w:t>
-        </w:r>
-      </w:ins>
-      <w:ins w:id="91" w:author="Eduardo Flach" w:date="2026-10-09T11:24:00Z">
-        <w:r>
-          <w:t xml:space="preserve"> such as purses, </w:t>
-        </w:r>
-      </w:ins>
-      <w:ins w:id="92" w:author="Eduardo Flach" w:date="2026-10-09T11:25:00Z">
-        <w:r>
-          <w:t xml:space="preserve">different kinds of </w:t>
-        </w:r>
-      </w:ins>
-      <w:ins w:id="93" w:author="Eduardo Flach" w:date="2026-10-09T11:24:00Z">
-        <w:r>
-          <w:t>bags</w:t>
-        </w:r>
-      </w:ins>
-      <w:ins w:id="94" w:author="Eduardo Flach" w:date="2026-10-09T11:26:00Z">
-        <w:r>
-          <w:t xml:space="preserve"> and fabric toys</w:t>
-        </w:r>
-      </w:ins>
-      <w:ins w:id="95" w:author="Eduardo Flach" w:date="2026-10-09T11:22:00Z">
-        <w:r>
-          <w:t>. The</w:t>
-        </w:r>
-      </w:ins>
-      <w:ins w:id="96" w:author="Eduardo Flach" w:date="2026-10-09T11:23:00Z">
-        <w:r>
-          <w:t xml:space="preserve"> clients prospecting and</w:t>
-        </w:r>
-      </w:ins>
-      <w:ins w:id="97" w:author="Eduardo Flach" w:date="2026-10-09T11:26:00Z">
-        <w:r>
-          <w:t xml:space="preserve"> all</w:t>
-        </w:r>
-      </w:ins>
-      <w:ins w:id="98" w:author="Eduardo Flach" w:date="2026-10-09T11:23:00Z">
-        <w:r>
-          <w:t xml:space="preserve"> the</w:t>
-        </w:r>
-      </w:ins>
-      <w:ins w:id="99" w:author="Eduardo Flach" w:date="2026-10-09T11:22:00Z">
-        <w:r>
-          <w:t xml:space="preserve"> selling proc</w:t>
-        </w:r>
-      </w:ins>
-      <w:ins w:id="100" w:author="Eduardo Flach" w:date="2026-10-09T11:23:00Z">
-        <w:r>
-          <w:t xml:space="preserve">ess is made by Instagram and </w:t>
-        </w:r>
-        <w:proofErr w:type="spellStart"/>
-        <w:r>
-          <w:t>whatsapp</w:t>
-        </w:r>
-        <w:proofErr w:type="spellEnd"/>
-        <w:r>
-          <w:t xml:space="preserve"> chat</w:t>
-        </w:r>
-      </w:ins>
-      <w:ins w:id="101" w:author="Eduardo Flach" w:date="2026-10-09T11:24:00Z">
-        <w:r>
-          <w:t xml:space="preserve"> since the beginning.</w:t>
-        </w:r>
-      </w:ins>
-    </w:p>
-    <w:p>
-      <w:pPr>
-        <w:jc w:val="both"/>
-        <w:rPr>
-          <w:ins w:id="102" w:author="Eduardo Flach" w:date="2026-10-09T11:31:00Z"/>
-        </w:rPr>
-      </w:pPr>
-      <w:ins w:id="103" w:author="Eduardo Flach" w:date="2026-10-09T11:27:00Z">
-        <w:r>
-          <w:tab/>
-        </w:r>
-        <w:r>
-          <w:t>There is no robust proce</w:t>
-        </w:r>
-      </w:ins>
-      <w:ins w:id="104" w:author="Eduardo Flach" w:date="2026-10-09T11:28:00Z">
-        <w:r>
-          <w:t xml:space="preserve">ss to store the data, yet. All the data from previous sales are stored in a </w:t>
-        </w:r>
-        <w:proofErr w:type="spellStart"/>
-        <w:r>
-          <w:t>whatsapp</w:t>
-        </w:r>
-        <w:proofErr w:type="spellEnd"/>
-        <w:r>
-          <w:t xml:space="preserve"> group. </w:t>
-        </w:r>
-      </w:ins>
-      <w:ins w:id="105" w:author="Eduardo Flach" w:date="2026-10-09T11:29:00Z">
-        <w:r>
-          <w:t xml:space="preserve">The current state of data storage </w:t>
-        </w:r>
-      </w:ins>
-      <w:ins w:id="106" w:author="Eduardo Flach" w:date="2026-10-09T11:31:00Z">
-        <w:r>
-          <w:t>does</w:t>
-        </w:r>
-      </w:ins>
-      <w:ins w:id="107" w:author="Eduardo Flach" w:date="2026-10-09T11:29:00Z">
-        <w:r>
-          <w:t xml:space="preserve"> not provide an accurate informatio</w:t>
-        </w:r>
-      </w:ins>
-      <w:ins w:id="108" w:author="Eduardo Flach" w:date="2026-10-09T11:30:00Z">
-        <w:r>
-          <w:t xml:space="preserve">n about the past and do not let the owners use this tool to get some </w:t>
-        </w:r>
-      </w:ins>
-      <w:ins w:id="109" w:author="Eduardo Flach" w:date="2026-10-09T11:31:00Z">
-        <w:r>
-          <w:t>useful insights.</w:t>
-        </w:r>
-      </w:ins>
-    </w:p>
-    <w:p>
-      <w:pPr>
-        <w:jc w:val="both"/>
-        <w:pPrChange w:id="110" w:author="Eduardo Flach" w:date="2026-10-09T11:27:00Z">
+          <w:ins w:id="88" w:author="Eduardo Flach" w:date="2026-10-09T11:16:00Z"/>
+        </w:rPr>
+        <w:pPrChange w:id="89" w:author="Eduardo Flach" w:date="2026-10-20T11:58:00Z">
           <w:pPr>
             <w:pStyle w:val="Ttulo1"/>
             <w:spacing w:after="0"/>
           </w:pPr>
         </w:pPrChange>
       </w:pPr>
-      <w:ins w:id="111" w:author="Eduardo Flach" w:date="2026-10-09T11:31:00Z">
+      <w:bookmarkStart w:id="90" w:name="_Toc243389954"/>
+      <w:r>
+        <w:lastRenderedPageBreak/>
+        <w:t>Introduction</w:t>
+      </w:r>
+      <w:bookmarkEnd w:id="90"/>
+    </w:p>
+    <w:p>
+      <w:pPr>
+        <w:jc w:val="both"/>
+        <w:rPr>
+          <w:ins w:id="91" w:author="Eduardo Flach" w:date="2026-10-09T11:26:00Z"/>
+        </w:rPr>
+        <w:pPrChange w:id="92" w:author="Eduardo Flach" w:date="2026-10-20T11:58:00Z">
+          <w:pPr/>
+        </w:pPrChange>
+      </w:pPr>
+      <w:ins w:id="93" w:author="Eduardo Flach" w:date="2026-10-09T11:16:00Z">
+        <w:r>
+          <w:tab/>
+          <w:t xml:space="preserve">The proposal project is </w:t>
+        </w:r>
+      </w:ins>
+      <w:ins w:id="94" w:author="Eduardo Flach" w:date="2026-10-09T11:17:00Z">
+        <w:r>
+          <w:t>to an</w:t>
+        </w:r>
+      </w:ins>
+      <w:ins w:id="95" w:author="Eduardo Flach" w:date="2026-10-09T11:18:00Z">
+        <w:r>
+          <w:t xml:space="preserve">alyse the raw data from a family e-commerce company. </w:t>
+        </w:r>
+      </w:ins>
+      <w:ins w:id="96" w:author="Eduardo Flach" w:date="2026-10-09T11:19:00Z">
+        <w:r>
+          <w:t xml:space="preserve">The company was founded in 2020 and started to make </w:t>
+        </w:r>
+        <w:r>
+          <w:t>handcraft</w:t>
+        </w:r>
+      </w:ins>
+      <w:ins w:id="97" w:author="Eduardo Flach" w:date="2026-10-09T11:20:00Z">
+        <w:r>
+          <w:t>ed</w:t>
+        </w:r>
+      </w:ins>
+      <w:ins w:id="98" w:author="Eduardo Flach" w:date="2026-10-09T11:19:00Z">
+        <w:r>
+          <w:t xml:space="preserve"> product</w:t>
+        </w:r>
+      </w:ins>
+      <w:ins w:id="99" w:author="Eduardo Flach" w:date="2026-10-09T11:20:00Z">
+        <w:r>
+          <w:t>s</w:t>
+        </w:r>
+      </w:ins>
+      <w:ins w:id="100" w:author="Eduardo Flach" w:date="2026-10-09T11:24:00Z">
+        <w:r>
+          <w:t xml:space="preserve"> such as purses, </w:t>
+        </w:r>
+      </w:ins>
+      <w:ins w:id="101" w:author="Eduardo Flach" w:date="2026-10-09T11:25:00Z">
+        <w:r>
+          <w:t xml:space="preserve">different kinds of </w:t>
+        </w:r>
+      </w:ins>
+      <w:ins w:id="102" w:author="Eduardo Flach" w:date="2026-10-09T11:24:00Z">
+        <w:r>
+          <w:t>bags</w:t>
+        </w:r>
+      </w:ins>
+      <w:ins w:id="103" w:author="Eduardo Flach" w:date="2026-10-09T11:26:00Z">
+        <w:r>
+          <w:t xml:space="preserve"> and fabric toys</w:t>
+        </w:r>
+      </w:ins>
+      <w:ins w:id="104" w:author="Eduardo Flach" w:date="2026-10-09T11:22:00Z">
+        <w:r>
+          <w:t>. The</w:t>
+        </w:r>
+      </w:ins>
+      <w:ins w:id="105" w:author="Eduardo Flach" w:date="2026-10-09T11:23:00Z">
+        <w:r>
+          <w:t xml:space="preserve"> clients prospecting and</w:t>
+        </w:r>
+      </w:ins>
+      <w:ins w:id="106" w:author="Eduardo Flach" w:date="2026-10-09T11:26:00Z">
+        <w:r>
+          <w:t xml:space="preserve"> all</w:t>
+        </w:r>
+      </w:ins>
+      <w:ins w:id="107" w:author="Eduardo Flach" w:date="2026-10-09T11:23:00Z">
+        <w:r>
+          <w:t xml:space="preserve"> the</w:t>
+        </w:r>
+      </w:ins>
+      <w:ins w:id="108" w:author="Eduardo Flach" w:date="2026-10-09T11:22:00Z">
+        <w:r>
+          <w:t xml:space="preserve"> selling proc</w:t>
+        </w:r>
+      </w:ins>
+      <w:ins w:id="109" w:author="Eduardo Flach" w:date="2026-10-09T11:23:00Z">
+        <w:r>
+          <w:t xml:space="preserve">ess is made by Instagram and </w:t>
+        </w:r>
+        <w:proofErr w:type="spellStart"/>
+        <w:r>
+          <w:t>whatsapp</w:t>
+        </w:r>
+        <w:proofErr w:type="spellEnd"/>
+        <w:r>
+          <w:t xml:space="preserve"> chat</w:t>
+        </w:r>
+      </w:ins>
+      <w:ins w:id="110" w:author="Eduardo Flach" w:date="2026-10-09T11:24:00Z">
+        <w:r>
+          <w:t xml:space="preserve"> since the beginning.</w:t>
+        </w:r>
+      </w:ins>
+    </w:p>
+    <w:p>
+      <w:pPr>
+        <w:jc w:val="both"/>
+        <w:rPr>
+          <w:ins w:id="111" w:author="Eduardo Flach" w:date="2026-10-09T11:31:00Z"/>
+        </w:rPr>
+      </w:pPr>
+      <w:ins w:id="112" w:author="Eduardo Flach" w:date="2026-10-09T11:27:00Z">
+        <w:r>
+          <w:tab/>
+        </w:r>
+        <w:r>
+          <w:t>There is no robust proce</w:t>
+        </w:r>
+      </w:ins>
+      <w:ins w:id="113" w:author="Eduardo Flach" w:date="2026-10-09T11:28:00Z">
+        <w:r>
+          <w:t xml:space="preserve">ss to store the data, yet. All the data from previous sales are stored in a </w:t>
+        </w:r>
+        <w:proofErr w:type="spellStart"/>
+        <w:r>
+          <w:t>whatsapp</w:t>
+        </w:r>
+        <w:proofErr w:type="spellEnd"/>
+        <w:r>
+          <w:t xml:space="preserve"> group. </w:t>
+        </w:r>
+      </w:ins>
+      <w:ins w:id="114" w:author="Eduardo Flach" w:date="2026-10-09T11:29:00Z">
+        <w:r>
+          <w:t xml:space="preserve">The current state of data storage </w:t>
+        </w:r>
+      </w:ins>
+      <w:ins w:id="115" w:author="Eduardo Flach" w:date="2026-10-09T11:31:00Z">
+        <w:r>
+          <w:t>does</w:t>
+        </w:r>
+      </w:ins>
+      <w:ins w:id="116" w:author="Eduardo Flach" w:date="2026-10-09T11:29:00Z">
+        <w:r>
+          <w:t xml:space="preserve"> not provide an accurate informatio</w:t>
+        </w:r>
+      </w:ins>
+      <w:ins w:id="117" w:author="Eduardo Flach" w:date="2026-10-09T11:30:00Z">
+        <w:r>
+          <w:t xml:space="preserve">n about the past and do not let the owners use this tool to get some </w:t>
+        </w:r>
+      </w:ins>
+      <w:ins w:id="118" w:author="Eduardo Flach" w:date="2026-10-09T11:31:00Z">
+        <w:r>
+          <w:t>useful insights.</w:t>
+        </w:r>
+      </w:ins>
+    </w:p>
+    <w:p>
+      <w:pPr>
+        <w:jc w:val="both"/>
+        <w:pPrChange w:id="119" w:author="Eduardo Flach" w:date="2026-10-20T11:58:00Z">
+          <w:pPr>
+            <w:pStyle w:val="Ttulo1"/>
+            <w:spacing w:after="0"/>
+          </w:pPr>
+        </w:pPrChange>
+      </w:pPr>
+      <w:ins w:id="120" w:author="Eduardo Flach" w:date="2026-10-09T11:31:00Z">
         <w:r>
           <w:tab/>
           <w:t xml:space="preserve">Working on this data will provide me the possibility to </w:t>
         </w:r>
       </w:ins>
-      <w:ins w:id="112" w:author="Eduardo Flach" w:date="2026-10-09T11:32:00Z">
+      <w:ins w:id="121" w:author="Eduardo Flach" w:date="2026-10-09T11:32:00Z">
         <w:r>
           <w:t>use all the tools that we are studying in this course. A strong ef</w:t>
         </w:r>
       </w:ins>
-      <w:ins w:id="113" w:author="Eduardo Flach" w:date="2026-10-09T11:33:00Z">
+      <w:ins w:id="122" w:author="Eduardo Flach" w:date="2026-10-09T11:33:00Z">
         <w:r>
           <w:t>fort on Data preparation, Machine learning to answer some questions regarding the business and data vi</w:t>
         </w:r>
       </w:ins>
-      <w:ins w:id="114" w:author="Eduardo Flach" w:date="2026-10-09T11:34:00Z">
+      <w:ins w:id="123" w:author="Eduardo Flach" w:date="2026-10-09T11:34:00Z">
         <w:r>
           <w:t>sualization.</w:t>
         </w:r>
@@ -3935,237 +4835,244 @@
       <w:pPr>
         <w:pStyle w:val="Ttulo1"/>
         <w:spacing w:before="0"/>
-        <w:rPr>
-          <w:ins w:id="115" w:author="Eduardo Flach" w:date="2026-10-12T17:25:00Z"/>
-        </w:rPr>
-      </w:pPr>
-      <w:bookmarkStart w:id="116" w:name="_heading=h.30j0zll" w:colFirst="0" w:colLast="0"/>
-      <w:bookmarkEnd w:id="116"/>
-      <w:ins w:id="117" w:author="Eduardo Flach" w:date="2026-10-12T17:14:00Z">
-        <w:r>
-          <w:t>Problem Definition</w:t>
-        </w:r>
-      </w:ins>
-      <w:del w:id="118" w:author="Eduardo Flach" w:date="2026-10-12T17:14:00Z">
-        <w:r>
-          <w:delText>C</w:delText>
-        </w:r>
-      </w:del>
-      <w:del w:id="119" w:author="Eduardo Flach" w:date="2026-10-12T17:13:00Z">
-        <w:r>
-          <w:delText>hapter 1</w:delText>
-        </w:r>
-      </w:del>
-    </w:p>
-    <w:p>
-      <w:pPr>
-        <w:ind w:firstLine="720"/>
         <w:jc w:val="both"/>
         <w:rPr>
-          <w:ins w:id="120" w:author="Eduardo Flach" w:date="2026-10-12T17:27:00Z"/>
-        </w:rPr>
-        <w:pPrChange w:id="121" w:author="Eduardo Flach" w:date="2026-10-12T17:38:00Z">
-          <w:pPr>
-            <w:ind w:firstLine="720"/>
-          </w:pPr>
-        </w:pPrChange>
-      </w:pPr>
-      <w:ins w:id="122" w:author="Eduardo Flach" w:date="2026-10-12T17:27:00Z">
-        <w:r>
-          <w:t xml:space="preserve">Since the beginning of the company </w:t>
-        </w:r>
-      </w:ins>
-      <w:ins w:id="123" w:author="Eduardo Flach" w:date="2026-10-12T17:29:00Z">
-        <w:r>
-          <w:t>the prices were increased according to the development of the perceptive quality of the product</w:t>
-        </w:r>
-      </w:ins>
-      <w:ins w:id="124" w:author="Eduardo Flach" w:date="2026-10-12T17:31:00Z">
-        <w:r>
-          <w:t xml:space="preserve"> by the owners and the clients feedbacks</w:t>
-        </w:r>
-      </w:ins>
-      <w:ins w:id="125" w:author="Eduardo Flach" w:date="2026-10-12T17:29:00Z">
-        <w:r>
-          <w:t xml:space="preserve">. </w:t>
-        </w:r>
-      </w:ins>
-      <w:ins w:id="126" w:author="Eduardo Flach" w:date="2026-10-12T17:34:00Z">
-        <w:r>
-          <w:t>Once the owners</w:t>
-        </w:r>
-      </w:ins>
-      <w:ins w:id="127" w:author="Eduardo Flach" w:date="2026-10-12T17:35:00Z">
-        <w:r>
-          <w:t xml:space="preserve"> started to make the products from zero, the </w:t>
-        </w:r>
-      </w:ins>
-      <w:ins w:id="128" w:author="Eduardo Flach" w:date="2026-10-12T17:36:00Z">
-        <w:r>
-          <w:t>quality of each one improved during time</w:t>
-        </w:r>
-      </w:ins>
-      <w:ins w:id="129" w:author="Eduardo Flach" w:date="2026-10-12T17:37:00Z">
-        <w:r>
-          <w:t xml:space="preserve"> and </w:t>
-        </w:r>
-      </w:ins>
-      <w:ins w:id="130" w:author="Eduardo Flach" w:date="2026-10-12T17:38:00Z">
-        <w:r>
-          <w:t>therefore the price.</w:t>
-        </w:r>
-      </w:ins>
-    </w:p>
-    <w:p>
-      <w:pPr>
-        <w:ind w:firstLine="720"/>
-        <w:jc w:val="both"/>
-        <w:rPr>
-          <w:ins w:id="131" w:author="Eduardo Flach" w:date="2026-10-16T14:53:00Z"/>
-        </w:rPr>
-      </w:pPr>
-      <w:ins w:id="132" w:author="Eduardo Flach" w:date="2026-10-12T17:25:00Z">
-        <w:r>
-          <w:t xml:space="preserve">The company </w:t>
-        </w:r>
-      </w:ins>
-      <w:ins w:id="133" w:author="Eduardo Flach" w:date="2026-10-12T17:38:00Z">
-        <w:r>
-          <w:t xml:space="preserve">wants to </w:t>
-        </w:r>
-      </w:ins>
-      <w:ins w:id="134" w:author="Eduardo Flach" w:date="2026-10-12T17:39:00Z">
-        <w:r>
-          <w:t xml:space="preserve">position the brand for </w:t>
-        </w:r>
-      </w:ins>
-      <w:ins w:id="135" w:author="Eduardo Flach" w:date="2026-10-16T14:46:00Z">
-        <w:r>
-          <w:t>premium market</w:t>
-        </w:r>
-      </w:ins>
-      <w:ins w:id="136" w:author="Eduardo Flach" w:date="2026-10-12T17:40:00Z">
-        <w:r>
-          <w:t xml:space="preserve"> and improve the average order value (AOV) </w:t>
-        </w:r>
-      </w:ins>
-      <w:ins w:id="137" w:author="Eduardo Flach" w:date="2026-10-12T17:41:00Z">
-        <w:r>
-          <w:t>in order to improve the margin.</w:t>
-        </w:r>
-      </w:ins>
-      <w:ins w:id="138" w:author="Eduardo Flach" w:date="2026-10-16T14:35:00Z">
-        <w:r>
-          <w:t xml:space="preserve"> </w:t>
-        </w:r>
-      </w:ins>
-      <w:ins w:id="139" w:author="Eduardo Flach" w:date="2026-10-16T14:48:00Z">
-        <w:r>
-          <w:t xml:space="preserve">As most of the potential leads came from marketings campaigns, </w:t>
-        </w:r>
-      </w:ins>
-      <w:ins w:id="140" w:author="Eduardo Flach" w:date="2026-10-16T14:49:00Z">
-        <w:r>
-          <w:t>the company needs do investments on Instagram Ads. However, today the compa</w:t>
-        </w:r>
-      </w:ins>
-      <w:ins w:id="141" w:author="Eduardo Flach" w:date="2026-10-16T14:50:00Z">
-        <w:r>
-          <w:t xml:space="preserve">ny doesn’t have the data to determinate the target </w:t>
-        </w:r>
-      </w:ins>
-      <w:ins w:id="142" w:author="Eduardo Flach" w:date="2026-10-16T14:51:00Z">
-        <w:r>
-          <w:t xml:space="preserve">market. </w:t>
-        </w:r>
-        <w:r>
-          <w:rPr>
-            <w:b/>
-            <w:bCs/>
-            <w:rPrChange w:id="143" w:author="Eduardo Flach" w:date="2026-10-16T14:55:00Z">
-              <w:rPr/>
-            </w:rPrChange>
-          </w:rPr>
-          <w:t>It is unkno</w:t>
-        </w:r>
-      </w:ins>
-      <w:ins w:id="144" w:author="Eduardo Flach" w:date="2026-10-16T14:52:00Z">
-        <w:r>
-          <w:rPr>
-            <w:b/>
-            <w:bCs/>
-            <w:rPrChange w:id="145" w:author="Eduardo Flach" w:date="2026-10-16T14:55:00Z">
-              <w:rPr/>
-            </w:rPrChange>
-          </w:rPr>
-          <w:t xml:space="preserve">wn if the region that the person is buying from matters regarding the purchase. </w:t>
-        </w:r>
-      </w:ins>
-    </w:p>
-    <w:p>
-      <w:pPr>
-        <w:ind w:firstLine="720"/>
-        <w:jc w:val="both"/>
-        <w:rPr>
-          <w:ins w:id="146" w:author="Eduardo Flach" w:date="2026-10-12T17:14:00Z"/>
-        </w:rPr>
-        <w:pPrChange w:id="147" w:author="Eduardo Flach" w:date="2026-10-16T15:01:00Z">
+          <w:ins w:id="124" w:author="Eduardo Flach" w:date="2026-10-12T17:25:00Z"/>
+        </w:rPr>
+        <w:pPrChange w:id="125" w:author="Eduardo Flach" w:date="2026-10-20T11:58:00Z">
           <w:pPr>
             <w:pStyle w:val="Ttulo1"/>
             <w:spacing w:before="0"/>
           </w:pPr>
         </w:pPrChange>
       </w:pPr>
-      <w:ins w:id="148" w:author="Eduardo Flach" w:date="2026-10-16T14:53:00Z">
-        <w:r>
-          <w:t xml:space="preserve">In addition, the brand is known for making </w:t>
-        </w:r>
-      </w:ins>
-      <w:ins w:id="149" w:author="Eduardo Flach" w:date="2026-10-16T14:54:00Z">
-        <w:r>
-          <w:t xml:space="preserve">personalized products. </w:t>
-        </w:r>
-      </w:ins>
-      <w:ins w:id="150" w:author="Eduardo Flach" w:date="2026-10-16T14:55:00Z">
-        <w:r>
-          <w:t xml:space="preserve">The stock of raw material was always high, due to the quantity of possibilities. </w:t>
-        </w:r>
-      </w:ins>
-      <w:ins w:id="151" w:author="Eduardo Flach" w:date="2026-10-16T14:56:00Z">
-        <w:r>
-          <w:t>Right now, there is no model predicting which material and colo</w:t>
-        </w:r>
-      </w:ins>
-      <w:ins w:id="152" w:author="Eduardo Flach" w:date="2026-10-16T14:57:00Z">
-        <w:r>
-          <w:t xml:space="preserve">ur will sell more in the next months. </w:t>
-        </w:r>
-      </w:ins>
-      <w:ins w:id="153" w:author="Eduardo Flach" w:date="2026-10-16T14:58:00Z">
+      <w:bookmarkStart w:id="126" w:name="_Toc243389955"/>
+      <w:ins w:id="127" w:author="Eduardo Flach" w:date="2026-10-12T17:14:00Z">
+        <w:r>
+          <w:t>Problem Definition</w:t>
+        </w:r>
+      </w:ins>
+      <w:bookmarkEnd w:id="126"/>
+      <w:del w:id="128" w:author="Eduardo Flach" w:date="2026-10-12T17:14:00Z">
+        <w:r>
+          <w:delText>C</w:delText>
+        </w:r>
+      </w:del>
+      <w:del w:id="129" w:author="Eduardo Flach" w:date="2026-10-12T17:13:00Z">
+        <w:r>
+          <w:delText>hapter 1</w:delText>
+        </w:r>
+      </w:del>
+    </w:p>
+    <w:p>
+      <w:pPr>
+        <w:ind w:firstLine="720"/>
+        <w:jc w:val="both"/>
+        <w:rPr>
+          <w:ins w:id="130" w:author="Eduardo Flach" w:date="2026-10-12T17:27:00Z"/>
+        </w:rPr>
+        <w:pPrChange w:id="131" w:author="Eduardo Flach" w:date="2026-10-20T11:58:00Z">
+          <w:pPr>
+            <w:ind w:firstLine="720"/>
+          </w:pPr>
+        </w:pPrChange>
+      </w:pPr>
+      <w:ins w:id="132" w:author="Eduardo Flach" w:date="2026-10-12T17:27:00Z">
+        <w:r>
+          <w:t xml:space="preserve">Since the beginning of the company </w:t>
+        </w:r>
+      </w:ins>
+      <w:ins w:id="133" w:author="Eduardo Flach" w:date="2026-10-12T17:29:00Z">
+        <w:r>
+          <w:t>the prices were increased according to the development of the perceptive quality of the product</w:t>
+        </w:r>
+      </w:ins>
+      <w:ins w:id="134" w:author="Eduardo Flach" w:date="2026-10-12T17:31:00Z">
+        <w:r>
+          <w:t xml:space="preserve"> by the owners and the clients feedbacks</w:t>
+        </w:r>
+      </w:ins>
+      <w:ins w:id="135" w:author="Eduardo Flach" w:date="2026-10-12T17:29:00Z">
+        <w:r>
+          <w:t xml:space="preserve">. </w:t>
+        </w:r>
+      </w:ins>
+      <w:ins w:id="136" w:author="Eduardo Flach" w:date="2026-10-12T17:34:00Z">
+        <w:r>
+          <w:t>Once the owners</w:t>
+        </w:r>
+      </w:ins>
+      <w:ins w:id="137" w:author="Eduardo Flach" w:date="2026-10-12T17:35:00Z">
+        <w:r>
+          <w:t xml:space="preserve"> started to make the products from zero, the </w:t>
+        </w:r>
+      </w:ins>
+      <w:ins w:id="138" w:author="Eduardo Flach" w:date="2026-10-12T17:36:00Z">
+        <w:r>
+          <w:t>quality of each one improved during time</w:t>
+        </w:r>
+      </w:ins>
+      <w:ins w:id="139" w:author="Eduardo Flach" w:date="2026-10-12T17:37:00Z">
+        <w:r>
+          <w:t xml:space="preserve"> and </w:t>
+        </w:r>
+      </w:ins>
+      <w:ins w:id="140" w:author="Eduardo Flach" w:date="2026-10-12T17:38:00Z">
+        <w:r>
+          <w:t>therefore the price.</w:t>
+        </w:r>
+      </w:ins>
+    </w:p>
+    <w:p>
+      <w:pPr>
+        <w:ind w:firstLine="720"/>
+        <w:jc w:val="both"/>
+        <w:rPr>
+          <w:ins w:id="141" w:author="Eduardo Flach" w:date="2026-10-16T14:53:00Z"/>
+        </w:rPr>
+      </w:pPr>
+      <w:ins w:id="142" w:author="Eduardo Flach" w:date="2026-10-12T17:25:00Z">
+        <w:r>
+          <w:t xml:space="preserve">The company </w:t>
+        </w:r>
+      </w:ins>
+      <w:ins w:id="143" w:author="Eduardo Flach" w:date="2026-10-12T17:38:00Z">
+        <w:r>
+          <w:t xml:space="preserve">wants to </w:t>
+        </w:r>
+      </w:ins>
+      <w:ins w:id="144" w:author="Eduardo Flach" w:date="2026-10-12T17:39:00Z">
+        <w:r>
+          <w:t xml:space="preserve">position the brand for </w:t>
+        </w:r>
+      </w:ins>
+      <w:ins w:id="145" w:author="Eduardo Flach" w:date="2026-10-16T14:46:00Z">
+        <w:r>
+          <w:t>premium market</w:t>
+        </w:r>
+      </w:ins>
+      <w:ins w:id="146" w:author="Eduardo Flach" w:date="2026-10-12T17:40:00Z">
+        <w:r>
+          <w:t xml:space="preserve"> and improve the average order value (AOV) </w:t>
+        </w:r>
+      </w:ins>
+      <w:ins w:id="147" w:author="Eduardo Flach" w:date="2026-10-12T17:41:00Z">
+        <w:r>
+          <w:t>in order to improve the margin.</w:t>
+        </w:r>
+      </w:ins>
+      <w:ins w:id="148" w:author="Eduardo Flach" w:date="2026-10-16T14:35:00Z">
+        <w:r>
+          <w:t xml:space="preserve"> </w:t>
+        </w:r>
+      </w:ins>
+      <w:ins w:id="149" w:author="Eduardo Flach" w:date="2026-10-16T14:48:00Z">
+        <w:r>
+          <w:t xml:space="preserve">As most of the potential leads came from marketings campaigns, </w:t>
+        </w:r>
+      </w:ins>
+      <w:ins w:id="150" w:author="Eduardo Flach" w:date="2026-10-16T14:49:00Z">
+        <w:r>
+          <w:t>the company needs do investments on Instagram Ads. However, today the compa</w:t>
+        </w:r>
+      </w:ins>
+      <w:ins w:id="151" w:author="Eduardo Flach" w:date="2026-10-16T14:50:00Z">
+        <w:r>
+          <w:t xml:space="preserve">ny doesn’t have the data to determinate the target </w:t>
+        </w:r>
+      </w:ins>
+      <w:ins w:id="152" w:author="Eduardo Flach" w:date="2026-10-16T14:51:00Z">
+        <w:r>
+          <w:t xml:space="preserve">market. </w:t>
+        </w:r>
         <w:r>
           <w:rPr>
             <w:b/>
             <w:bCs/>
-            <w:rPrChange w:id="154" w:author="Eduardo Flach" w:date="2026-10-16T15:01:00Z">
+            <w:rPrChange w:id="153" w:author="Eduardo Flach" w:date="2026-10-16T14:55:00Z">
+              <w:rPr/>
+            </w:rPrChange>
+          </w:rPr>
+          <w:t>It is unkno</w:t>
+        </w:r>
+      </w:ins>
+      <w:ins w:id="154" w:author="Eduardo Flach" w:date="2026-10-16T14:52:00Z">
+        <w:r>
+          <w:rPr>
+            <w:b/>
+            <w:bCs/>
+            <w:rPrChange w:id="155" w:author="Eduardo Flach" w:date="2026-10-16T14:55:00Z">
+              <w:rPr/>
+            </w:rPrChange>
+          </w:rPr>
+          <w:t xml:space="preserve">wn if the region that the person is buying from matters regarding the purchase. </w:t>
+        </w:r>
+      </w:ins>
+    </w:p>
+    <w:p>
+      <w:pPr>
+        <w:ind w:firstLine="720"/>
+        <w:jc w:val="both"/>
+        <w:rPr>
+          <w:ins w:id="156" w:author="Eduardo Flach" w:date="2026-10-12T17:14:00Z"/>
+        </w:rPr>
+        <w:pPrChange w:id="157" w:author="Eduardo Flach" w:date="2026-10-20T11:58:00Z">
+          <w:pPr>
+            <w:pStyle w:val="Ttulo1"/>
+            <w:spacing w:before="0"/>
+          </w:pPr>
+        </w:pPrChange>
+      </w:pPr>
+      <w:ins w:id="158" w:author="Eduardo Flach" w:date="2026-10-16T14:53:00Z">
+        <w:r>
+          <w:t xml:space="preserve">In addition, the brand is known for making </w:t>
+        </w:r>
+      </w:ins>
+      <w:ins w:id="159" w:author="Eduardo Flach" w:date="2026-10-16T14:54:00Z">
+        <w:r>
+          <w:t xml:space="preserve">personalized products. </w:t>
+        </w:r>
+      </w:ins>
+      <w:ins w:id="160" w:author="Eduardo Flach" w:date="2026-10-16T14:55:00Z">
+        <w:r>
+          <w:t xml:space="preserve">The stock of raw material was always high, due to the quantity of possibilities. </w:t>
+        </w:r>
+      </w:ins>
+      <w:ins w:id="161" w:author="Eduardo Flach" w:date="2026-10-16T14:56:00Z">
+        <w:r>
+          <w:t>Right now, there is no model predicting which material and colo</w:t>
+        </w:r>
+      </w:ins>
+      <w:ins w:id="162" w:author="Eduardo Flach" w:date="2026-10-16T14:57:00Z">
+        <w:r>
+          <w:t xml:space="preserve">ur will sell more in the next months. </w:t>
+        </w:r>
+      </w:ins>
+      <w:ins w:id="163" w:author="Eduardo Flach" w:date="2026-10-16T14:58:00Z">
+        <w:r>
+          <w:rPr>
+            <w:b/>
+            <w:bCs/>
+            <w:rPrChange w:id="164" w:author="Eduardo Flach" w:date="2026-10-16T15:01:00Z">
               <w:rPr/>
             </w:rPrChange>
           </w:rPr>
           <w:t>Therefore, having this prediction</w:t>
         </w:r>
       </w:ins>
-      <w:ins w:id="155" w:author="Eduardo Flach" w:date="2026-10-16T14:59:00Z">
+      <w:ins w:id="165" w:author="Eduardo Flach" w:date="2026-10-16T14:59:00Z">
         <w:r>
           <w:rPr>
             <w:b/>
             <w:bCs/>
-            <w:rPrChange w:id="156" w:author="Eduardo Flach" w:date="2026-10-16T15:01:00Z">
+            <w:rPrChange w:id="166" w:author="Eduardo Flach" w:date="2026-10-16T15:01:00Z">
               <w:rPr/>
             </w:rPrChange>
           </w:rPr>
           <w:t xml:space="preserve">, the brand can put effort in the best </w:t>
         </w:r>
       </w:ins>
-      <w:ins w:id="157" w:author="Eduardo Flach" w:date="2026-10-16T15:02:00Z">
+      <w:ins w:id="167" w:author="Eduardo Flach" w:date="2026-10-16T15:02:00Z">
         <w:r>
           <w:rPr>
             <w:b/>
@@ -4174,36 +5081,36 @@
           <w:t>sellers’</w:t>
         </w:r>
       </w:ins>
-      <w:ins w:id="158" w:author="Eduardo Flach" w:date="2026-10-16T14:59:00Z">
+      <w:ins w:id="168" w:author="Eduardo Flach" w:date="2026-10-16T14:59:00Z">
         <w:r>
           <w:rPr>
             <w:b/>
             <w:bCs/>
-            <w:rPrChange w:id="159" w:author="Eduardo Flach" w:date="2026-10-16T15:01:00Z">
+            <w:rPrChange w:id="169" w:author="Eduardo Flach" w:date="2026-10-16T15:01:00Z">
               <w:rPr/>
             </w:rPrChange>
           </w:rPr>
           <w:t xml:space="preserve"> products an</w:t>
         </w:r>
       </w:ins>
-      <w:ins w:id="160" w:author="Eduardo Flach" w:date="2026-10-16T15:00:00Z">
+      <w:ins w:id="170" w:author="Eduardo Flach" w:date="2026-10-16T15:00:00Z">
         <w:r>
           <w:rPr>
             <w:b/>
             <w:bCs/>
-            <w:rPrChange w:id="161" w:author="Eduardo Flach" w:date="2026-10-16T15:01:00Z">
+            <w:rPrChange w:id="171" w:author="Eduardo Flach" w:date="2026-10-16T15:01:00Z">
               <w:rPr/>
             </w:rPrChange>
           </w:rPr>
           <w:t xml:space="preserve">d colours, optimizing margin and lowering </w:t>
         </w:r>
       </w:ins>
-      <w:ins w:id="162" w:author="Eduardo Flach" w:date="2026-10-16T15:01:00Z">
+      <w:ins w:id="172" w:author="Eduardo Flach" w:date="2026-10-16T15:01:00Z">
         <w:r>
           <w:rPr>
             <w:b/>
             <w:bCs/>
-            <w:rPrChange w:id="163" w:author="Eduardo Flach" w:date="2026-10-16T15:01:00Z">
+            <w:rPrChange w:id="173" w:author="Eduardo Flach" w:date="2026-10-16T15:01:00Z">
               <w:rPr/>
             </w:rPrChange>
           </w:rPr>
@@ -4215,48 +5122,61 @@
       <w:pPr>
         <w:pStyle w:val="Ttulo1"/>
         <w:spacing w:before="0"/>
-        <w:rPr>
-          <w:ins w:id="164" w:author="Eduardo Flach" w:date="2026-10-12T17:14:00Z"/>
-        </w:rPr>
-      </w:pPr>
-      <w:ins w:id="165" w:author="Eduardo Flach" w:date="2026-10-12T17:14:00Z">
+        <w:jc w:val="both"/>
+        <w:rPr>
+          <w:ins w:id="174" w:author="Eduardo Flach" w:date="2026-10-12T17:14:00Z"/>
+        </w:rPr>
+        <w:pPrChange w:id="175" w:author="Eduardo Flach" w:date="2026-10-20T11:58:00Z">
+          <w:pPr>
+            <w:pStyle w:val="Ttulo1"/>
+            <w:spacing w:before="0"/>
+          </w:pPr>
+        </w:pPrChange>
+      </w:pPr>
+      <w:bookmarkStart w:id="176" w:name="_Toc243389956"/>
+      <w:ins w:id="177" w:author="Eduardo Flach" w:date="2026-10-12T17:14:00Z">
         <w:r>
           <w:t>Aim and Objectives</w:t>
         </w:r>
-      </w:ins>
-    </w:p>
-    <w:p>
-      <w:pPr>
-        <w:rPr>
-          <w:ins w:id="166" w:author="Eduardo Flach" w:date="2026-10-16T15:04:00Z"/>
-        </w:rPr>
-      </w:pPr>
-      <w:ins w:id="167" w:author="Eduardo Flach" w:date="2026-10-16T15:01:00Z">
+        <w:bookmarkEnd w:id="176"/>
+      </w:ins>
+    </w:p>
+    <w:p>
+      <w:pPr>
+        <w:jc w:val="both"/>
+        <w:rPr>
+          <w:ins w:id="178" w:author="Eduardo Flach" w:date="2026-10-16T15:04:00Z"/>
+        </w:rPr>
+        <w:pPrChange w:id="179" w:author="Eduardo Flach" w:date="2026-10-20T11:58:00Z">
+          <w:pPr/>
+        </w:pPrChange>
+      </w:pPr>
+      <w:ins w:id="180" w:author="Eduardo Flach" w:date="2026-10-16T15:01:00Z">
         <w:r>
           <w:tab/>
         </w:r>
       </w:ins>
-      <w:ins w:id="168" w:author="Eduardo Flach" w:date="2026-10-16T15:02:00Z">
+      <w:ins w:id="181" w:author="Eduardo Flach" w:date="2026-10-16T15:02:00Z">
         <w:r>
           <w:t>The objectives of this project are</w:t>
         </w:r>
       </w:ins>
-      <w:ins w:id="169" w:author="Eduardo Flach" w:date="2026-10-16T15:03:00Z">
+      <w:ins w:id="182" w:author="Eduardo Flach" w:date="2026-10-16T15:03:00Z">
         <w:r>
           <w:t xml:space="preserve"> related to</w:t>
         </w:r>
       </w:ins>
-      <w:ins w:id="170" w:author="Eduardo Flach" w:date="2026-10-16T15:02:00Z">
+      <w:ins w:id="183" w:author="Eduardo Flach" w:date="2026-10-16T15:02:00Z">
         <w:r>
           <w:t xml:space="preserve"> improve the </w:t>
         </w:r>
       </w:ins>
-      <w:ins w:id="171" w:author="Eduardo Flach" w:date="2026-10-16T15:03:00Z">
+      <w:ins w:id="184" w:author="Eduardo Flach" w:date="2026-10-16T15:03:00Z">
         <w:r>
           <w:t>profits of the brand in order to provide the company t</w:t>
         </w:r>
       </w:ins>
-      <w:ins w:id="172" w:author="Eduardo Flach" w:date="2026-10-16T15:04:00Z">
+      <w:ins w:id="185" w:author="Eduardo Flach" w:date="2026-10-16T15:04:00Z">
         <w:r>
           <w:t>he possibilities to expand. The main aims are listed below:</w:t>
         </w:r>
@@ -4269,31 +5189,42 @@
           <w:ilvl w:val="1"/>
           <w:numId w:val="5"/>
         </w:numPr>
-        <w:rPr>
-          <w:ins w:id="173" w:author="Eduardo Flach" w:date="2026-10-16T15:06:00Z"/>
-        </w:rPr>
-      </w:pPr>
-      <w:ins w:id="174" w:author="Eduardo Flach" w:date="2026-10-16T15:04:00Z">
+        <w:jc w:val="both"/>
+        <w:rPr>
+          <w:ins w:id="186" w:author="Eduardo Flach" w:date="2026-10-16T15:06:00Z"/>
+        </w:rPr>
+        <w:pPrChange w:id="187" w:author="Eduardo Flach" w:date="2026-10-20T11:58:00Z">
+          <w:pPr>
+            <w:pStyle w:val="PargrafodaLista"/>
+            <w:numPr>
+              <w:ilvl w:val="1"/>
+              <w:numId w:val="5"/>
+            </w:numPr>
+            <w:ind w:left="1440" w:hanging="360"/>
+          </w:pPr>
+        </w:pPrChange>
+      </w:pPr>
+      <w:ins w:id="188" w:author="Eduardo Flach" w:date="2026-10-16T15:04:00Z">
         <w:r>
           <w:t>Organise the</w:t>
         </w:r>
       </w:ins>
-      <w:ins w:id="175" w:author="Eduardo Flach" w:date="2026-10-16T15:05:00Z">
+      <w:ins w:id="189" w:author="Eduardo Flach" w:date="2026-10-16T15:05:00Z">
         <w:r>
           <w:t xml:space="preserve"> actual</w:t>
         </w:r>
       </w:ins>
-      <w:ins w:id="176" w:author="Eduardo Flach" w:date="2026-10-16T15:04:00Z">
+      <w:ins w:id="190" w:author="Eduardo Flach" w:date="2026-10-16T15:04:00Z">
         <w:r>
           <w:t xml:space="preserve"> raw data</w:t>
         </w:r>
       </w:ins>
-      <w:ins w:id="177" w:author="Eduardo Flach" w:date="2026-10-16T15:05:00Z">
+      <w:ins w:id="191" w:author="Eduardo Flach" w:date="2026-10-16T15:05:00Z">
         <w:r>
           <w:t xml:space="preserve"> in some way that we can work with. Being able in the future to make decisions based on facts and not </w:t>
         </w:r>
       </w:ins>
-      <w:ins w:id="178" w:author="Eduardo Flach" w:date="2026-10-16T15:06:00Z">
+      <w:ins w:id="192" w:author="Eduardo Flach" w:date="2026-10-16T15:06:00Z">
         <w:r>
           <w:t>guess and expertise.</w:t>
         </w:r>
@@ -4306,41 +5237,52 @@
           <w:ilvl w:val="1"/>
           <w:numId w:val="5"/>
         </w:numPr>
-        <w:rPr>
-          <w:ins w:id="179" w:author="Eduardo Flach" w:date="2026-10-16T15:10:00Z"/>
-        </w:rPr>
-      </w:pPr>
-      <w:ins w:id="180" w:author="Eduardo Flach" w:date="2026-10-16T15:06:00Z">
+        <w:jc w:val="both"/>
+        <w:rPr>
+          <w:ins w:id="193" w:author="Eduardo Flach" w:date="2026-10-16T15:10:00Z"/>
+        </w:rPr>
+        <w:pPrChange w:id="194" w:author="Eduardo Flach" w:date="2026-10-20T11:58:00Z">
+          <w:pPr>
+            <w:pStyle w:val="PargrafodaLista"/>
+            <w:numPr>
+              <w:ilvl w:val="1"/>
+              <w:numId w:val="5"/>
+            </w:numPr>
+            <w:ind w:left="1440" w:hanging="360"/>
+          </w:pPr>
+        </w:pPrChange>
+      </w:pPr>
+      <w:ins w:id="195" w:author="Eduardo Flach" w:date="2026-10-16T15:06:00Z">
         <w:r>
           <w:t>Check the correlation</w:t>
         </w:r>
       </w:ins>
-      <w:ins w:id="181" w:author="Eduardo Flach" w:date="2026-10-16T15:07:00Z">
+      <w:ins w:id="196" w:author="Eduardo Flach" w:date="2026-10-16T15:07:00Z">
         <w:r>
           <w:t xml:space="preserve"> between</w:t>
         </w:r>
       </w:ins>
-      <w:ins w:id="182" w:author="Eduardo Flach" w:date="2026-10-16T15:06:00Z">
+      <w:ins w:id="197" w:author="Eduardo Flach" w:date="2026-10-16T15:06:00Z">
         <w:r>
           <w:t xml:space="preserve"> </w:t>
         </w:r>
       </w:ins>
-      <w:ins w:id="183" w:author="Eduardo Flach" w:date="2026-10-16T15:07:00Z">
+      <w:ins w:id="198" w:author="Eduardo Flach" w:date="2026-10-16T15:07:00Z">
         <w:r>
           <w:t>the region that the person is living and the amount spend</w:t>
         </w:r>
       </w:ins>
-      <w:ins w:id="184" w:author="Eduardo Flach" w:date="2026-10-16T15:08:00Z">
+      <w:ins w:id="199" w:author="Eduardo Flach" w:date="2026-10-16T15:08:00Z">
         <w:r>
           <w:t xml:space="preserve">. This will be important for future </w:t>
         </w:r>
       </w:ins>
-      <w:ins w:id="185" w:author="Eduardo Flach" w:date="2026-10-16T15:09:00Z">
+      <w:ins w:id="200" w:author="Eduardo Flach" w:date="2026-10-16T15:09:00Z">
         <w:r>
           <w:t xml:space="preserve">investments on Instagram ads for the right target </w:t>
         </w:r>
       </w:ins>
-      <w:ins w:id="186" w:author="Eduardo Flach" w:date="2026-10-16T15:10:00Z">
+      <w:ins w:id="201" w:author="Eduardo Flach" w:date="2026-10-16T15:10:00Z">
         <w:r>
           <w:t>public.</w:t>
         </w:r>
@@ -4353,24 +5295,25 @@
           <w:ilvl w:val="1"/>
           <w:numId w:val="5"/>
         </w:numPr>
-        <w:rPr>
-          <w:ins w:id="187" w:author="Eduardo Flach" w:date="2026-10-12T17:14:00Z"/>
-        </w:rPr>
-        <w:pPrChange w:id="188" w:author="Eduardo Flach" w:date="2026-10-16T15:04:00Z">
+        <w:jc w:val="both"/>
+        <w:rPr>
+          <w:ins w:id="202" w:author="Eduardo Flach" w:date="2026-10-12T17:14:00Z"/>
+        </w:rPr>
+        <w:pPrChange w:id="203" w:author="Eduardo Flach" w:date="2026-10-20T11:58:00Z">
           <w:pPr/>
         </w:pPrChange>
       </w:pPr>
-      <w:ins w:id="189" w:author="Eduardo Flach" w:date="2026-10-16T15:10:00Z">
+      <w:ins w:id="204" w:author="Eduardo Flach" w:date="2026-10-16T15:10:00Z">
         <w:r>
           <w:t>Predict the next sales based on the previous demand. Also predict what kind of pro</w:t>
         </w:r>
       </w:ins>
-      <w:ins w:id="190" w:author="Eduardo Flach" w:date="2026-10-16T15:11:00Z">
+      <w:ins w:id="205" w:author="Eduardo Flach" w:date="2026-10-16T15:11:00Z">
         <w:r>
           <w:t>ducts and</w:t>
         </w:r>
       </w:ins>
-      <w:ins w:id="191" w:author="Eduardo Flach" w:date="2026-10-16T15:12:00Z">
+      <w:ins w:id="206" w:author="Eduardo Flach" w:date="2026-10-16T15:12:00Z">
         <w:r>
           <w:t xml:space="preserve"> colours tend to be more common.</w:t>
         </w:r>
@@ -4380,475 +5323,966 @@
       <w:pPr>
         <w:pStyle w:val="Ttulo1"/>
         <w:spacing w:before="0"/>
-        <w:rPr>
-          <w:ins w:id="192" w:author="Eduardo Flach" w:date="2026-10-12T17:14:00Z"/>
-        </w:rPr>
-      </w:pPr>
-      <w:ins w:id="193" w:author="Eduardo Flach" w:date="2026-10-12T17:14:00Z">
-        <w:r>
-          <w:t>Scope</w:t>
-        </w:r>
-      </w:ins>
-    </w:p>
-    <w:p>
-      <w:pPr>
-        <w:rPr>
-          <w:ins w:id="194" w:author="Eduardo Flach" w:date="2026-10-16T15:15:00Z"/>
-        </w:rPr>
-      </w:pPr>
-      <w:ins w:id="195" w:author="Eduardo Flach" w:date="2026-10-16T15:12:00Z">
-        <w:r>
-          <w:tab/>
-        </w:r>
-      </w:ins>
-      <w:ins w:id="196" w:author="Eduardo Flach" w:date="2026-10-16T15:13:00Z">
-        <w:r>
-          <w:t xml:space="preserve">Once there is no appropriate data storage, </w:t>
-        </w:r>
-      </w:ins>
-      <w:ins w:id="197" w:author="Eduardo Flach" w:date="2026-10-16T15:14:00Z">
-        <w:r>
-          <w:t xml:space="preserve">important features related of the products, such as </w:t>
-        </w:r>
-      </w:ins>
-      <w:ins w:id="198" w:author="Eduardo Flach" w:date="2026-10-16T15:15:00Z">
-        <w:r>
-          <w:t>cost of production, raw material needed, cost of suppliers, etc, will not be included at the first time.</w:t>
-        </w:r>
-      </w:ins>
-    </w:p>
-    <w:p>
-      <w:pPr>
-        <w:rPr>
-          <w:ins w:id="199" w:author="Eduardo Flach" w:date="2026-10-12T17:14:00Z"/>
-        </w:rPr>
-      </w:pPr>
-      <w:ins w:id="200" w:author="Eduardo Flach" w:date="2026-10-16T15:15:00Z">
-        <w:r>
-          <w:lastRenderedPageBreak/>
-          <w:tab/>
-          <w:t xml:space="preserve">The project will focus on </w:t>
-        </w:r>
-      </w:ins>
-      <w:ins w:id="201" w:author="Eduardo Flach" w:date="2026-10-16T15:16:00Z">
-        <w:r>
-          <w:t>the target public for Ads campaigns and the prediction of what kinds of products tends to sell more.</w:t>
-        </w:r>
-      </w:ins>
-    </w:p>
-    <w:p>
-      <w:pPr>
-        <w:pStyle w:val="Ttulo1"/>
-        <w:spacing w:before="0"/>
-        <w:rPr>
-          <w:ins w:id="202" w:author="Eduardo Flach" w:date="2026-10-18T19:25:00Z"/>
-        </w:rPr>
-      </w:pPr>
-      <w:ins w:id="203" w:author="Eduardo Flach" w:date="2026-10-12T17:15:00Z">
-        <w:r>
-          <w:t>Methodology</w:t>
-        </w:r>
-      </w:ins>
-    </w:p>
-    <w:p>
-      <w:pPr>
-        <w:rPr>
-          <w:ins w:id="204" w:author="Eduardo Flach" w:date="2026-10-18T19:29:00Z"/>
-        </w:rPr>
-      </w:pPr>
-      <w:ins w:id="205" w:author="Eduardo Flach" w:date="2026-10-18T19:25:00Z">
-        <w:r>
-          <w:tab/>
-          <w:t xml:space="preserve">The project will start organizing the current data in a proper document. This </w:t>
-        </w:r>
-      </w:ins>
-      <w:ins w:id="206" w:author="Eduardo Flach" w:date="2026-10-18T19:26:00Z">
-        <w:r>
-          <w:t xml:space="preserve">document will support either the current proposal to find out the main aims and to give the company </w:t>
-        </w:r>
-      </w:ins>
-      <w:ins w:id="207" w:author="Eduardo Flach" w:date="2026-10-18T19:27:00Z">
-        <w:r>
-          <w:t>a proper storage structure of the data.</w:t>
-        </w:r>
-      </w:ins>
-      <w:ins w:id="208" w:author="Eduardo Flach" w:date="2026-10-18T19:28:00Z">
-        <w:r>
-          <w:t xml:space="preserve"> A good amount of the time will be </w:t>
-        </w:r>
-      </w:ins>
-      <w:ins w:id="209" w:author="Eduardo Flach" w:date="2026-10-18T19:29:00Z">
-        <w:r>
-          <w:t>spent</w:t>
-        </w:r>
-      </w:ins>
-      <w:ins w:id="210" w:author="Eduardo Flach" w:date="2026-10-18T19:28:00Z">
-        <w:r>
-          <w:t xml:space="preserve"> in </w:t>
-        </w:r>
-      </w:ins>
-      <w:ins w:id="211" w:author="Eduardo Flach" w:date="2026-10-18T19:29:00Z">
-        <w:r>
-          <w:t>this part of the project</w:t>
-        </w:r>
-      </w:ins>
-      <w:ins w:id="212" w:author="Eduardo Flach" w:date="2026-10-18T19:28:00Z">
-        <w:r>
-          <w:t>, appl</w:t>
-        </w:r>
-      </w:ins>
-      <w:ins w:id="213" w:author="Eduardo Flach" w:date="2026-10-18T19:29:00Z">
-        <w:r>
-          <w:t>ying tools of the data preparation module in order to organise the data in a better way.</w:t>
-        </w:r>
-      </w:ins>
-    </w:p>
-    <w:p>
-      <w:pPr>
-        <w:rPr>
-          <w:ins w:id="214" w:author="Eduardo Flach" w:date="2026-10-12T17:15:00Z"/>
-        </w:rPr>
-        <w:pPrChange w:id="215" w:author="Eduardo Flach" w:date="2026-10-18T19:25:00Z">
+        <w:jc w:val="both"/>
+        <w:rPr>
+          <w:ins w:id="207" w:author="Eduardo Flach" w:date="2026-10-12T17:14:00Z"/>
+        </w:rPr>
+        <w:pPrChange w:id="208" w:author="Eduardo Flach" w:date="2026-10-20T11:58:00Z">
           <w:pPr>
             <w:pStyle w:val="Ttulo1"/>
             <w:spacing w:before="0"/>
           </w:pPr>
         </w:pPrChange>
       </w:pPr>
-      <w:ins w:id="216" w:author="Eduardo Flach" w:date="2026-10-18T19:30:00Z">
-        <w:r>
-          <w:rPr>
-            <w:highlight w:val="yellow"/>
-            <w:rPrChange w:id="217" w:author="Eduardo Flach" w:date="2026-10-18T19:30:00Z">
-              <w:rPr/>
-            </w:rPrChange>
-          </w:rPr>
-          <w:t>FALTA</w:t>
-        </w:r>
-      </w:ins>
-    </w:p>
-    <w:p>
-      <w:pPr>
-        <w:rPr>
-          <w:ins w:id="218" w:author="Eduardo Flach" w:date="2026-10-12T17:15:00Z"/>
-        </w:rPr>
-      </w:pPr>
+      <w:bookmarkStart w:id="209" w:name="_Toc243389957"/>
+      <w:ins w:id="210" w:author="Eduardo Flach" w:date="2026-10-12T17:14:00Z">
+        <w:r>
+          <w:t>Scope</w:t>
+        </w:r>
+        <w:bookmarkEnd w:id="209"/>
+      </w:ins>
+    </w:p>
+    <w:p>
+      <w:pPr>
+        <w:jc w:val="both"/>
+        <w:rPr>
+          <w:ins w:id="211" w:author="Eduardo Flach" w:date="2026-10-16T15:15:00Z"/>
+        </w:rPr>
+        <w:pPrChange w:id="212" w:author="Eduardo Flach" w:date="2026-10-20T11:58:00Z">
+          <w:pPr/>
+        </w:pPrChange>
+      </w:pPr>
+      <w:ins w:id="213" w:author="Eduardo Flach" w:date="2026-10-16T15:12:00Z">
+        <w:r>
+          <w:tab/>
+        </w:r>
+      </w:ins>
+      <w:ins w:id="214" w:author="Eduardo Flach" w:date="2026-10-16T15:13:00Z">
+        <w:r>
+          <w:t xml:space="preserve">Once there is no appropriate data storage, </w:t>
+        </w:r>
+      </w:ins>
+      <w:ins w:id="215" w:author="Eduardo Flach" w:date="2026-10-16T15:14:00Z">
+        <w:r>
+          <w:t xml:space="preserve">important features related of the products, such as </w:t>
+        </w:r>
+      </w:ins>
+      <w:ins w:id="216" w:author="Eduardo Flach" w:date="2026-10-16T15:15:00Z">
+        <w:r>
+          <w:t>cost of production, raw material needed, cost of suppliers, etc, will not be included at the first time.</w:t>
+        </w:r>
+      </w:ins>
+    </w:p>
+    <w:p>
+      <w:pPr>
+        <w:jc w:val="both"/>
+        <w:rPr>
+          <w:ins w:id="217" w:author="Eduardo Flach" w:date="2026-10-12T17:14:00Z"/>
+        </w:rPr>
+        <w:pPrChange w:id="218" w:author="Eduardo Flach" w:date="2026-10-20T11:58:00Z">
+          <w:pPr/>
+        </w:pPrChange>
+      </w:pPr>
+      <w:ins w:id="219" w:author="Eduardo Flach" w:date="2026-10-16T15:15:00Z">
+        <w:r>
+          <w:lastRenderedPageBreak/>
+          <w:tab/>
+          <w:t xml:space="preserve">The project will focus on </w:t>
+        </w:r>
+      </w:ins>
+      <w:ins w:id="220" w:author="Eduardo Flach" w:date="2026-10-16T15:16:00Z">
+        <w:r>
+          <w:t>the target public for Ads campaigns and the prediction of what kinds of products tends to sell more.</w:t>
+        </w:r>
+      </w:ins>
     </w:p>
     <w:p>
       <w:pPr>
         <w:pStyle w:val="Ttulo1"/>
         <w:spacing w:before="0"/>
-        <w:rPr>
-          <w:ins w:id="219" w:author="Eduardo Flach" w:date="2026-10-18T19:30:00Z"/>
-        </w:rPr>
-      </w:pPr>
-      <w:ins w:id="220" w:author="Eduardo Flach" w:date="2026-10-12T17:15:00Z">
-        <w:r>
-          <w:t>Data Sources</w:t>
-        </w:r>
-      </w:ins>
-    </w:p>
-    <w:p>
-      <w:pPr>
-        <w:rPr>
-          <w:ins w:id="221" w:author="Eduardo Flach" w:date="2026-10-18T19:35:00Z"/>
-        </w:rPr>
-      </w:pPr>
-      <w:ins w:id="222" w:author="Eduardo Flach" w:date="2026-10-18T19:30:00Z">
-        <w:r>
-          <w:tab/>
-          <w:t>As mentioned before</w:t>
-        </w:r>
-      </w:ins>
-      <w:ins w:id="223" w:author="Eduardo Flach" w:date="2026-10-18T19:31:00Z">
-        <w:r>
-          <w:t xml:space="preserve">, the data is coming from a </w:t>
-        </w:r>
-      </w:ins>
-      <w:ins w:id="224" w:author="Eduardo Flach" w:date="2026-10-18T19:33:00Z">
-        <w:r>
-          <w:t>historic sale</w:t>
-        </w:r>
-      </w:ins>
-      <w:ins w:id="225" w:author="Eduardo Flach" w:date="2026-10-18T19:31:00Z">
-        <w:r>
-          <w:t xml:space="preserve"> since 2020</w:t>
-        </w:r>
-      </w:ins>
-      <w:ins w:id="226" w:author="Eduardo Flach" w:date="2026-10-18T19:33:00Z">
-        <w:r>
-          <w:t xml:space="preserve"> from a handcraft products company based in Brazil.</w:t>
-        </w:r>
-      </w:ins>
-      <w:ins w:id="227" w:author="Eduardo Flach" w:date="2026-10-18T19:32:00Z">
-        <w:r>
-          <w:t xml:space="preserve"> </w:t>
-        </w:r>
-      </w:ins>
-      <w:ins w:id="228" w:author="Eduardo Flach" w:date="2026-10-18T19:33:00Z">
-        <w:r>
-          <w:t>W</w:t>
-        </w:r>
-      </w:ins>
-      <w:ins w:id="229" w:author="Eduardo Flach" w:date="2026-10-18T19:32:00Z">
-        <w:r>
-          <w:t xml:space="preserve">ith more than 500 sales </w:t>
-        </w:r>
-      </w:ins>
-      <w:ins w:id="230" w:author="Eduardo Flach" w:date="2026-10-18T19:33:00Z">
-        <w:r>
-          <w:t>since the beginning, the quantity of the data available to work w</w:t>
-        </w:r>
-      </w:ins>
-      <w:ins w:id="231" w:author="Eduardo Flach" w:date="2026-10-18T19:34:00Z">
-        <w:r>
-          <w:t xml:space="preserve">ith is expected to be higher 500. </w:t>
-        </w:r>
-      </w:ins>
-    </w:p>
-    <w:p>
-      <w:pPr>
-        <w:rPr>
-          <w:ins w:id="232" w:author="Eduardo Flach" w:date="2026-10-12T17:15:00Z"/>
-        </w:rPr>
-        <w:pPrChange w:id="233" w:author="Eduardo Flach" w:date="2026-10-18T19:30:00Z">
+        <w:jc w:val="both"/>
+        <w:rPr>
+          <w:ins w:id="221" w:author="Eduardo Flach" w:date="2026-10-18T19:25:00Z"/>
+        </w:rPr>
+        <w:pPrChange w:id="222" w:author="Eduardo Flach" w:date="2026-10-20T11:58:00Z">
           <w:pPr>
             <w:pStyle w:val="Ttulo1"/>
             <w:spacing w:before="0"/>
           </w:pPr>
         </w:pPrChange>
       </w:pPr>
-      <w:ins w:id="234" w:author="Eduardo Flach" w:date="2026-10-18T19:35:00Z">
+      <w:bookmarkStart w:id="223" w:name="_Toc243389958"/>
+      <w:ins w:id="224" w:author="Eduardo Flach" w:date="2026-10-12T17:15:00Z">
+        <w:r>
+          <w:t>Methodology</w:t>
+        </w:r>
+      </w:ins>
+      <w:bookmarkEnd w:id="223"/>
+    </w:p>
+    <w:p>
+      <w:pPr>
+        <w:jc w:val="both"/>
+        <w:rPr>
+          <w:ins w:id="225" w:author="Eduardo Flach" w:date="2026-10-20T10:12:00Z"/>
+        </w:rPr>
+        <w:pPrChange w:id="226" w:author="Eduardo Flach" w:date="2026-10-20T11:58:00Z">
+          <w:pPr/>
+        </w:pPrChange>
+      </w:pPr>
+      <w:ins w:id="227" w:author="Eduardo Flach" w:date="2026-10-18T19:25:00Z">
         <w:r>
           <w:tab/>
-          <w:t xml:space="preserve">The data will have categorical and numerical variable, such as </w:t>
-        </w:r>
-      </w:ins>
-      <w:ins w:id="235" w:author="Eduardo Flach" w:date="2026-10-18T19:36:00Z">
-        <w:r>
-          <w:t>“zip code”, “gender”, “</w:t>
-        </w:r>
-      </w:ins>
-      <w:ins w:id="236" w:author="Eduardo Flach" w:date="2026-10-18T19:37:00Z">
-        <w:r>
-          <w:t>number</w:t>
-        </w:r>
-      </w:ins>
-      <w:ins w:id="237" w:author="Eduardo Flach" w:date="2026-10-18T19:36:00Z">
-        <w:r>
-          <w:t xml:space="preserve"> of sales”, “price”, etc</w:t>
-        </w:r>
-      </w:ins>
-      <w:ins w:id="238" w:author="Eduardo Flach" w:date="2026-10-18T19:37:00Z">
-        <w:r>
-          <w:t>. This project will have a huge impact on the current business</w:t>
-        </w:r>
-      </w:ins>
-      <w:ins w:id="239" w:author="Eduardo Flach" w:date="2026-10-18T19:38:00Z">
-        <w:r>
-          <w:t>, because it will give the owner some guidance based on fact</w:t>
-        </w:r>
-      </w:ins>
-      <w:ins w:id="240" w:author="Eduardo Flach" w:date="2026-10-18T19:39:00Z">
-        <w:r>
-          <w:t xml:space="preserve">s to improve the capacity of </w:t>
-        </w:r>
-      </w:ins>
-      <w:ins w:id="241" w:author="Eduardo Flach" w:date="2026-10-18T19:40:00Z">
-        <w:r>
-          <w:t>the business decision in important matters.</w:t>
-        </w:r>
-      </w:ins>
-    </w:p>
-    <w:p>
-      <w:pPr>
-        <w:rPr>
-          <w:ins w:id="242" w:author="Eduardo Flach" w:date="2026-10-12T17:15:00Z"/>
-        </w:rPr>
-      </w:pPr>
+          <w:t xml:space="preserve">The project will start organizing the current data in a proper document. This </w:t>
+        </w:r>
+      </w:ins>
+      <w:ins w:id="228" w:author="Eduardo Flach" w:date="2026-10-18T19:26:00Z">
+        <w:r>
+          <w:t xml:space="preserve">document will support either the current proposal to find out the main aims and to give the company </w:t>
+        </w:r>
+      </w:ins>
+      <w:ins w:id="229" w:author="Eduardo Flach" w:date="2026-10-18T19:27:00Z">
+        <w:r>
+          <w:t>a proper storage structure of the data.</w:t>
+        </w:r>
+      </w:ins>
+      <w:ins w:id="230" w:author="Eduardo Flach" w:date="2026-10-18T19:28:00Z">
+        <w:r>
+          <w:t xml:space="preserve"> A good amount of the time will be </w:t>
+        </w:r>
+      </w:ins>
+      <w:ins w:id="231" w:author="Eduardo Flach" w:date="2026-10-18T19:29:00Z">
+        <w:r>
+          <w:t>spent</w:t>
+        </w:r>
+      </w:ins>
+      <w:ins w:id="232" w:author="Eduardo Flach" w:date="2026-10-18T19:28:00Z">
+        <w:r>
+          <w:t xml:space="preserve"> in </w:t>
+        </w:r>
+      </w:ins>
+      <w:ins w:id="233" w:author="Eduardo Flach" w:date="2026-10-18T19:29:00Z">
+        <w:r>
+          <w:t>this part of the project</w:t>
+        </w:r>
+      </w:ins>
+      <w:ins w:id="234" w:author="Eduardo Flach" w:date="2026-10-18T19:28:00Z">
+        <w:r>
+          <w:t>, appl</w:t>
+        </w:r>
+      </w:ins>
+      <w:ins w:id="235" w:author="Eduardo Flach" w:date="2026-10-18T19:29:00Z">
+        <w:r>
+          <w:t>ying tools of the data preparation module in order to organise the data in a better way.</w:t>
+        </w:r>
+      </w:ins>
+    </w:p>
+    <w:p>
+      <w:pPr>
+        <w:jc w:val="both"/>
+        <w:rPr>
+          <w:ins w:id="236" w:author="Eduardo Flach" w:date="2026-10-20T10:15:00Z"/>
+        </w:rPr>
+        <w:pPrChange w:id="237" w:author="Eduardo Flach" w:date="2026-10-20T11:58:00Z">
+          <w:pPr/>
+        </w:pPrChange>
+      </w:pPr>
+      <w:ins w:id="238" w:author="Eduardo Flach" w:date="2026-10-20T10:13:00Z">
+        <w:r>
+          <w:tab/>
+          <w:t xml:space="preserve">The second step is to check the data and prepare it for any further study. </w:t>
+        </w:r>
+      </w:ins>
+      <w:ins w:id="239" w:author="Eduardo Flach" w:date="2026-10-20T10:14:00Z">
+        <w:r>
+          <w:t xml:space="preserve">For example, checking duplicates, checking missing values, coding the data, </w:t>
+        </w:r>
+      </w:ins>
+      <w:ins w:id="240" w:author="Eduardo Flach" w:date="2026-10-20T11:03:00Z">
+        <w:r>
+          <w:t>scale,</w:t>
+        </w:r>
+      </w:ins>
+      <w:ins w:id="241" w:author="Eduardo Flach" w:date="2026-10-20T10:14:00Z">
+        <w:r>
+          <w:t xml:space="preserve"> if necessary, etc.</w:t>
+        </w:r>
+      </w:ins>
+    </w:p>
+    <w:p>
+      <w:pPr>
+        <w:ind w:firstLine="720"/>
+        <w:jc w:val="both"/>
+        <w:rPr>
+          <w:ins w:id="242" w:author="Eduardo Flach" w:date="2026-10-20T10:18:00Z"/>
+        </w:rPr>
+        <w:pPrChange w:id="243" w:author="Eduardo Flach" w:date="2026-10-20T11:58:00Z">
+          <w:pPr>
+            <w:ind w:firstLine="720"/>
+          </w:pPr>
+        </w:pPrChange>
+      </w:pPr>
+      <w:ins w:id="244" w:author="Eduardo Flach" w:date="2026-10-20T10:16:00Z">
+        <w:r>
+          <w:t xml:space="preserve">Third step will </w:t>
+        </w:r>
+      </w:ins>
+      <w:ins w:id="245" w:author="Eduardo Flach" w:date="2026-10-20T10:17:00Z">
+        <w:r>
+          <w:t>focus on the evaluation of the accuracy an</w:t>
+        </w:r>
+      </w:ins>
+      <w:ins w:id="246" w:author="Eduardo Flach" w:date="2026-10-20T10:18:00Z">
+        <w:r>
+          <w:t>d the difference between some techniques applied on the current data.</w:t>
+        </w:r>
+      </w:ins>
+      <w:ins w:id="247" w:author="Eduardo Flach" w:date="2026-10-20T10:25:00Z">
+        <w:r>
+          <w:t xml:space="preserve"> It will be necessary to check different kinds of </w:t>
+        </w:r>
+      </w:ins>
+      <w:ins w:id="248" w:author="Eduardo Flach" w:date="2026-10-20T10:26:00Z">
+        <w:r>
+          <w:t xml:space="preserve">machine learning </w:t>
+        </w:r>
+      </w:ins>
+      <w:ins w:id="249" w:author="Eduardo Flach" w:date="2026-10-20T10:25:00Z">
+        <w:r>
+          <w:t>tech</w:t>
+        </w:r>
+      </w:ins>
+      <w:ins w:id="250" w:author="Eduardo Flach" w:date="2026-10-20T10:26:00Z">
+        <w:r>
+          <w:t>niques at first, once I do not have the data organized yet.</w:t>
+        </w:r>
+      </w:ins>
+    </w:p>
+    <w:p>
+      <w:pPr>
+        <w:ind w:firstLine="720"/>
+        <w:jc w:val="both"/>
+        <w:rPr>
+          <w:ins w:id="251" w:author="Eduardo Flach" w:date="2026-10-20T10:22:00Z"/>
+        </w:rPr>
+        <w:pPrChange w:id="252" w:author="Eduardo Flach" w:date="2026-10-20T11:58:00Z">
+          <w:pPr>
+            <w:ind w:firstLine="720"/>
+          </w:pPr>
+        </w:pPrChange>
+      </w:pPr>
+      <w:ins w:id="253" w:author="Eduardo Flach" w:date="2026-10-20T10:20:00Z">
+        <w:r>
+          <w:t>In the fourth</w:t>
+        </w:r>
+      </w:ins>
+      <w:ins w:id="254" w:author="Eduardo Flach" w:date="2026-10-20T10:18:00Z">
+        <w:r>
+          <w:t xml:space="preserve"> st</w:t>
+        </w:r>
+      </w:ins>
+      <w:ins w:id="255" w:author="Eduardo Flach" w:date="2026-10-20T10:19:00Z">
+        <w:r>
+          <w:t>ep</w:t>
+        </w:r>
+      </w:ins>
+      <w:ins w:id="256" w:author="Eduardo Flach" w:date="2026-10-20T10:20:00Z">
+        <w:r>
+          <w:t>,</w:t>
+        </w:r>
+      </w:ins>
+      <w:ins w:id="257" w:author="Eduardo Flach" w:date="2026-10-20T10:19:00Z">
+        <w:r>
+          <w:t xml:space="preserve"> the chosen machine learning technique</w:t>
+        </w:r>
+      </w:ins>
+      <w:ins w:id="258" w:author="Eduardo Flach" w:date="2026-10-20T10:20:00Z">
+        <w:r>
+          <w:t xml:space="preserve"> will </w:t>
+        </w:r>
+      </w:ins>
+      <w:ins w:id="259" w:author="Eduardo Flach" w:date="2026-10-20T10:21:00Z">
+        <w:r>
+          <w:t>be done. Following by the model evaluation which will compare if the results answer t</w:t>
+        </w:r>
+      </w:ins>
+      <w:ins w:id="260" w:author="Eduardo Flach" w:date="2026-10-20T10:22:00Z">
+        <w:r>
+          <w:t xml:space="preserve">he objectives. If the results are not </w:t>
+        </w:r>
+      </w:ins>
+      <w:ins w:id="261" w:author="Eduardo Flach" w:date="2026-10-20T10:23:00Z">
+        <w:r>
+          <w:t>satisfactory, the task can go back to the third step.</w:t>
+        </w:r>
+      </w:ins>
+    </w:p>
+    <w:p>
+      <w:pPr>
+        <w:ind w:firstLine="720"/>
+        <w:jc w:val="both"/>
+        <w:rPr>
+          <w:ins w:id="262" w:author="Eduardo Flach" w:date="2026-10-20T11:02:00Z"/>
+        </w:rPr>
+        <w:pPrChange w:id="263" w:author="Eduardo Flach" w:date="2026-10-20T11:58:00Z">
+          <w:pPr>
+            <w:ind w:firstLine="720"/>
+          </w:pPr>
+        </w:pPrChange>
+      </w:pPr>
+      <w:ins w:id="264" w:author="Eduardo Flach" w:date="2026-10-20T10:22:00Z">
+        <w:r>
+          <w:t xml:space="preserve">The final step is dedicated to </w:t>
+        </w:r>
+      </w:ins>
+      <w:ins w:id="265" w:author="Eduardo Flach" w:date="2026-10-20T10:23:00Z">
+        <w:r>
+          <w:t>the results and visualiza</w:t>
+        </w:r>
+      </w:ins>
+      <w:ins w:id="266" w:author="Eduardo Flach" w:date="2026-10-20T10:24:00Z">
+        <w:r>
+          <w:t>tion, according to the data visualization module.</w:t>
+        </w:r>
+      </w:ins>
+    </w:p>
+    <w:p>
+      <w:pPr>
+        <w:jc w:val="both"/>
+        <w:rPr>
+          <w:ins w:id="267" w:author="Eduardo Flach" w:date="2026-10-12T17:15:00Z"/>
+        </w:rPr>
+        <w:pPrChange w:id="268" w:author="Eduardo Flach" w:date="2026-10-20T11:58:00Z">
+          <w:pPr/>
+        </w:pPrChange>
+      </w:pPr>
+      <w:ins w:id="269" w:author="Eduardo Flach" w:date="2026-10-20T11:02:00Z">
+        <w:r>
+          <w:drawing>
+            <wp:inline distT="0" distB="0" distL="0" distR="0" wp14:anchorId="18CFD4D2" wp14:editId="5A8E2FF5">
+              <wp:extent cx="5731510" cy="1393190"/>
+              <wp:effectExtent l="0" t="0" r="2540" b="0"/>
+              <wp:docPr id="1" name="Imagem 1"/>
+              <wp:cNvGraphicFramePr>
+                <a:graphicFrameLocks xmlns:a="http://schemas.openxmlformats.org/drawingml/2006/main" noChangeAspect="1"/>
+              </wp:cNvGraphicFramePr>
+              <a:graphic xmlns:a="http://schemas.openxmlformats.org/drawingml/2006/main">
+                <a:graphicData uri="http://schemas.openxmlformats.org/drawingml/2006/picture">
+                  <pic:pic xmlns:pic="http://schemas.openxmlformats.org/drawingml/2006/picture">
+                    <pic:nvPicPr>
+                      <pic:cNvPr id="1" name=""/>
+                      <pic:cNvPicPr/>
+                    </pic:nvPicPr>
+                    <pic:blipFill>
+                      <a:blip r:embed="rId15"/>
+                      <a:stretch>
+                        <a:fillRect/>
+                      </a:stretch>
+                    </pic:blipFill>
+                    <pic:spPr>
+                      <a:xfrm>
+                        <a:off x="0" y="0"/>
+                        <a:ext cx="5731510" cy="1393190"/>
+                      </a:xfrm>
+                      <a:prstGeom prst="rect">
+                        <a:avLst/>
+                      </a:prstGeom>
+                    </pic:spPr>
+                  </pic:pic>
+                </a:graphicData>
+              </a:graphic>
+            </wp:inline>
+          </w:drawing>
+        </w:r>
+      </w:ins>
     </w:p>
     <w:p>
       <w:pPr>
         <w:pStyle w:val="Ttulo1"/>
         <w:spacing w:before="0"/>
-        <w:rPr>
-          <w:ins w:id="243" w:author="Eduardo Flach" w:date="2026-10-12T17:16:00Z"/>
-        </w:rPr>
-      </w:pPr>
-      <w:ins w:id="244" w:author="Eduardo Flach" w:date="2026-10-12T17:16:00Z">
-        <w:r>
-          <w:t>Expected Deliverables</w:t>
-        </w:r>
-      </w:ins>
-    </w:p>
-    <w:p>
-      <w:pPr>
-        <w:rPr>
-          <w:ins w:id="245" w:author="Eduardo Flach" w:date="2026-10-12T17:16:00Z"/>
-        </w:rPr>
-      </w:pPr>
-    </w:p>
-    <w:p>
-      <w:pPr>
-        <w:pStyle w:val="Ttulo1"/>
-        <w:spacing w:before="0"/>
-        <w:rPr>
-          <w:ins w:id="246" w:author="Eduardo Flach" w:date="2026-10-12T17:18:00Z"/>
-        </w:rPr>
-      </w:pPr>
-      <w:ins w:id="247" w:author="Eduardo Flach" w:date="2026-10-12T17:16:00Z">
-        <w:r>
-          <w:t>Project Timeline</w:t>
-        </w:r>
-      </w:ins>
-    </w:p>
-    <w:p>
-      <w:pPr>
-        <w:rPr>
-          <w:ins w:id="248" w:author="Eduardo Flach" w:date="2026-10-12T17:18:00Z"/>
-        </w:rPr>
-      </w:pPr>
-    </w:p>
-    <w:p>
-      <w:pPr>
-        <w:pStyle w:val="Ttulo1"/>
-        <w:spacing w:before="0"/>
-        <w:rPr>
-          <w:ins w:id="249" w:author="Eduardo Flach" w:date="2026-10-12T17:18:00Z"/>
-        </w:rPr>
-      </w:pPr>
-      <w:ins w:id="250" w:author="Eduardo Flach" w:date="2026-10-12T17:18:00Z">
-        <w:r>
-          <w:t>Ethical</w:t>
-        </w:r>
-      </w:ins>
-      <w:ins w:id="251" w:author="Eduardo Flach" w:date="2026-10-12T17:19:00Z">
-        <w:r>
-          <w:t xml:space="preserve"> and Legal Considerations</w:t>
-        </w:r>
-      </w:ins>
-    </w:p>
-    <w:p>
-      <w:pPr>
-        <w:rPr>
-          <w:ins w:id="252" w:author="Eduardo Flach" w:date="2026-10-12T17:16:00Z"/>
-        </w:rPr>
-        <w:pPrChange w:id="253" w:author="Eduardo Flach" w:date="2026-10-12T17:18:00Z">
+        <w:jc w:val="both"/>
+        <w:rPr>
+          <w:ins w:id="270" w:author="Eduardo Flach" w:date="2026-10-18T19:30:00Z"/>
+        </w:rPr>
+        <w:pPrChange w:id="271" w:author="Eduardo Flach" w:date="2026-10-20T11:58:00Z">
           <w:pPr>
             <w:pStyle w:val="Ttulo1"/>
             <w:spacing w:before="0"/>
           </w:pPr>
         </w:pPrChange>
       </w:pPr>
-    </w:p>
-    <w:p>
-      <w:pPr>
-        <w:rPr>
-          <w:ins w:id="254" w:author="Eduardo Flach" w:date="2026-10-12T17:16:00Z"/>
-        </w:rPr>
-        <w:pPrChange w:id="255" w:author="Eduardo Flach" w:date="2026-10-12T17:16:00Z">
+      <w:bookmarkStart w:id="272" w:name="_Toc243389959"/>
+      <w:ins w:id="273" w:author="Eduardo Flach" w:date="2026-10-12T17:15:00Z">
+        <w:r>
+          <w:t>Data Sources</w:t>
+        </w:r>
+      </w:ins>
+      <w:bookmarkEnd w:id="272"/>
+    </w:p>
+    <w:p>
+      <w:pPr>
+        <w:jc w:val="both"/>
+        <w:rPr>
+          <w:ins w:id="274" w:author="Eduardo Flach" w:date="2026-10-18T19:35:00Z"/>
+        </w:rPr>
+        <w:pPrChange w:id="275" w:author="Eduardo Flach" w:date="2026-10-20T11:58:00Z">
+          <w:pPr/>
+        </w:pPrChange>
+      </w:pPr>
+      <w:ins w:id="276" w:author="Eduardo Flach" w:date="2026-10-18T19:30:00Z">
+        <w:r>
+          <w:tab/>
+          <w:t>As mentioned before</w:t>
+        </w:r>
+      </w:ins>
+      <w:ins w:id="277" w:author="Eduardo Flach" w:date="2026-10-18T19:31:00Z">
+        <w:r>
+          <w:t xml:space="preserve">, the data is coming from a </w:t>
+        </w:r>
+      </w:ins>
+      <w:ins w:id="278" w:author="Eduardo Flach" w:date="2026-10-18T19:33:00Z">
+        <w:r>
+          <w:t>historic sale</w:t>
+        </w:r>
+      </w:ins>
+      <w:ins w:id="279" w:author="Eduardo Flach" w:date="2026-10-18T19:31:00Z">
+        <w:r>
+          <w:t xml:space="preserve"> since 2020</w:t>
+        </w:r>
+      </w:ins>
+      <w:ins w:id="280" w:author="Eduardo Flach" w:date="2026-10-18T19:33:00Z">
+        <w:r>
+          <w:t xml:space="preserve"> from a handcraft products company based in Brazil.</w:t>
+        </w:r>
+      </w:ins>
+      <w:ins w:id="281" w:author="Eduardo Flach" w:date="2026-10-18T19:32:00Z">
+        <w:r>
+          <w:t xml:space="preserve"> </w:t>
+        </w:r>
+      </w:ins>
+      <w:ins w:id="282" w:author="Eduardo Flach" w:date="2026-10-18T19:33:00Z">
+        <w:r>
+          <w:t>W</w:t>
+        </w:r>
+      </w:ins>
+      <w:ins w:id="283" w:author="Eduardo Flach" w:date="2026-10-18T19:32:00Z">
+        <w:r>
+          <w:t xml:space="preserve">ith more than 500 sales </w:t>
+        </w:r>
+      </w:ins>
+      <w:ins w:id="284" w:author="Eduardo Flach" w:date="2026-10-18T19:33:00Z">
+        <w:r>
+          <w:t>since the beginning, the quantity of the data available to work w</w:t>
+        </w:r>
+      </w:ins>
+      <w:ins w:id="285" w:author="Eduardo Flach" w:date="2026-10-18T19:34:00Z">
+        <w:r>
+          <w:t xml:space="preserve">ith is expected to be higher 500. </w:t>
+        </w:r>
+      </w:ins>
+    </w:p>
+    <w:p>
+      <w:pPr>
+        <w:jc w:val="both"/>
+        <w:rPr>
+          <w:ins w:id="286" w:author="Eduardo Flach" w:date="2026-10-12T17:15:00Z"/>
+        </w:rPr>
+        <w:pPrChange w:id="287" w:author="Eduardo Flach" w:date="2026-10-20T11:58:00Z">
           <w:pPr>
             <w:pStyle w:val="Ttulo1"/>
             <w:spacing w:before="0"/>
           </w:pPr>
         </w:pPrChange>
       </w:pPr>
-    </w:p>
-    <w:p>
-      <w:pPr>
-        <w:rPr>
-          <w:ins w:id="256" w:author="Eduardo Flach" w:date="2026-10-12T17:15:00Z"/>
-        </w:rPr>
-        <w:pPrChange w:id="257" w:author="Eduardo Flach" w:date="2026-10-12T17:16:00Z">
+      <w:ins w:id="288" w:author="Eduardo Flach" w:date="2026-10-18T19:35:00Z">
+        <w:r>
+          <w:tab/>
+          <w:t xml:space="preserve">The data will have categorical and numerical variable, such as </w:t>
+        </w:r>
+      </w:ins>
+      <w:ins w:id="289" w:author="Eduardo Flach" w:date="2026-10-18T19:36:00Z">
+        <w:r>
+          <w:t>“zip code”, “gender”, “</w:t>
+        </w:r>
+      </w:ins>
+      <w:ins w:id="290" w:author="Eduardo Flach" w:date="2026-10-18T19:37:00Z">
+        <w:r>
+          <w:t>number</w:t>
+        </w:r>
+      </w:ins>
+      <w:ins w:id="291" w:author="Eduardo Flach" w:date="2026-10-18T19:36:00Z">
+        <w:r>
+          <w:t xml:space="preserve"> of sales”, “price”, etc</w:t>
+        </w:r>
+      </w:ins>
+      <w:ins w:id="292" w:author="Eduardo Flach" w:date="2026-10-18T19:37:00Z">
+        <w:r>
+          <w:t>. This project will have a huge impact on the current business</w:t>
+        </w:r>
+      </w:ins>
+      <w:ins w:id="293" w:author="Eduardo Flach" w:date="2026-10-18T19:38:00Z">
+        <w:r>
+          <w:t>, because it will give the owner some guidance based on fact</w:t>
+        </w:r>
+      </w:ins>
+      <w:ins w:id="294" w:author="Eduardo Flach" w:date="2026-10-18T19:39:00Z">
+        <w:r>
+          <w:t xml:space="preserve">s to improve the capacity of </w:t>
+        </w:r>
+      </w:ins>
+      <w:ins w:id="295" w:author="Eduardo Flach" w:date="2026-10-18T19:40:00Z">
+        <w:r>
+          <w:t>the business decision in important matters.</w:t>
+        </w:r>
+      </w:ins>
+    </w:p>
+    <w:p>
+      <w:pPr>
+        <w:jc w:val="both"/>
+        <w:rPr>
+          <w:ins w:id="296" w:author="Eduardo Flach" w:date="2026-10-12T17:15:00Z"/>
+        </w:rPr>
+        <w:pPrChange w:id="297" w:author="Eduardo Flach" w:date="2026-10-20T11:58:00Z">
+          <w:pPr/>
+        </w:pPrChange>
+      </w:pPr>
+    </w:p>
+    <w:p>
+      <w:pPr>
+        <w:pStyle w:val="Ttulo1"/>
+        <w:spacing w:before="0"/>
+        <w:jc w:val="both"/>
+        <w:rPr>
+          <w:ins w:id="298" w:author="Eduardo Flach" w:date="2026-10-20T11:04:00Z"/>
+        </w:rPr>
+        <w:pPrChange w:id="299" w:author="Eduardo Flach" w:date="2026-10-20T11:58:00Z">
           <w:pPr>
             <w:pStyle w:val="Ttulo1"/>
             <w:spacing w:before="0"/>
           </w:pPr>
         </w:pPrChange>
       </w:pPr>
-    </w:p>
-    <w:p>
-      <w:pPr>
-        <w:rPr>
-          <w:ins w:id="258" w:author="Eduardo Flach" w:date="2026-10-12T17:15:00Z"/>
-        </w:rPr>
-        <w:pPrChange w:id="259" w:author="Eduardo Flach" w:date="2026-10-12T17:15:00Z">
+      <w:bookmarkStart w:id="300" w:name="_Toc243389960"/>
+      <w:ins w:id="301" w:author="Eduardo Flach" w:date="2026-10-12T17:16:00Z">
+        <w:r>
+          <w:t>Expected Deliverables</w:t>
+        </w:r>
+      </w:ins>
+      <w:bookmarkEnd w:id="300"/>
+    </w:p>
+    <w:p>
+      <w:pPr>
+        <w:jc w:val="both"/>
+        <w:rPr>
+          <w:ins w:id="302" w:author="Eduardo Flach" w:date="2026-10-20T11:36:00Z"/>
+        </w:rPr>
+        <w:pPrChange w:id="303" w:author="Eduardo Flach" w:date="2026-10-20T11:58:00Z">
+          <w:pPr/>
+        </w:pPrChange>
+      </w:pPr>
+      <w:ins w:id="304" w:author="Eduardo Flach" w:date="2026-10-20T11:04:00Z">
+        <w:r>
+          <w:tab/>
+          <w:t>The present work expect</w:t>
+        </w:r>
+      </w:ins>
+      <w:ins w:id="305" w:author="Eduardo Flach" w:date="2026-10-20T11:06:00Z">
+        <w:r>
+          <w:t>s</w:t>
+        </w:r>
+      </w:ins>
+      <w:ins w:id="306" w:author="Eduardo Flach" w:date="2026-10-20T11:04:00Z">
+        <w:r>
+          <w:t xml:space="preserve"> to </w:t>
+        </w:r>
+      </w:ins>
+      <w:ins w:id="307" w:author="Eduardo Flach" w:date="2026-10-20T11:05:00Z">
+        <w:r>
+          <w:t xml:space="preserve">answer the 3 aims and objectives presented before. The </w:t>
+        </w:r>
+      </w:ins>
+      <w:ins w:id="308" w:author="Eduardo Flach" w:date="2026-10-20T11:06:00Z">
+        <w:r>
+          <w:t xml:space="preserve">main goal is to </w:t>
+        </w:r>
+      </w:ins>
+      <w:ins w:id="309" w:author="Eduardo Flach" w:date="2026-10-20T11:35:00Z">
+        <w:r>
+          <w:t>show</w:t>
+        </w:r>
+      </w:ins>
+      <w:ins w:id="310" w:author="Eduardo Flach" w:date="2026-10-20T11:34:00Z">
+        <w:r>
+          <w:t xml:space="preserve"> the owner the number of possibilities that a decent data storage can provide for her business. </w:t>
+        </w:r>
+      </w:ins>
+    </w:p>
+    <w:p>
+      <w:pPr>
+        <w:jc w:val="both"/>
+        <w:rPr>
+          <w:ins w:id="311" w:author="Eduardo Flach" w:date="2026-10-12T17:16:00Z"/>
+        </w:rPr>
+        <w:pPrChange w:id="312" w:author="Eduardo Flach" w:date="2026-10-20T11:58:00Z">
           <w:pPr>
             <w:pStyle w:val="Ttulo1"/>
             <w:spacing w:before="0"/>
           </w:pPr>
         </w:pPrChange>
       </w:pPr>
-    </w:p>
-    <w:p>
-      <w:pPr>
-        <w:rPr>
-          <w:ins w:id="260" w:author="Eduardo Flach" w:date="2026-10-12T17:14:00Z"/>
-        </w:rPr>
-        <w:pPrChange w:id="261" w:author="Eduardo Flach" w:date="2026-10-12T17:15:00Z">
+      <w:ins w:id="313" w:author="Eduardo Flach" w:date="2026-10-20T11:36:00Z">
+        <w:r>
+          <w:lastRenderedPageBreak/>
+          <w:tab/>
+          <w:t>Answer the second and third question is also important for the project. It will have a huge impact o</w:t>
+        </w:r>
+      </w:ins>
+      <w:ins w:id="314" w:author="Eduardo Flach" w:date="2026-10-20T11:37:00Z">
+        <w:r>
+          <w:t>n</w:t>
+        </w:r>
+      </w:ins>
+      <w:ins w:id="315" w:author="Eduardo Flach" w:date="2026-10-20T11:35:00Z">
+        <w:r>
+          <w:t xml:space="preserve"> </w:t>
+        </w:r>
+      </w:ins>
+      <w:ins w:id="316" w:author="Eduardo Flach" w:date="2026-10-20T11:37:00Z">
+        <w:r>
+          <w:t>the business and it can help the owner to put the money more wisely into the business. Doing so, helps the owner to expand the brand fo</w:t>
+        </w:r>
+      </w:ins>
+      <w:ins w:id="317" w:author="Eduardo Flach" w:date="2026-10-20T11:38:00Z">
+        <w:r>
+          <w:t>r other markets.</w:t>
+        </w:r>
+      </w:ins>
+    </w:p>
+    <w:p>
+      <w:pPr>
+        <w:jc w:val="both"/>
+        <w:rPr>
+          <w:ins w:id="318" w:author="Eduardo Flach" w:date="2026-10-12T17:16:00Z"/>
+        </w:rPr>
+        <w:pPrChange w:id="319" w:author="Eduardo Flach" w:date="2026-10-20T11:58:00Z">
+          <w:pPr/>
+        </w:pPrChange>
+      </w:pPr>
+    </w:p>
+    <w:p>
+      <w:pPr>
+        <w:pStyle w:val="Ttulo1"/>
+        <w:spacing w:before="0"/>
+        <w:jc w:val="both"/>
+        <w:rPr>
+          <w:ins w:id="320" w:author="Eduardo Flach" w:date="2026-10-20T11:48:00Z"/>
+        </w:rPr>
+        <w:pPrChange w:id="321" w:author="Eduardo Flach" w:date="2026-10-20T11:58:00Z">
           <w:pPr>
             <w:pStyle w:val="Ttulo1"/>
             <w:spacing w:before="0"/>
           </w:pPr>
         </w:pPrChange>
       </w:pPr>
-    </w:p>
-    <w:p>
-      <w:pPr>
-        <w:rPr>
-          <w:ins w:id="262" w:author="Eduardo Flach" w:date="2026-10-12T17:14:00Z"/>
-        </w:rPr>
-        <w:pPrChange w:id="263" w:author="Eduardo Flach" w:date="2026-10-12T17:14:00Z">
+      <w:bookmarkStart w:id="322" w:name="_Toc243389961"/>
+      <w:ins w:id="323" w:author="Eduardo Flach" w:date="2026-10-12T17:16:00Z">
+        <w:r>
+          <w:t>Project Timeline</w:t>
+        </w:r>
+      </w:ins>
+      <w:bookmarkEnd w:id="322"/>
+    </w:p>
+    <w:p>
+      <w:pPr>
+        <w:jc w:val="both"/>
+        <w:rPr>
+          <w:ins w:id="324" w:author="Eduardo Flach" w:date="2026-10-20T11:51:00Z"/>
+        </w:rPr>
+        <w:pPrChange w:id="325" w:author="Eduardo Flach" w:date="2026-10-20T11:58:00Z">
+          <w:pPr/>
+        </w:pPrChange>
+      </w:pPr>
+      <w:ins w:id="326" w:author="Eduardo Flach" w:date="2026-10-20T11:51:00Z">
+        <w:r>
+          <w:tab/>
+        </w:r>
+      </w:ins>
+      <w:ins w:id="327" w:author="Eduardo Flach" w:date="2026-10-20T11:52:00Z">
+        <w:r>
+          <w:t>The work on the project will occur during two semesters, following the steps and time proposal as below</w:t>
+        </w:r>
+      </w:ins>
+      <w:ins w:id="328" w:author="Eduardo Flach" w:date="2026-10-20T11:53:00Z">
+        <w:r>
+          <w:t>.</w:t>
+        </w:r>
+      </w:ins>
+    </w:p>
+    <w:p>
+      <w:pPr>
+        <w:jc w:val="both"/>
+        <w:rPr>
+          <w:ins w:id="329" w:author="Eduardo Flach" w:date="2026-10-12T17:18:00Z"/>
+        </w:rPr>
+        <w:pPrChange w:id="330" w:author="Eduardo Flach" w:date="2026-10-20T11:58:00Z">
           <w:pPr>
             <w:pStyle w:val="Ttulo1"/>
             <w:spacing w:before="0"/>
           </w:pPr>
         </w:pPrChange>
       </w:pPr>
-    </w:p>
-    <w:p>
-      <w:pPr>
-        <w:rPr>
-          <w:ins w:id="264" w:author="Eduardo Flach" w:date="2026-10-12T17:14:00Z"/>
-        </w:rPr>
-        <w:pPrChange w:id="265" w:author="Eduardo Flach" w:date="2026-10-12T17:14:00Z">
+      <w:ins w:id="331" w:author="Eduardo Flach" w:date="2026-10-20T11:50:00Z">
+        <w:r>
+          <w:drawing>
+            <wp:inline distT="0" distB="0" distL="0" distR="0" wp14:anchorId="2A8BF406" wp14:editId="44DD2230">
+              <wp:extent cx="5731510" cy="1302385"/>
+              <wp:effectExtent l="0" t="0" r="2540" b="0"/>
+              <wp:docPr id="4" name="Imagem 4"/>
+              <wp:cNvGraphicFramePr>
+                <a:graphicFrameLocks xmlns:a="http://schemas.openxmlformats.org/drawingml/2006/main" noChangeAspect="1"/>
+              </wp:cNvGraphicFramePr>
+              <a:graphic xmlns:a="http://schemas.openxmlformats.org/drawingml/2006/main">
+                <a:graphicData uri="http://schemas.openxmlformats.org/drawingml/2006/picture">
+                  <pic:pic xmlns:pic="http://schemas.openxmlformats.org/drawingml/2006/picture">
+                    <pic:nvPicPr>
+                      <pic:cNvPr id="1" name=""/>
+                      <pic:cNvPicPr/>
+                    </pic:nvPicPr>
+                    <pic:blipFill>
+                      <a:blip r:embed="rId16"/>
+                      <a:stretch>
+                        <a:fillRect/>
+                      </a:stretch>
+                    </pic:blipFill>
+                    <pic:spPr>
+                      <a:xfrm>
+                        <a:off x="0" y="0"/>
+                        <a:ext cx="5731510" cy="1302385"/>
+                      </a:xfrm>
+                      <a:prstGeom prst="rect">
+                        <a:avLst/>
+                      </a:prstGeom>
+                    </pic:spPr>
+                  </pic:pic>
+                </a:graphicData>
+              </a:graphic>
+            </wp:inline>
+          </w:drawing>
+        </w:r>
+      </w:ins>
+    </w:p>
+    <w:p>
+      <w:pPr>
+        <w:jc w:val="both"/>
+        <w:rPr>
+          <w:ins w:id="332" w:author="Eduardo Flach" w:date="2026-10-12T17:18:00Z"/>
+        </w:rPr>
+        <w:pPrChange w:id="333" w:author="Eduardo Flach" w:date="2026-10-20T11:58:00Z">
+          <w:pPr/>
+        </w:pPrChange>
+      </w:pPr>
+    </w:p>
+    <w:p>
+      <w:pPr>
+        <w:pStyle w:val="Ttulo1"/>
+        <w:spacing w:before="0"/>
+        <w:jc w:val="both"/>
+        <w:rPr>
+          <w:ins w:id="334" w:author="Eduardo Flach" w:date="2026-10-12T17:18:00Z"/>
+        </w:rPr>
+        <w:pPrChange w:id="335" w:author="Eduardo Flach" w:date="2026-10-20T11:58:00Z">
           <w:pPr>
             <w:pStyle w:val="Ttulo1"/>
             <w:spacing w:before="0"/>
           </w:pPr>
         </w:pPrChange>
       </w:pPr>
-    </w:p>
-    <w:p>
-      <w:pPr>
-        <w:pPrChange w:id="266" w:author="Eduardo Flach" w:date="2026-10-12T17:14:00Z">
+      <w:bookmarkStart w:id="336" w:name="_Toc243389962"/>
+      <w:ins w:id="337" w:author="Eduardo Flach" w:date="2026-10-12T17:18:00Z">
+        <w:r>
+          <w:t>Ethical</w:t>
+        </w:r>
+      </w:ins>
+      <w:ins w:id="338" w:author="Eduardo Flach" w:date="2026-10-12T17:19:00Z">
+        <w:r>
+          <w:t xml:space="preserve"> and Legal Considerations</w:t>
+        </w:r>
+      </w:ins>
+      <w:bookmarkEnd w:id="336"/>
+    </w:p>
+    <w:p>
+      <w:pPr>
+        <w:jc w:val="both"/>
+        <w:rPr>
+          <w:ins w:id="339" w:author="Eduardo Flach" w:date="2026-10-20T11:54:00Z"/>
+        </w:rPr>
+        <w:pPrChange w:id="340" w:author="Eduardo Flach" w:date="2026-10-20T11:58:00Z">
+          <w:pPr/>
+        </w:pPrChange>
+      </w:pPr>
+      <w:ins w:id="341" w:author="Eduardo Flach" w:date="2026-10-20T11:54:00Z">
+        <w:r>
+          <w:tab/>
+        </w:r>
+      </w:ins>
+      <w:ins w:id="342" w:author="Eduardo Flach" w:date="2026-10-20T11:55:00Z">
+        <w:r>
+          <w:t>The owner allows the usage</w:t>
+        </w:r>
+      </w:ins>
+      <w:ins w:id="343" w:author="Eduardo Flach" w:date="2026-10-20T11:56:00Z">
+        <w:r>
+          <w:t xml:space="preserve"> of the data for academic purpose</w:t>
+        </w:r>
+      </w:ins>
+      <w:ins w:id="344" w:author="Eduardo Flach" w:date="2026-10-20T11:57:00Z">
+        <w:r>
+          <w:t xml:space="preserve"> only,</w:t>
+        </w:r>
+      </w:ins>
+      <w:ins w:id="345" w:author="Eduardo Flach" w:date="2026-10-20T11:56:00Z">
+        <w:r>
+          <w:t xml:space="preserve"> inside the CCT </w:t>
+        </w:r>
+      </w:ins>
+      <w:ins w:id="346" w:author="Eduardo Flach" w:date="2026-10-20T11:57:00Z">
+        <w:r>
+          <w:t>environment. Therefore, t</w:t>
+        </w:r>
+        <w:r>
+          <w:t xml:space="preserve">he data should </w:t>
+        </w:r>
+        <w:r>
+          <w:t>not be used outside the CCT environment.</w:t>
+        </w:r>
+      </w:ins>
+    </w:p>
+    <w:p>
+      <w:pPr>
+        <w:ind w:firstLine="720"/>
+        <w:jc w:val="both"/>
+        <w:rPr>
+          <w:ins w:id="347" w:author="Eduardo Flach" w:date="2026-10-12T17:16:00Z"/>
+        </w:rPr>
+        <w:pPrChange w:id="348" w:author="Eduardo Flach" w:date="2026-10-20T11:58:00Z">
           <w:pPr>
             <w:pStyle w:val="Ttulo1"/>
             <w:spacing w:before="0"/>
           </w:pPr>
         </w:pPrChange>
       </w:pPr>
+      <w:ins w:id="349" w:author="Eduardo Flach" w:date="2026-10-20T11:54:00Z">
+        <w:r>
+          <w:t xml:space="preserve">No further consideration regarding the data protection. </w:t>
+        </w:r>
+      </w:ins>
+    </w:p>
+    <w:p>
+      <w:pPr>
+        <w:rPr>
+          <w:ins w:id="350" w:author="Eduardo Flach" w:date="2026-10-12T17:16:00Z"/>
+        </w:rPr>
+        <w:pPrChange w:id="351" w:author="Eduardo Flach" w:date="2026-10-12T17:16:00Z">
+          <w:pPr>
+            <w:pStyle w:val="Ttulo1"/>
+            <w:spacing w:before="0"/>
+          </w:pPr>
+        </w:pPrChange>
+      </w:pPr>
+    </w:p>
+    <w:p>
+      <w:pPr>
+        <w:rPr>
+          <w:ins w:id="352" w:author="Eduardo Flach" w:date="2026-10-12T17:15:00Z"/>
+        </w:rPr>
+        <w:pPrChange w:id="353" w:author="Eduardo Flach" w:date="2026-10-12T17:16:00Z">
+          <w:pPr>
+            <w:pStyle w:val="Ttulo1"/>
+            <w:spacing w:before="0"/>
+          </w:pPr>
+        </w:pPrChange>
+      </w:pPr>
+    </w:p>
+    <w:p>
+      <w:pPr>
+        <w:rPr>
+          <w:ins w:id="354" w:author="Eduardo Flach" w:date="2026-10-12T17:15:00Z"/>
+        </w:rPr>
+        <w:pPrChange w:id="355" w:author="Eduardo Flach" w:date="2026-10-12T17:15:00Z">
+          <w:pPr>
+            <w:pStyle w:val="Ttulo1"/>
+            <w:spacing w:before="0"/>
+          </w:pPr>
+        </w:pPrChange>
+      </w:pPr>
+    </w:p>
+    <w:p>
+      <w:pPr>
+        <w:rPr>
+          <w:ins w:id="356" w:author="Eduardo Flach" w:date="2026-10-12T17:14:00Z"/>
+        </w:rPr>
+        <w:pPrChange w:id="357" w:author="Eduardo Flach" w:date="2026-10-12T17:15:00Z">
+          <w:pPr>
+            <w:pStyle w:val="Ttulo1"/>
+            <w:spacing w:before="0"/>
+          </w:pPr>
+        </w:pPrChange>
+      </w:pPr>
+    </w:p>
+    <w:p>
+      <w:pPr>
+        <w:rPr>
+          <w:ins w:id="358" w:author="Eduardo Flach" w:date="2026-10-12T17:14:00Z"/>
+        </w:rPr>
+        <w:pPrChange w:id="359" w:author="Eduardo Flach" w:date="2026-10-12T17:14:00Z">
+          <w:pPr>
+            <w:pStyle w:val="Ttulo1"/>
+            <w:spacing w:before="0"/>
+          </w:pPr>
+        </w:pPrChange>
+      </w:pPr>
+    </w:p>
+    <w:p>
+      <w:pPr>
+        <w:rPr>
+          <w:ins w:id="360" w:author="Eduardo Flach" w:date="2026-10-12T17:14:00Z"/>
+        </w:rPr>
+        <w:pPrChange w:id="361" w:author="Eduardo Flach" w:date="2026-10-12T17:14:00Z">
+          <w:pPr>
+            <w:pStyle w:val="Ttulo1"/>
+            <w:spacing w:before="0"/>
+          </w:pPr>
+        </w:pPrChange>
+      </w:pPr>
+    </w:p>
+    <w:p>
+      <w:pPr>
+        <w:pPrChange w:id="362" w:author="Eduardo Flach" w:date="2026-10-12T17:14:00Z">
+          <w:pPr>
+            <w:pStyle w:val="Ttulo1"/>
+            <w:spacing w:before="0"/>
+          </w:pPr>
+        </w:pPrChange>
+      </w:pPr>
     </w:p>
     <w:p>
       <w:pPr>
         <w:pStyle w:val="Ttulo2"/>
       </w:pPr>
-      <w:bookmarkStart w:id="267" w:name="_heading=h.1fob9te" w:colFirst="0" w:colLast="0"/>
-      <w:bookmarkEnd w:id="267"/>
-      <w:r>
-        <w:lastRenderedPageBreak/>
+      <w:bookmarkStart w:id="363" w:name="_Toc243389963"/>
+      <w:r>
         <w:t>Chapter 1.1</w:t>
       </w:r>
+      <w:bookmarkEnd w:id="363"/>
     </w:p>
     <w:p>
       <w:pPr>
         <w:pStyle w:val="Ttulo3"/>
       </w:pPr>
-      <w:bookmarkStart w:id="268" w:name="_heading=h.3znysh7" w:colFirst="0" w:colLast="0"/>
-      <w:bookmarkEnd w:id="268"/>
+      <w:bookmarkStart w:id="364" w:name="_Toc243389964"/>
       <w:r>
         <w:t>Chapter 1.1.1.</w:t>
       </w:r>
+      <w:bookmarkEnd w:id="364"/>
     </w:p>
     <w:p/>
     <w:p>
@@ -4870,7 +6304,7 @@
                     <pic:cNvPicPr preferRelativeResize="0"/>
                   </pic:nvPicPr>
                   <pic:blipFill>
-                    <a:blip r:embed="rId15"/>
+                    <a:blip r:embed="rId17"/>
                     <a:srcRect/>
                     <a:stretch>
                       <a:fillRect/>
@@ -4910,6 +6344,7 @@
         <w:rPr>
           <w:color w:val="FF0000"/>
         </w:rPr>
+        <w:lastRenderedPageBreak/>
         <w:t>[NOTE: For the table of contents to function properly, you must use the correct headings for all your chapters and subchapters.</w:t>
       </w:r>
     </w:p>
@@ -5015,11 +6450,11 @@
       <w:pPr>
         <w:pStyle w:val="Ttulo1"/>
       </w:pPr>
-      <w:bookmarkStart w:id="269" w:name="_heading=h.2et92p0" w:colFirst="0" w:colLast="0"/>
-      <w:bookmarkEnd w:id="269"/>
+      <w:bookmarkStart w:id="365" w:name="_Toc243389965"/>
       <w:r>
         <w:t>References</w:t>
       </w:r>
+      <w:bookmarkEnd w:id="365"/>
     </w:p>
     <w:p/>
     <w:p>
@@ -5032,7 +6467,6 @@
         <w:rPr>
           <w:color w:val="FF0000"/>
         </w:rPr>
-        <w:lastRenderedPageBreak/>
         <w:t>Please list all the references you have used in your assignment alphabetically and in the Harvard style. You can find information on how to correctly reference in Harvard at this link: https://library.cct.ie/referencing/harvard</w:t>
       </w:r>
     </w:p>
@@ -5082,57 +6516,59 @@
       <w:pPr>
         <w:pStyle w:val="Ttulo1"/>
       </w:pPr>
-      <w:bookmarkStart w:id="270" w:name="_heading=h.kfkjs3rwl2c1" w:colFirst="0" w:colLast="0"/>
-      <w:bookmarkEnd w:id="270"/>
-      <w:r>
+      <w:bookmarkStart w:id="366" w:name="_heading=h.kfkjs3rwl2c1" w:colFirst="0" w:colLast="0"/>
+      <w:bookmarkStart w:id="367" w:name="_Toc243389966"/>
+      <w:bookmarkEnd w:id="366"/>
+      <w:r>
+        <w:t>Appendix</w:t>
+      </w:r>
+      <w:bookmarkEnd w:id="367"/>
+    </w:p>
+    <w:p/>
+    <w:p>
+      <w:pPr>
+        <w:rPr>
+          <w:color w:val="FF0000"/>
+        </w:rPr>
+      </w:pPr>
+    </w:p>
+    <w:p>
+      <w:pPr>
+        <w:rPr>
+          <w:color w:val="FF0000"/>
+        </w:rPr>
+      </w:pPr>
+      <w:r>
+        <w:rPr>
+          <w:color w:val="FF0000"/>
+        </w:rPr>
+        <w:t xml:space="preserve">If you have used AI tools in your work, you must include screenshots of your requests in the appendix. </w:t>
+      </w:r>
+    </w:p>
+    <w:p>
+      <w:pPr>
+        <w:rPr>
+          <w:color w:val="FF0000"/>
+        </w:rPr>
+      </w:pPr>
+      <w:r>
+        <w:rPr>
+          <w:color w:val="FF0000"/>
+        </w:rPr>
+        <w:t>The appendix serves as a repository for additional or supplementary information that is deemed too extensive or detailed for integration into the main body of the text. This supplementary content can encompass data tables, charts, graphs, questionnaires, or any other supporting materials that contribute to a comprehensive understanding of the research.</w:t>
+      </w:r>
+    </w:p>
+    <w:p>
+      <w:pPr>
+        <w:rPr>
+          <w:color w:val="FF0000"/>
+        </w:rPr>
+      </w:pPr>
+      <w:r>
+        <w:rPr>
+          <w:color w:val="FF0000"/>
+        </w:rPr>
         <w:lastRenderedPageBreak/>
-        <w:t>Appendix</w:t>
-      </w:r>
-    </w:p>
-    <w:p/>
-    <w:p>
-      <w:pPr>
-        <w:rPr>
-          <w:color w:val="FF0000"/>
-        </w:rPr>
-      </w:pPr>
-    </w:p>
-    <w:p>
-      <w:pPr>
-        <w:rPr>
-          <w:color w:val="FF0000"/>
-        </w:rPr>
-      </w:pPr>
-      <w:r>
-        <w:rPr>
-          <w:color w:val="FF0000"/>
-        </w:rPr>
-        <w:t xml:space="preserve">If you have used AI tools in your work, you must include screenshots of your requests in the appendix. </w:t>
-      </w:r>
-    </w:p>
-    <w:p>
-      <w:pPr>
-        <w:rPr>
-          <w:color w:val="FF0000"/>
-        </w:rPr>
-      </w:pPr>
-      <w:r>
-        <w:rPr>
-          <w:color w:val="FF0000"/>
-        </w:rPr>
-        <w:t>The appendix serves as a repository for additional or supplementary information that is deemed too extensive or detailed for integration into the main body of the text. This supplementary content can encompass data tables, charts, graphs, questionnaires, or any other supporting materials that contribute to a comprehensive understanding of the research.</w:t>
-      </w:r>
-    </w:p>
-    <w:p>
-      <w:pPr>
-        <w:rPr>
-          <w:color w:val="FF0000"/>
-        </w:rPr>
-      </w:pPr>
-      <w:r>
-        <w:rPr>
-          <w:color w:val="FF0000"/>
-        </w:rPr>
         <w:t>If you haven't used AI tools and there's no need for supplementary data, you can remove the appendix section entirely.</w:t>
       </w:r>
     </w:p>
@@ -5145,7 +6581,7 @@
     </w:p>
     <w:p/>
     <w:sectPr>
-      <w:footerReference w:type="default" r:id="rId16"/>
+      <w:footerReference w:type="default" r:id="rId18"/>
       <w:pgSz w:w="11906" w:h="16838"/>
       <w:pgMar w:top="1440" w:right="1440" w:bottom="1440" w:left="1440" w:header="708" w:footer="708" w:gutter="0"/>
       <w:pgNumType w:start="1"/>
@@ -7562,29 +8998,6 @@
 </file>
 
 <file path=customXml/item2.xml><?xml version="1.0" encoding="utf-8"?>
-<?mso-contentType ?>
-<FormTemplates xmlns="http://schemas.microsoft.com/sharepoint/v3/contenttype/forms">
-  <Display>DocumentLibraryForm</Display>
-  <Edit>DocumentLibraryForm</Edit>
-  <New>DocumentLibraryForm</New>
-</FormTemplates>
-</file>
-
-<file path=customXml/item3.xml><?xml version="1.0" encoding="utf-8"?>
-<p:properties xmlns:p="http://schemas.microsoft.com/office/2006/metadata/properties" xmlns:xsi="http://www.w3.org/2001/XMLSchema-instance" xmlns:pc="http://schemas.microsoft.com/office/infopath/2007/PartnerControls">
-  <documentManagement>
-    <_activity xmlns="b16a9495-4dfd-42d3-807b-98cb11f03b43" xsi:nil="true"/>
-  </documentManagement>
-</p:properties>
-</file>
-
-<file path=customXml/item4.xml><?xml version="1.0" encoding="utf-8"?>
-<go:gDocsCustomXmlDataStorage xmlns:go="http://customooxmlschemas.google.com/" xmlns:r="http://schemas.openxmlformats.org/officeDocument/2006/relationships" uri="GoogleDocsCustomDataVersion2">
-  <go:docsCustomData xmlns:go="http://customooxmlschemas.google.com/" roundtripDataSignature="AMtx7miehlgh2pzFvkmpnhkVaeODs3Wnuw==">CgMxLjAyCGguZ2pkZ3hzMgloLjMwajB6bGwyCWguMWZvYjl0ZTIJaC4zem55c2g3MgloLjJldDkycDAyDmgua2ZranMzcndsMmMxOAByITF6bEVRVXYyWkdtTjZWemdfYk5uaGpmb0x1c2hhYUo3dw==</go:docsCustomData>
-</go:gDocsCustomXmlDataStorage>
-</file>
-
-<file path=customXml/item5.xml><?xml version="1.0" encoding="utf-8"?>
 <ct:contentTypeSchema xmlns:ct="http://schemas.microsoft.com/office/2006/metadata/contentType" xmlns:ma="http://schemas.microsoft.com/office/2006/metadata/properties/metaAttributes" ct:_="" ma:_="" ma:contentTypeName="Document" ma:contentTypeID="0x01010091CA7052A48FB44E8BAE44044031FC77" ma:contentTypeVersion="5" ma:contentTypeDescription="Create a new document." ma:contentTypeScope="" ma:versionID="72110da391d7bf7bbbd9879cda66318c">
   <xsd:schema xmlns:xsd="http://www.w3.org/2001/XMLSchema" xmlns:xs="http://www.w3.org/2001/XMLSchema" xmlns:p="http://schemas.microsoft.com/office/2006/metadata/properties" xmlns:ns3="b16a9495-4dfd-42d3-807b-98cb11f03b43" targetNamespace="http://schemas.microsoft.com/office/2006/metadata/properties" ma:root="true" ma:fieldsID="65d4c4ab10123b5e2192ffab3149626d" ns3:_="">
     <xsd:import namespace="b16a9495-4dfd-42d3-807b-98cb11f03b43"/>
@@ -7734,6 +9147,29 @@
 </ct:contentTypeSchema>
 </file>
 
+<file path=customXml/item3.xml><?xml version="1.0" encoding="utf-8"?>
+<go:gDocsCustomXmlDataStorage xmlns:go="http://customooxmlschemas.google.com/" xmlns:r="http://schemas.openxmlformats.org/officeDocument/2006/relationships" uri="GoogleDocsCustomDataVersion2">
+  <go:docsCustomData xmlns:go="http://customooxmlschemas.google.com/" roundtripDataSignature="AMtx7miehlgh2pzFvkmpnhkVaeODs3Wnuw==">CgMxLjAyCGguZ2pkZ3hzMgloLjMwajB6bGwyCWguMWZvYjl0ZTIJaC4zem55c2g3MgloLjJldDkycDAyDmgua2ZranMzcndsMmMxOAByITF6bEVRVXYyWkdtTjZWemdfYk5uaGpmb0x1c2hhYUo3dw==</go:docsCustomData>
+</go:gDocsCustomXmlDataStorage>
+</file>
+
+<file path=customXml/item4.xml><?xml version="1.0" encoding="utf-8"?>
+<p:properties xmlns:p="http://schemas.microsoft.com/office/2006/metadata/properties" xmlns:xsi="http://www.w3.org/2001/XMLSchema-instance" xmlns:pc="http://schemas.microsoft.com/office/infopath/2007/PartnerControls">
+  <documentManagement>
+    <_activity xmlns="b16a9495-4dfd-42d3-807b-98cb11f03b43" xsi:nil="true"/>
+  </documentManagement>
+</p:properties>
+</file>
+
+<file path=customXml/item5.xml><?xml version="1.0" encoding="utf-8"?>
+<?mso-contentType ?>
+<FormTemplates xmlns="http://schemas.microsoft.com/sharepoint/v3/contenttype/forms">
+  <Display>DocumentLibraryForm</Display>
+  <Edit>DocumentLibraryForm</Edit>
+  <New>DocumentLibraryForm</New>
+</FormTemplates>
+</file>
+
 <file path=customXml/itemProps1.xml><?xml version="1.0" encoding="utf-8"?>
 <ds:datastoreItem xmlns:ds="http://schemas.openxmlformats.org/officeDocument/2006/customXml" ds:itemID="{A5C61161-19E4-4D42-A5DA-EC591AFE0A7D}">
   <ds:schemaRefs>
@@ -7743,33 +9179,6 @@
 </file>
 
 <file path=customXml/itemProps2.xml><?xml version="1.0" encoding="utf-8"?>
-<ds:datastoreItem xmlns:ds="http://schemas.openxmlformats.org/officeDocument/2006/customXml" ds:itemID="{AD64260C-1345-4C21-A804-B9FBE7B91489}">
-  <ds:schemaRefs>
-    <ds:schemaRef ds:uri="http://schemas.microsoft.com/sharepoint/v3/contenttype/forms"/>
-  </ds:schemaRefs>
-</ds:datastoreItem>
-</file>
-
-<file path=customXml/itemProps3.xml><?xml version="1.0" encoding="utf-8"?>
-<ds:datastoreItem xmlns:ds="http://schemas.openxmlformats.org/officeDocument/2006/customXml" ds:itemID="{D51EB97A-8C7A-4EE1-A3AD-E57FDBFA6BEE}">
-  <ds:schemaRefs>
-    <ds:schemaRef ds:uri="http://schemas.microsoft.com/office/2006/metadata/properties"/>
-    <ds:schemaRef ds:uri="http://schemas.microsoft.com/office/infopath/2007/PartnerControls"/>
-    <ds:schemaRef ds:uri="b16a9495-4dfd-42d3-807b-98cb11f03b43"/>
-  </ds:schemaRefs>
-</ds:datastoreItem>
-</file>
-
-<file path=customXml/itemProps4.xml><?xml version="1.0" encoding="utf-8"?>
-<ds:datastoreItem xmlns:ds="http://schemas.openxmlformats.org/officeDocument/2006/customXml" ds:itemID="{11111111-1234-1234-1234-123412341234}">
-  <ds:schemaRefs>
-    <ds:schemaRef ds:uri="http://customooxmlschemas.google.com/"/>
-    <ds:schemaRef ds:uri="http://schemas.openxmlformats.org/officeDocument/2006/relationships"/>
-  </ds:schemaRefs>
-</ds:datastoreItem>
-</file>
-
-<file path=customXml/itemProps5.xml><?xml version="1.0" encoding="utf-8"?>
 <ds:datastoreItem xmlns:ds="http://schemas.openxmlformats.org/officeDocument/2006/customXml" ds:itemID="{1CD39011-2B34-4226-8638-59B13D86301D}">
   <ds:schemaRefs>
     <ds:schemaRef ds:uri="http://schemas.microsoft.com/office/2006/metadata/contentType"/>
@@ -7785,4 +9194,31 @@
     <ds:schemaRef ds:uri="http://schemas.microsoft.com/internal/obd"/>
   </ds:schemaRefs>
 </ds:datastoreItem>
+</file>
+
+<file path=customXml/itemProps3.xml><?xml version="1.0" encoding="utf-8"?>
+<ds:datastoreItem xmlns:ds="http://schemas.openxmlformats.org/officeDocument/2006/customXml" ds:itemID="{11111111-1234-1234-1234-123412341234}">
+  <ds:schemaRefs>
+    <ds:schemaRef ds:uri="http://customooxmlschemas.google.com/"/>
+    <ds:schemaRef ds:uri="http://schemas.openxmlformats.org/officeDocument/2006/relationships"/>
+  </ds:schemaRefs>
+</ds:datastoreItem>
+</file>
+
+<file path=customXml/itemProps4.xml><?xml version="1.0" encoding="utf-8"?>
+<ds:datastoreItem xmlns:ds="http://schemas.openxmlformats.org/officeDocument/2006/customXml" ds:itemID="{D51EB97A-8C7A-4EE1-A3AD-E57FDBFA6BEE}">
+  <ds:schemaRefs>
+    <ds:schemaRef ds:uri="http://schemas.microsoft.com/office/2006/metadata/properties"/>
+    <ds:schemaRef ds:uri="http://schemas.microsoft.com/office/infopath/2007/PartnerControls"/>
+    <ds:schemaRef ds:uri="b16a9495-4dfd-42d3-807b-98cb11f03b43"/>
+  </ds:schemaRefs>
+</ds:datastoreItem>
+</file>
+
+<file path=customXml/itemProps5.xml><?xml version="1.0" encoding="utf-8"?>
+<ds:datastoreItem xmlns:ds="http://schemas.openxmlformats.org/officeDocument/2006/customXml" ds:itemID="{AD64260C-1345-4C21-A804-B9FBE7B91489}">
+  <ds:schemaRefs>
+    <ds:schemaRef ds:uri="http://schemas.microsoft.com/sharepoint/v3/contenttype/forms"/>
+  </ds:schemaRefs>
+</ds:datastoreItem>
 </file>
</xml_diff>

<commit_message>
21.10.26 - Working on the references
</commit_message>
<xml_diff>
--- a/CA1-Strategic Thinking_with_AI_declaration.docx
+++ b/CA1-Strategic Thinking_with_AI_declaration.docx
@@ -3490,6 +3490,11 @@
     <w:sdt>
       <w:sdtPr>
         <w:rPr>
+          <w:rFonts w:ascii="Calibri" w:eastAsia="Calibri" w:hAnsi="Calibri" w:cs="Calibri"/>
+          <w:color w:val="auto"/>
+          <w:spacing w:val="0"/>
+          <w:sz w:val="22"/>
+          <w:szCs w:val="22"/>
           <w:lang w:val="pt-BR"/>
         </w:rPr>
         <w:id w:val="970633227"/>
@@ -3500,13 +3505,8 @@
       </w:sdtPr>
       <w:sdtEndPr>
         <w:rPr>
-          <w:rFonts w:ascii="Calibri" w:eastAsia="Calibri" w:hAnsi="Calibri" w:cs="Calibri"/>
           <w:b/>
           <w:bCs/>
-          <w:color w:val="auto"/>
-          <w:spacing w:val="0"/>
-          <w:sz w:val="22"/>
-          <w:szCs w:val="22"/>
         </w:rPr>
       </w:sdtEndPr>
       <w:sdtContent>
@@ -4749,7 +4749,7 @@
       <w:pPr>
         <w:jc w:val="both"/>
         <w:rPr>
-          <w:ins w:id="111" w:author="Eduardo Flach" w:date="2026-10-09T11:31:00Z"/>
+          <w:ins w:id="111" w:author="Eduardo Flach" w:date="2026-10-21T20:18:00Z"/>
         </w:rPr>
       </w:pPr>
       <w:ins w:id="112" w:author="Eduardo Flach" w:date="2026-10-09T11:27:00Z">
@@ -4802,30 +4802,234 @@
     <w:p>
       <w:pPr>
         <w:jc w:val="both"/>
-        <w:pPrChange w:id="119" w:author="Eduardo Flach" w:date="2026-10-20T11:58:00Z">
+        <w:rPr>
+          <w:ins w:id="119" w:author="Eduardo Flach" w:date="2026-10-21T21:06:00Z"/>
+        </w:rPr>
+      </w:pPr>
+      <w:ins w:id="120" w:author="Eduardo Flach" w:date="2026-10-21T20:18:00Z">
+        <w:r>
+          <w:tab/>
+        </w:r>
+      </w:ins>
+      <w:ins w:id="121" w:author="Eduardo Flach" w:date="2026-10-21T20:24:00Z">
+        <w:r>
+          <w:t xml:space="preserve">According to </w:t>
+        </w:r>
+      </w:ins>
+      <w:customXmlInsRangeStart w:id="122" w:author="Eduardo Flach" w:date="2026-10-21T20:24:00Z"/>
+      <w:sdt>
+        <w:sdtPr>
+          <w:id w:val="-250201113"/>
+          <w:citation/>
+        </w:sdtPr>
+        <w:sdtContent>
+          <w:customXmlInsRangeEnd w:id="122"/>
+          <w:ins w:id="123" w:author="Eduardo Flach" w:date="2026-10-21T20:24:00Z">
+            <w:r>
+              <w:fldChar w:fldCharType="begin"/>
+            </w:r>
+            <w:r>
+              <w:rPr>
+                <w:rPrChange w:id="124" w:author="Eduardo Flach" w:date="2026-10-21T20:26:00Z">
+                  <w:rPr>
+                    <w:lang w:val="pt-BR"/>
+                  </w:rPr>
+                </w:rPrChange>
+              </w:rPr>
+              <w:instrText xml:space="preserve"> CITATION Pat18 \l 1046 </w:instrText>
+            </w:r>
+          </w:ins>
+          <w:r>
+            <w:fldChar w:fldCharType="separate"/>
+          </w:r>
+          <w:r>
+            <w:rPr>
+              <w:noProof/>
+            </w:rPr>
+            <w:t>(Patrick ULRICH, 2018)</w:t>
+          </w:r>
+          <w:ins w:id="125" w:author="Eduardo Flach" w:date="2026-10-21T20:24:00Z">
+            <w:r>
+              <w:fldChar w:fldCharType="end"/>
+            </w:r>
+          </w:ins>
+          <w:customXmlInsRangeStart w:id="126" w:author="Eduardo Flach" w:date="2026-10-21T20:24:00Z"/>
+        </w:sdtContent>
+      </w:sdt>
+      <w:customXmlInsRangeEnd w:id="126"/>
+      <w:ins w:id="127" w:author="Eduardo Flach" w:date="2026-10-21T20:26:00Z">
+        <w:r>
+          <w:t xml:space="preserve"> a structured data is an important tool for an effective sales analysis</w:t>
+        </w:r>
+      </w:ins>
+      <w:ins w:id="128" w:author="Eduardo Flach" w:date="2026-10-21T20:28:00Z">
+        <w:r>
+          <w:t xml:space="preserve">, </w:t>
+        </w:r>
+      </w:ins>
+      <w:ins w:id="129" w:author="Eduardo Flach" w:date="2026-10-21T20:29:00Z">
+        <w:r>
+          <w:t>especially for a small business environment</w:t>
+        </w:r>
+      </w:ins>
+      <w:ins w:id="130" w:author="Eduardo Flach" w:date="2026-10-21T20:27:00Z">
+        <w:r>
+          <w:t>. Not only the data itself but how it is structured to support the decision making.</w:t>
+        </w:r>
+      </w:ins>
+      <w:ins w:id="131" w:author="Eduardo Flach" w:date="2026-10-21T20:28:00Z">
+        <w:r>
+          <w:t xml:space="preserve"> This approach is important to </w:t>
+        </w:r>
+        <w:r>
+          <w:t>provide the most reliable informa</w:t>
+        </w:r>
+      </w:ins>
+      <w:ins w:id="132" w:author="Eduardo Flach" w:date="2026-10-21T20:29:00Z">
+        <w:r>
+          <w:t>tion for the business.</w:t>
+        </w:r>
+      </w:ins>
+    </w:p>
+    <w:p>
+      <w:pPr>
+        <w:jc w:val="both"/>
+        <w:rPr>
+          <w:ins w:id="133" w:author="Eduardo Flach" w:date="2026-10-09T11:31:00Z"/>
+        </w:rPr>
+      </w:pPr>
+      <w:ins w:id="134" w:author="Eduardo Flach" w:date="2026-10-21T21:06:00Z">
+        <w:r>
+          <w:tab/>
+        </w:r>
+      </w:ins>
+      <w:ins w:id="135" w:author="Eduardo Flach" w:date="2026-10-21T21:07:00Z">
+        <w:r>
+          <w:t xml:space="preserve">The data </w:t>
+        </w:r>
+        <w:proofErr w:type="spellStart"/>
+        <w:r>
+          <w:t>can not</w:t>
+        </w:r>
+        <w:proofErr w:type="spellEnd"/>
+        <w:r>
+          <w:t xml:space="preserve"> be just structured</w:t>
+        </w:r>
+      </w:ins>
+      <w:ins w:id="136" w:author="Eduardo Flach" w:date="2026-10-21T21:08:00Z">
+        <w:r>
+          <w:t xml:space="preserve">, it has to be accurate. An inaccurate data </w:t>
+        </w:r>
+      </w:ins>
+      <w:ins w:id="137" w:author="Eduardo Flach" w:date="2026-10-21T21:10:00Z">
+        <w:r>
+          <w:t>provides</w:t>
+        </w:r>
+      </w:ins>
+      <w:ins w:id="138" w:author="Eduardo Flach" w:date="2026-10-21T21:08:00Z">
+        <w:r>
+          <w:t xml:space="preserve"> a wro</w:t>
+        </w:r>
+      </w:ins>
+      <w:ins w:id="139" w:author="Eduardo Flach" w:date="2026-10-21T21:09:00Z">
+        <w:r>
+          <w:t>ng understanding of business operations. Therefore, when a company uses an inaccurate data, it might</w:t>
+        </w:r>
+      </w:ins>
+      <w:ins w:id="140" w:author="Eduardo Flach" w:date="2026-10-21T21:10:00Z">
+        <w:r>
+          <w:t xml:space="preserve"> lead into a wrong decision making</w:t>
+        </w:r>
+      </w:ins>
+      <w:ins w:id="141" w:author="Eduardo Flach" w:date="2026-10-21T21:08:00Z">
+        <w:r>
+          <w:t xml:space="preserve"> </w:t>
+        </w:r>
+      </w:ins>
+      <w:ins w:id="142" w:author="Eduardo Flach" w:date="2026-10-21T21:10:00Z">
+        <w:r>
+          <w:t>based on that</w:t>
+        </w:r>
+      </w:ins>
+      <w:ins w:id="143" w:author="Eduardo Flach" w:date="2026-10-21T21:08:00Z">
+        <w:r>
+          <w:t xml:space="preserve"> </w:t>
+        </w:r>
+      </w:ins>
+      <w:customXmlInsRangeStart w:id="144" w:author="Eduardo Flach" w:date="2026-10-21T21:06:00Z"/>
+      <w:sdt>
+        <w:sdtPr>
+          <w:id w:val="-180824660"/>
+          <w:citation/>
+        </w:sdtPr>
+        <w:sdtContent>
+          <w:customXmlInsRangeEnd w:id="144"/>
+          <w:ins w:id="145" w:author="Eduardo Flach" w:date="2026-10-21T21:06:00Z">
+            <w:r>
+              <w:fldChar w:fldCharType="begin"/>
+            </w:r>
+            <w:r>
+              <w:rPr>
+                <w:rPrChange w:id="146" w:author="Eduardo Flach" w:date="2026-10-21T21:07:00Z">
+                  <w:rPr>
+                    <w:lang w:val="pt-BR"/>
+                  </w:rPr>
+                </w:rPrChange>
+              </w:rPr>
+              <w:instrText xml:space="preserve"> CITATION Gün19 \l 1046 </w:instrText>
+            </w:r>
+          </w:ins>
+          <w:r>
+            <w:fldChar w:fldCharType="separate"/>
+          </w:r>
+          <w:r>
+            <w:rPr>
+              <w:noProof/>
+            </w:rPr>
+            <w:t>(Günther, 2019)</w:t>
+          </w:r>
+          <w:ins w:id="147" w:author="Eduardo Flach" w:date="2026-10-21T21:06:00Z">
+            <w:r>
+              <w:fldChar w:fldCharType="end"/>
+            </w:r>
+          </w:ins>
+          <w:customXmlInsRangeStart w:id="148" w:author="Eduardo Flach" w:date="2026-10-21T21:06:00Z"/>
+        </w:sdtContent>
+      </w:sdt>
+      <w:customXmlInsRangeEnd w:id="148"/>
+      <w:ins w:id="149" w:author="Eduardo Flach" w:date="2026-10-21T21:10:00Z">
+        <w:r>
+          <w:t>.</w:t>
+        </w:r>
+      </w:ins>
+    </w:p>
+    <w:p>
+      <w:pPr>
+        <w:jc w:val="both"/>
+        <w:pPrChange w:id="150" w:author="Eduardo Flach" w:date="2026-10-20T11:58:00Z">
           <w:pPr>
             <w:pStyle w:val="Ttulo1"/>
             <w:spacing w:after="0"/>
           </w:pPr>
         </w:pPrChange>
       </w:pPr>
-      <w:ins w:id="120" w:author="Eduardo Flach" w:date="2026-10-09T11:31:00Z">
+      <w:ins w:id="151" w:author="Eduardo Flach" w:date="2026-10-09T11:31:00Z">
         <w:r>
           <w:tab/>
           <w:t xml:space="preserve">Working on this data will provide me the possibility to </w:t>
         </w:r>
       </w:ins>
-      <w:ins w:id="121" w:author="Eduardo Flach" w:date="2026-10-09T11:32:00Z">
+      <w:ins w:id="152" w:author="Eduardo Flach" w:date="2026-10-09T11:32:00Z">
         <w:r>
           <w:t>use all the tools that we are studying in this course. A strong ef</w:t>
         </w:r>
       </w:ins>
-      <w:ins w:id="122" w:author="Eduardo Flach" w:date="2026-10-09T11:33:00Z">
+      <w:ins w:id="153" w:author="Eduardo Flach" w:date="2026-10-09T11:33:00Z">
         <w:r>
           <w:t>fort on Data preparation, Machine learning to answer some questions regarding the business and data vi</w:t>
         </w:r>
       </w:ins>
-      <w:ins w:id="123" w:author="Eduardo Flach" w:date="2026-10-09T11:34:00Z">
+      <w:ins w:id="154" w:author="Eduardo Flach" w:date="2026-10-09T11:34:00Z">
         <w:r>
           <w:t>sualization.</w:t>
         </w:r>
@@ -4837,28 +5041,28 @@
         <w:spacing w:before="0"/>
         <w:jc w:val="both"/>
         <w:rPr>
-          <w:ins w:id="124" w:author="Eduardo Flach" w:date="2026-10-12T17:25:00Z"/>
-        </w:rPr>
-        <w:pPrChange w:id="125" w:author="Eduardo Flach" w:date="2026-10-20T11:58:00Z">
+          <w:ins w:id="155" w:author="Eduardo Flach" w:date="2026-10-12T17:25:00Z"/>
+        </w:rPr>
+        <w:pPrChange w:id="156" w:author="Eduardo Flach" w:date="2026-10-20T11:58:00Z">
           <w:pPr>
             <w:pStyle w:val="Ttulo1"/>
             <w:spacing w:before="0"/>
           </w:pPr>
         </w:pPrChange>
       </w:pPr>
-      <w:bookmarkStart w:id="126" w:name="_Toc243389955"/>
-      <w:ins w:id="127" w:author="Eduardo Flach" w:date="2026-10-12T17:14:00Z">
+      <w:bookmarkStart w:id="157" w:name="_Toc243389955"/>
+      <w:ins w:id="158" w:author="Eduardo Flach" w:date="2026-10-12T17:14:00Z">
         <w:r>
           <w:t>Problem Definition</w:t>
         </w:r>
       </w:ins>
-      <w:bookmarkEnd w:id="126"/>
-      <w:del w:id="128" w:author="Eduardo Flach" w:date="2026-10-12T17:14:00Z">
+      <w:bookmarkEnd w:id="157"/>
+      <w:del w:id="159" w:author="Eduardo Flach" w:date="2026-10-12T17:14:00Z">
         <w:r>
           <w:delText>C</w:delText>
         </w:r>
       </w:del>
-      <w:del w:id="129" w:author="Eduardo Flach" w:date="2026-10-12T17:13:00Z">
+      <w:del w:id="160" w:author="Eduardo Flach" w:date="2026-10-12T17:13:00Z">
         <w:r>
           <w:delText>hapter 1</w:delText>
         </w:r>
@@ -4869,55 +5073,55 @@
         <w:ind w:firstLine="720"/>
         <w:jc w:val="both"/>
         <w:rPr>
-          <w:ins w:id="130" w:author="Eduardo Flach" w:date="2026-10-12T17:27:00Z"/>
-        </w:rPr>
-        <w:pPrChange w:id="131" w:author="Eduardo Flach" w:date="2026-10-20T11:58:00Z">
+          <w:ins w:id="161" w:author="Eduardo Flach" w:date="2026-10-12T17:27:00Z"/>
+        </w:rPr>
+        <w:pPrChange w:id="162" w:author="Eduardo Flach" w:date="2026-10-20T11:58:00Z">
           <w:pPr>
             <w:ind w:firstLine="720"/>
           </w:pPr>
         </w:pPrChange>
       </w:pPr>
-      <w:ins w:id="132" w:author="Eduardo Flach" w:date="2026-10-12T17:27:00Z">
+      <w:ins w:id="163" w:author="Eduardo Flach" w:date="2026-10-12T17:27:00Z">
         <w:r>
           <w:t xml:space="preserve">Since the beginning of the company </w:t>
         </w:r>
       </w:ins>
-      <w:ins w:id="133" w:author="Eduardo Flach" w:date="2026-10-12T17:29:00Z">
+      <w:ins w:id="164" w:author="Eduardo Flach" w:date="2026-10-12T17:29:00Z">
         <w:r>
           <w:t>the prices were increased according to the development of the perceptive quality of the product</w:t>
         </w:r>
       </w:ins>
-      <w:ins w:id="134" w:author="Eduardo Flach" w:date="2026-10-12T17:31:00Z">
+      <w:ins w:id="165" w:author="Eduardo Flach" w:date="2026-10-12T17:31:00Z">
         <w:r>
           <w:t xml:space="preserve"> by the owners and the clients feedbacks</w:t>
         </w:r>
       </w:ins>
-      <w:ins w:id="135" w:author="Eduardo Flach" w:date="2026-10-12T17:29:00Z">
+      <w:ins w:id="166" w:author="Eduardo Flach" w:date="2026-10-12T17:29:00Z">
         <w:r>
           <w:t xml:space="preserve">. </w:t>
         </w:r>
       </w:ins>
-      <w:ins w:id="136" w:author="Eduardo Flach" w:date="2026-10-12T17:34:00Z">
+      <w:ins w:id="167" w:author="Eduardo Flach" w:date="2026-10-12T17:34:00Z">
         <w:r>
           <w:t>Once the owners</w:t>
         </w:r>
       </w:ins>
-      <w:ins w:id="137" w:author="Eduardo Flach" w:date="2026-10-12T17:35:00Z">
+      <w:ins w:id="168" w:author="Eduardo Flach" w:date="2026-10-12T17:35:00Z">
         <w:r>
           <w:t xml:space="preserve"> started to make the products from zero, the </w:t>
         </w:r>
       </w:ins>
-      <w:ins w:id="138" w:author="Eduardo Flach" w:date="2026-10-12T17:36:00Z">
+      <w:ins w:id="169" w:author="Eduardo Flach" w:date="2026-10-12T17:36:00Z">
         <w:r>
           <w:t>quality of each one improved during time</w:t>
         </w:r>
       </w:ins>
-      <w:ins w:id="139" w:author="Eduardo Flach" w:date="2026-10-12T17:37:00Z">
+      <w:ins w:id="170" w:author="Eduardo Flach" w:date="2026-10-12T17:37:00Z">
         <w:r>
           <w:t xml:space="preserve"> and </w:t>
         </w:r>
       </w:ins>
-      <w:ins w:id="140" w:author="Eduardo Flach" w:date="2026-10-12T17:38:00Z">
+      <w:ins w:id="171" w:author="Eduardo Flach" w:date="2026-10-12T17:38:00Z">
         <w:r>
           <w:t>therefore the price.</w:t>
         </w:r>
@@ -4928,60 +5132,62 @@
         <w:ind w:firstLine="720"/>
         <w:jc w:val="both"/>
         <w:rPr>
-          <w:ins w:id="141" w:author="Eduardo Flach" w:date="2026-10-16T14:53:00Z"/>
-        </w:rPr>
-      </w:pPr>
-      <w:ins w:id="142" w:author="Eduardo Flach" w:date="2026-10-12T17:25:00Z">
+          <w:ins w:id="172" w:author="Eduardo Flach" w:date="2026-10-21T21:19:00Z"/>
+          <w:b/>
+          <w:bCs/>
+        </w:rPr>
+      </w:pPr>
+      <w:ins w:id="173" w:author="Eduardo Flach" w:date="2026-10-12T17:25:00Z">
         <w:r>
           <w:t xml:space="preserve">The company </w:t>
         </w:r>
       </w:ins>
-      <w:ins w:id="143" w:author="Eduardo Flach" w:date="2026-10-12T17:38:00Z">
+      <w:ins w:id="174" w:author="Eduardo Flach" w:date="2026-10-12T17:38:00Z">
         <w:r>
           <w:t xml:space="preserve">wants to </w:t>
         </w:r>
       </w:ins>
-      <w:ins w:id="144" w:author="Eduardo Flach" w:date="2026-10-12T17:39:00Z">
+      <w:ins w:id="175" w:author="Eduardo Flach" w:date="2026-10-12T17:39:00Z">
         <w:r>
           <w:t xml:space="preserve">position the brand for </w:t>
         </w:r>
       </w:ins>
-      <w:ins w:id="145" w:author="Eduardo Flach" w:date="2026-10-16T14:46:00Z">
+      <w:ins w:id="176" w:author="Eduardo Flach" w:date="2026-10-16T14:46:00Z">
         <w:r>
           <w:t>premium market</w:t>
         </w:r>
       </w:ins>
-      <w:ins w:id="146" w:author="Eduardo Flach" w:date="2026-10-12T17:40:00Z">
+      <w:ins w:id="177" w:author="Eduardo Flach" w:date="2026-10-12T17:40:00Z">
         <w:r>
           <w:t xml:space="preserve"> and improve the average order value (AOV) </w:t>
         </w:r>
       </w:ins>
-      <w:ins w:id="147" w:author="Eduardo Flach" w:date="2026-10-12T17:41:00Z">
+      <w:ins w:id="178" w:author="Eduardo Flach" w:date="2026-10-12T17:41:00Z">
         <w:r>
           <w:t>in order to improve the margin.</w:t>
         </w:r>
       </w:ins>
-      <w:ins w:id="148" w:author="Eduardo Flach" w:date="2026-10-16T14:35:00Z">
+      <w:ins w:id="179" w:author="Eduardo Flach" w:date="2026-10-16T14:35:00Z">
         <w:r>
           <w:t xml:space="preserve"> </w:t>
         </w:r>
       </w:ins>
-      <w:ins w:id="149" w:author="Eduardo Flach" w:date="2026-10-16T14:48:00Z">
+      <w:ins w:id="180" w:author="Eduardo Flach" w:date="2026-10-16T14:48:00Z">
         <w:r>
           <w:t xml:space="preserve">As most of the potential leads came from marketings campaigns, </w:t>
         </w:r>
       </w:ins>
-      <w:ins w:id="150" w:author="Eduardo Flach" w:date="2026-10-16T14:49:00Z">
+      <w:ins w:id="181" w:author="Eduardo Flach" w:date="2026-10-16T14:49:00Z">
         <w:r>
           <w:t>the company needs do investments on Instagram Ads. However, today the compa</w:t>
         </w:r>
       </w:ins>
-      <w:ins w:id="151" w:author="Eduardo Flach" w:date="2026-10-16T14:50:00Z">
+      <w:ins w:id="182" w:author="Eduardo Flach" w:date="2026-10-16T14:50:00Z">
         <w:r>
           <w:t xml:space="preserve">ny doesn’t have the data to determinate the target </w:t>
         </w:r>
       </w:ins>
-      <w:ins w:id="152" w:author="Eduardo Flach" w:date="2026-10-16T14:51:00Z">
+      <w:ins w:id="183" w:author="Eduardo Flach" w:date="2026-10-16T14:51:00Z">
         <w:r>
           <w:t xml:space="preserve">market. </w:t>
         </w:r>
@@ -4989,19 +5195,19 @@
           <w:rPr>
             <w:b/>
             <w:bCs/>
-            <w:rPrChange w:id="153" w:author="Eduardo Flach" w:date="2026-10-16T14:55:00Z">
+            <w:rPrChange w:id="184" w:author="Eduardo Flach" w:date="2026-10-16T14:55:00Z">
               <w:rPr/>
             </w:rPrChange>
           </w:rPr>
           <w:t>It is unkno</w:t>
         </w:r>
       </w:ins>
-      <w:ins w:id="154" w:author="Eduardo Flach" w:date="2026-10-16T14:52:00Z">
+      <w:ins w:id="185" w:author="Eduardo Flach" w:date="2026-10-16T14:52:00Z">
         <w:r>
           <w:rPr>
             <w:b/>
             <w:bCs/>
-            <w:rPrChange w:id="155" w:author="Eduardo Flach" w:date="2026-10-16T14:55:00Z">
+            <w:rPrChange w:id="186" w:author="Eduardo Flach" w:date="2026-10-16T14:55:00Z">
               <w:rPr/>
             </w:rPrChange>
           </w:rPr>
@@ -5014,169 +5220,285 @@
         <w:ind w:firstLine="720"/>
         <w:jc w:val="both"/>
         <w:rPr>
-          <w:ins w:id="156" w:author="Eduardo Flach" w:date="2026-10-12T17:14:00Z"/>
-        </w:rPr>
-        <w:pPrChange w:id="157" w:author="Eduardo Flach" w:date="2026-10-20T11:58:00Z">
+          <w:ins w:id="187" w:author="Eduardo Flach" w:date="2026-10-16T14:53:00Z"/>
+        </w:rPr>
+      </w:pPr>
+      <w:ins w:id="188" w:author="Eduardo Flach" w:date="2026-10-21T21:19:00Z">
+        <w:r>
+          <w:t xml:space="preserve">According to </w:t>
+        </w:r>
+      </w:ins>
+      <w:customXmlInsRangeStart w:id="189" w:author="Eduardo Flach" w:date="2026-10-21T21:19:00Z"/>
+      <w:sdt>
+        <w:sdtPr>
+          <w:id w:val="-821431850"/>
+          <w:citation/>
+        </w:sdtPr>
+        <w:sdtContent>
+          <w:customXmlInsRangeEnd w:id="189"/>
+          <w:ins w:id="190" w:author="Eduardo Flach" w:date="2026-10-21T21:19:00Z">
+            <w:r>
+              <w:fldChar w:fldCharType="begin"/>
+            </w:r>
+            <w:r>
+              <w:rPr>
+                <w:rPrChange w:id="191" w:author="Eduardo Flach" w:date="2026-10-21T21:20:00Z">
+                  <w:rPr>
+                    <w:lang w:val="pt-BR"/>
+                  </w:rPr>
+                </w:rPrChange>
+              </w:rPr>
+              <w:instrText xml:space="preserve"> CITATION Ber21 \l 1046 </w:instrText>
+            </w:r>
+          </w:ins>
+          <w:r>
+            <w:fldChar w:fldCharType="separate"/>
+          </w:r>
+          <w:r>
+            <w:rPr>
+              <w:noProof/>
+            </w:rPr>
+            <w:t>(Bernritter, 2021)</w:t>
+          </w:r>
+          <w:ins w:id="192" w:author="Eduardo Flach" w:date="2026-10-21T21:19:00Z">
+            <w:r>
+              <w:fldChar w:fldCharType="end"/>
+            </w:r>
+          </w:ins>
+          <w:customXmlInsRangeStart w:id="193" w:author="Eduardo Flach" w:date="2026-10-21T21:19:00Z"/>
+        </w:sdtContent>
+      </w:sdt>
+      <w:customXmlInsRangeEnd w:id="193"/>
+      <w:ins w:id="194" w:author="Eduardo Flach" w:date="2026-10-21T21:20:00Z">
+        <w:r>
+          <w:t xml:space="preserve"> the effectiveness of e-marketing does not depend only of the location, but </w:t>
+        </w:r>
+      </w:ins>
+      <w:ins w:id="195" w:author="Eduardo Flach" w:date="2026-10-21T21:21:00Z">
+        <w:r>
+          <w:t>on the interaction between the client location and the involvement with the products. Therefore</w:t>
+        </w:r>
+      </w:ins>
+      <w:ins w:id="196" w:author="Eduardo Flach" w:date="2026-10-21T21:22:00Z">
+        <w:r>
+          <w:t>,</w:t>
+        </w:r>
+      </w:ins>
+      <w:ins w:id="197" w:author="Eduardo Flach" w:date="2026-10-21T21:21:00Z">
+        <w:r>
+          <w:t xml:space="preserve"> knowing </w:t>
+        </w:r>
+      </w:ins>
+      <w:ins w:id="198" w:author="Eduardo Flach" w:date="2026-10-21T21:22:00Z">
+        <w:r>
+          <w:t>the client purchase behaviour based on the location helps the comp</w:t>
+        </w:r>
+      </w:ins>
+      <w:ins w:id="199" w:author="Eduardo Flach" w:date="2026-10-21T21:23:00Z">
+        <w:r>
+          <w:t>any to focus on the right types of location.</w:t>
+        </w:r>
+      </w:ins>
+    </w:p>
+    <w:p>
+      <w:pPr>
+        <w:ind w:firstLine="720"/>
+        <w:jc w:val="both"/>
+        <w:rPr>
+          <w:ins w:id="200" w:author="Eduardo Flach" w:date="2026-10-21T21:30:00Z"/>
+          <w:b/>
+          <w:bCs/>
+        </w:rPr>
+      </w:pPr>
+      <w:ins w:id="201" w:author="Eduardo Flach" w:date="2026-10-16T14:53:00Z">
+        <w:r>
+          <w:t xml:space="preserve">In addition, the brand is known for making </w:t>
+        </w:r>
+      </w:ins>
+      <w:ins w:id="202" w:author="Eduardo Flach" w:date="2026-10-16T14:54:00Z">
+        <w:r>
+          <w:t xml:space="preserve">personalized products. </w:t>
+        </w:r>
+      </w:ins>
+      <w:ins w:id="203" w:author="Eduardo Flach" w:date="2026-10-16T14:55:00Z">
+        <w:r>
+          <w:t xml:space="preserve">The stock of raw material was always high, due to the quantity of possibilities. </w:t>
+        </w:r>
+      </w:ins>
+      <w:ins w:id="204" w:author="Eduardo Flach" w:date="2026-10-16T14:56:00Z">
+        <w:r>
+          <w:t>Right now, there is no model predicting which material and colo</w:t>
+        </w:r>
+      </w:ins>
+      <w:ins w:id="205" w:author="Eduardo Flach" w:date="2026-10-16T14:57:00Z">
+        <w:r>
+          <w:t xml:space="preserve">ur will sell more in the next months. </w:t>
+        </w:r>
+      </w:ins>
+      <w:ins w:id="206" w:author="Eduardo Flach" w:date="2026-10-16T14:58:00Z">
+        <w:r>
+          <w:rPr>
+            <w:b/>
+            <w:bCs/>
+            <w:rPrChange w:id="207" w:author="Eduardo Flach" w:date="2026-10-16T15:01:00Z">
+              <w:rPr>
+                <w:rFonts w:eastAsiaTheme="majorEastAsia" w:cstheme="majorBidi"/>
+                <w:color w:val="3A3A3A" w:themeColor="background2" w:themeShade="40"/>
+                <w:spacing w:val="-10"/>
+                <w:kern w:val="28"/>
+                <w:sz w:val="40"/>
+                <w:szCs w:val="40"/>
+              </w:rPr>
+            </w:rPrChange>
+          </w:rPr>
+          <w:t>Therefore, having this prediction</w:t>
+        </w:r>
+      </w:ins>
+      <w:ins w:id="208" w:author="Eduardo Flach" w:date="2026-10-16T14:59:00Z">
+        <w:r>
+          <w:rPr>
+            <w:b/>
+            <w:bCs/>
+            <w:rPrChange w:id="209" w:author="Eduardo Flach" w:date="2026-10-16T15:01:00Z">
+              <w:rPr>
+                <w:rFonts w:eastAsiaTheme="majorEastAsia" w:cstheme="majorBidi"/>
+                <w:color w:val="3A3A3A" w:themeColor="background2" w:themeShade="40"/>
+                <w:spacing w:val="-10"/>
+                <w:kern w:val="28"/>
+                <w:sz w:val="40"/>
+                <w:szCs w:val="40"/>
+              </w:rPr>
+            </w:rPrChange>
+          </w:rPr>
+          <w:t xml:space="preserve">, the brand can put effort in the best </w:t>
+        </w:r>
+      </w:ins>
+      <w:ins w:id="210" w:author="Eduardo Flach" w:date="2026-10-16T15:02:00Z">
+        <w:r>
+          <w:rPr>
+            <w:b/>
+            <w:bCs/>
+          </w:rPr>
+          <w:t>sellers’</w:t>
+        </w:r>
+      </w:ins>
+      <w:ins w:id="211" w:author="Eduardo Flach" w:date="2026-10-16T14:59:00Z">
+        <w:r>
+          <w:rPr>
+            <w:b/>
+            <w:bCs/>
+            <w:rPrChange w:id="212" w:author="Eduardo Flach" w:date="2026-10-16T15:01:00Z">
+              <w:rPr>
+                <w:rFonts w:eastAsiaTheme="majorEastAsia" w:cstheme="majorBidi"/>
+                <w:color w:val="3A3A3A" w:themeColor="background2" w:themeShade="40"/>
+                <w:spacing w:val="-10"/>
+                <w:kern w:val="28"/>
+                <w:sz w:val="40"/>
+                <w:szCs w:val="40"/>
+              </w:rPr>
+            </w:rPrChange>
+          </w:rPr>
+          <w:t xml:space="preserve"> products an</w:t>
+        </w:r>
+      </w:ins>
+      <w:ins w:id="213" w:author="Eduardo Flach" w:date="2026-10-16T15:00:00Z">
+        <w:r>
+          <w:rPr>
+            <w:b/>
+            <w:bCs/>
+            <w:rPrChange w:id="214" w:author="Eduardo Flach" w:date="2026-10-16T15:01:00Z">
+              <w:rPr>
+                <w:rFonts w:eastAsiaTheme="majorEastAsia" w:cstheme="majorBidi"/>
+                <w:color w:val="3A3A3A" w:themeColor="background2" w:themeShade="40"/>
+                <w:spacing w:val="-10"/>
+                <w:kern w:val="28"/>
+                <w:sz w:val="40"/>
+                <w:szCs w:val="40"/>
+              </w:rPr>
+            </w:rPrChange>
+          </w:rPr>
+          <w:t xml:space="preserve">d colours, optimizing margin and lowering </w:t>
+        </w:r>
+      </w:ins>
+      <w:ins w:id="215" w:author="Eduardo Flach" w:date="2026-10-16T15:01:00Z">
+        <w:r>
+          <w:rPr>
+            <w:b/>
+            <w:bCs/>
+            <w:rPrChange w:id="216" w:author="Eduardo Flach" w:date="2026-10-16T15:01:00Z">
+              <w:rPr>
+                <w:rFonts w:eastAsiaTheme="majorEastAsia" w:cstheme="majorBidi"/>
+                <w:color w:val="3A3A3A" w:themeColor="background2" w:themeShade="40"/>
+                <w:spacing w:val="-10"/>
+                <w:kern w:val="28"/>
+                <w:sz w:val="40"/>
+                <w:szCs w:val="40"/>
+              </w:rPr>
+            </w:rPrChange>
+          </w:rPr>
+          <w:t>the costs.</w:t>
+        </w:r>
+      </w:ins>
+    </w:p>
+    <w:p>
+      <w:pPr>
+        <w:pStyle w:val="Ttulo1"/>
+        <w:spacing w:before="0"/>
+        <w:jc w:val="both"/>
+        <w:rPr>
+          <w:ins w:id="217" w:author="Eduardo Flach" w:date="2026-10-12T17:14:00Z"/>
+        </w:rPr>
+        <w:pPrChange w:id="218" w:author="Eduardo Flach" w:date="2026-10-20T11:58:00Z">
           <w:pPr>
             <w:pStyle w:val="Ttulo1"/>
             <w:spacing w:before="0"/>
           </w:pPr>
         </w:pPrChange>
       </w:pPr>
-      <w:ins w:id="158" w:author="Eduardo Flach" w:date="2026-10-16T14:53:00Z">
-        <w:r>
-          <w:t xml:space="preserve">In addition, the brand is known for making </w:t>
-        </w:r>
-      </w:ins>
-      <w:ins w:id="159" w:author="Eduardo Flach" w:date="2026-10-16T14:54:00Z">
-        <w:r>
-          <w:t xml:space="preserve">personalized products. </w:t>
-        </w:r>
-      </w:ins>
-      <w:ins w:id="160" w:author="Eduardo Flach" w:date="2026-10-16T14:55:00Z">
-        <w:r>
-          <w:t xml:space="preserve">The stock of raw material was always high, due to the quantity of possibilities. </w:t>
-        </w:r>
-      </w:ins>
-      <w:ins w:id="161" w:author="Eduardo Flach" w:date="2026-10-16T14:56:00Z">
-        <w:r>
-          <w:t>Right now, there is no model predicting which material and colo</w:t>
-        </w:r>
-      </w:ins>
-      <w:ins w:id="162" w:author="Eduardo Flach" w:date="2026-10-16T14:57:00Z">
-        <w:r>
-          <w:t xml:space="preserve">ur will sell more in the next months. </w:t>
-        </w:r>
-      </w:ins>
-      <w:ins w:id="163" w:author="Eduardo Flach" w:date="2026-10-16T14:58:00Z">
-        <w:r>
-          <w:rPr>
-            <w:b/>
-            <w:bCs/>
-            <w:rPrChange w:id="164" w:author="Eduardo Flach" w:date="2026-10-16T15:01:00Z">
-              <w:rPr/>
-            </w:rPrChange>
-          </w:rPr>
-          <w:t>Therefore, having this prediction</w:t>
-        </w:r>
-      </w:ins>
-      <w:ins w:id="165" w:author="Eduardo Flach" w:date="2026-10-16T14:59:00Z">
-        <w:r>
-          <w:rPr>
-            <w:b/>
-            <w:bCs/>
-            <w:rPrChange w:id="166" w:author="Eduardo Flach" w:date="2026-10-16T15:01:00Z">
-              <w:rPr/>
-            </w:rPrChange>
-          </w:rPr>
-          <w:t xml:space="preserve">, the brand can put effort in the best </w:t>
-        </w:r>
-      </w:ins>
-      <w:ins w:id="167" w:author="Eduardo Flach" w:date="2026-10-16T15:02:00Z">
-        <w:r>
-          <w:rPr>
-            <w:b/>
-            <w:bCs/>
-          </w:rPr>
-          <w:t>sellers’</w:t>
-        </w:r>
-      </w:ins>
-      <w:ins w:id="168" w:author="Eduardo Flach" w:date="2026-10-16T14:59:00Z">
-        <w:r>
-          <w:rPr>
-            <w:b/>
-            <w:bCs/>
-            <w:rPrChange w:id="169" w:author="Eduardo Flach" w:date="2026-10-16T15:01:00Z">
-              <w:rPr/>
-            </w:rPrChange>
-          </w:rPr>
-          <w:t xml:space="preserve"> products an</w:t>
-        </w:r>
-      </w:ins>
-      <w:ins w:id="170" w:author="Eduardo Flach" w:date="2026-10-16T15:00:00Z">
-        <w:r>
-          <w:rPr>
-            <w:b/>
-            <w:bCs/>
-            <w:rPrChange w:id="171" w:author="Eduardo Flach" w:date="2026-10-16T15:01:00Z">
-              <w:rPr/>
-            </w:rPrChange>
-          </w:rPr>
-          <w:t xml:space="preserve">d colours, optimizing margin and lowering </w:t>
-        </w:r>
-      </w:ins>
-      <w:ins w:id="172" w:author="Eduardo Flach" w:date="2026-10-16T15:01:00Z">
-        <w:r>
-          <w:rPr>
-            <w:b/>
-            <w:bCs/>
-            <w:rPrChange w:id="173" w:author="Eduardo Flach" w:date="2026-10-16T15:01:00Z">
-              <w:rPr/>
-            </w:rPrChange>
-          </w:rPr>
-          <w:t>the costs.</w:t>
-        </w:r>
-      </w:ins>
-    </w:p>
-    <w:p>
-      <w:pPr>
-        <w:pStyle w:val="Ttulo1"/>
-        <w:spacing w:before="0"/>
+      <w:bookmarkStart w:id="219" w:name="_Toc243389956"/>
+      <w:ins w:id="220" w:author="Eduardo Flach" w:date="2026-10-12T17:14:00Z">
+        <w:r>
+          <w:t>Aim and Objectives</w:t>
+        </w:r>
+        <w:bookmarkEnd w:id="219"/>
+      </w:ins>
+    </w:p>
+    <w:p>
+      <w:pPr>
         <w:jc w:val="both"/>
         <w:rPr>
-          <w:ins w:id="174" w:author="Eduardo Flach" w:date="2026-10-12T17:14:00Z"/>
-        </w:rPr>
-        <w:pPrChange w:id="175" w:author="Eduardo Flach" w:date="2026-10-20T11:58:00Z">
-          <w:pPr>
-            <w:pStyle w:val="Ttulo1"/>
-            <w:spacing w:before="0"/>
-          </w:pPr>
-        </w:pPrChange>
-      </w:pPr>
-      <w:bookmarkStart w:id="176" w:name="_Toc243389956"/>
-      <w:ins w:id="177" w:author="Eduardo Flach" w:date="2026-10-12T17:14:00Z">
-        <w:r>
-          <w:t>Aim and Objectives</w:t>
-        </w:r>
-        <w:bookmarkEnd w:id="176"/>
-      </w:ins>
-    </w:p>
-    <w:p>
-      <w:pPr>
-        <w:jc w:val="both"/>
-        <w:rPr>
-          <w:ins w:id="178" w:author="Eduardo Flach" w:date="2026-10-16T15:04:00Z"/>
-        </w:rPr>
-        <w:pPrChange w:id="179" w:author="Eduardo Flach" w:date="2026-10-20T11:58:00Z">
+          <w:ins w:id="221" w:author="Eduardo Flach" w:date="2026-10-16T15:04:00Z"/>
+        </w:rPr>
+        <w:pPrChange w:id="222" w:author="Eduardo Flach" w:date="2026-10-20T11:58:00Z">
           <w:pPr/>
         </w:pPrChange>
       </w:pPr>
-      <w:ins w:id="180" w:author="Eduardo Flach" w:date="2026-10-16T15:01:00Z">
+      <w:ins w:id="223" w:author="Eduardo Flach" w:date="2026-10-16T15:01:00Z">
         <w:r>
           <w:tab/>
         </w:r>
       </w:ins>
-      <w:ins w:id="181" w:author="Eduardo Flach" w:date="2026-10-16T15:02:00Z">
+      <w:ins w:id="224" w:author="Eduardo Flach" w:date="2026-10-16T15:02:00Z">
         <w:r>
           <w:t>The objectives of this project are</w:t>
         </w:r>
       </w:ins>
-      <w:ins w:id="182" w:author="Eduardo Flach" w:date="2026-10-16T15:03:00Z">
+      <w:ins w:id="225" w:author="Eduardo Flach" w:date="2026-10-16T15:03:00Z">
         <w:r>
           <w:t xml:space="preserve"> related to</w:t>
         </w:r>
       </w:ins>
-      <w:ins w:id="183" w:author="Eduardo Flach" w:date="2026-10-16T15:02:00Z">
+      <w:ins w:id="226" w:author="Eduardo Flach" w:date="2026-10-16T15:02:00Z">
         <w:r>
           <w:t xml:space="preserve"> improve the </w:t>
         </w:r>
       </w:ins>
-      <w:ins w:id="184" w:author="Eduardo Flach" w:date="2026-10-16T15:03:00Z">
+      <w:ins w:id="227" w:author="Eduardo Flach" w:date="2026-10-16T15:03:00Z">
         <w:r>
           <w:t>profits of the brand in order to provide the company t</w:t>
         </w:r>
       </w:ins>
-      <w:ins w:id="185" w:author="Eduardo Flach" w:date="2026-10-16T15:04:00Z">
+      <w:ins w:id="228" w:author="Eduardo Flach" w:date="2026-10-16T15:04:00Z">
         <w:r>
           <w:t>he possibilities to expand. The main aims are listed below:</w:t>
         </w:r>
@@ -5191,9 +5513,9 @@
         </w:numPr>
         <w:jc w:val="both"/>
         <w:rPr>
-          <w:ins w:id="186" w:author="Eduardo Flach" w:date="2026-10-16T15:06:00Z"/>
-        </w:rPr>
-        <w:pPrChange w:id="187" w:author="Eduardo Flach" w:date="2026-10-20T11:58:00Z">
+          <w:ins w:id="229" w:author="Eduardo Flach" w:date="2026-10-16T15:06:00Z"/>
+        </w:rPr>
+        <w:pPrChange w:id="230" w:author="Eduardo Flach" w:date="2026-10-20T11:58:00Z">
           <w:pPr>
             <w:pStyle w:val="PargrafodaLista"/>
             <w:numPr>
@@ -5204,27 +5526,28 @@
           </w:pPr>
         </w:pPrChange>
       </w:pPr>
-      <w:ins w:id="188" w:author="Eduardo Flach" w:date="2026-10-16T15:04:00Z">
-        <w:r>
+      <w:ins w:id="231" w:author="Eduardo Flach" w:date="2026-10-16T15:04:00Z">
+        <w:r>
+          <w:lastRenderedPageBreak/>
           <w:t>Organise the</w:t>
         </w:r>
       </w:ins>
-      <w:ins w:id="189" w:author="Eduardo Flach" w:date="2026-10-16T15:05:00Z">
+      <w:ins w:id="232" w:author="Eduardo Flach" w:date="2026-10-16T15:05:00Z">
         <w:r>
           <w:t xml:space="preserve"> actual</w:t>
         </w:r>
       </w:ins>
-      <w:ins w:id="190" w:author="Eduardo Flach" w:date="2026-10-16T15:04:00Z">
+      <w:ins w:id="233" w:author="Eduardo Flach" w:date="2026-10-16T15:04:00Z">
         <w:r>
           <w:t xml:space="preserve"> raw data</w:t>
         </w:r>
       </w:ins>
-      <w:ins w:id="191" w:author="Eduardo Flach" w:date="2026-10-16T15:05:00Z">
+      <w:ins w:id="234" w:author="Eduardo Flach" w:date="2026-10-16T15:05:00Z">
         <w:r>
           <w:t xml:space="preserve"> in some way that we can work with. Being able in the future to make decisions based on facts and not </w:t>
         </w:r>
       </w:ins>
-      <w:ins w:id="192" w:author="Eduardo Flach" w:date="2026-10-16T15:06:00Z">
+      <w:ins w:id="235" w:author="Eduardo Flach" w:date="2026-10-16T15:06:00Z">
         <w:r>
           <w:t>guess and expertise.</w:t>
         </w:r>
@@ -5239,9 +5562,9 @@
         </w:numPr>
         <w:jc w:val="both"/>
         <w:rPr>
-          <w:ins w:id="193" w:author="Eduardo Flach" w:date="2026-10-16T15:10:00Z"/>
-        </w:rPr>
-        <w:pPrChange w:id="194" w:author="Eduardo Flach" w:date="2026-10-20T11:58:00Z">
+          <w:ins w:id="236" w:author="Eduardo Flach" w:date="2026-10-16T15:10:00Z"/>
+        </w:rPr>
+        <w:pPrChange w:id="237" w:author="Eduardo Flach" w:date="2026-10-20T11:58:00Z">
           <w:pPr>
             <w:pStyle w:val="PargrafodaLista"/>
             <w:numPr>
@@ -5252,37 +5575,37 @@
           </w:pPr>
         </w:pPrChange>
       </w:pPr>
-      <w:ins w:id="195" w:author="Eduardo Flach" w:date="2026-10-16T15:06:00Z">
+      <w:ins w:id="238" w:author="Eduardo Flach" w:date="2026-10-16T15:06:00Z">
         <w:r>
           <w:t>Check the correlation</w:t>
         </w:r>
       </w:ins>
-      <w:ins w:id="196" w:author="Eduardo Flach" w:date="2026-10-16T15:07:00Z">
+      <w:ins w:id="239" w:author="Eduardo Flach" w:date="2026-10-16T15:07:00Z">
         <w:r>
           <w:t xml:space="preserve"> between</w:t>
         </w:r>
       </w:ins>
-      <w:ins w:id="197" w:author="Eduardo Flach" w:date="2026-10-16T15:06:00Z">
+      <w:ins w:id="240" w:author="Eduardo Flach" w:date="2026-10-16T15:06:00Z">
         <w:r>
           <w:t xml:space="preserve"> </w:t>
         </w:r>
       </w:ins>
-      <w:ins w:id="198" w:author="Eduardo Flach" w:date="2026-10-16T15:07:00Z">
+      <w:ins w:id="241" w:author="Eduardo Flach" w:date="2026-10-16T15:07:00Z">
         <w:r>
           <w:t>the region that the person is living and the amount spend</w:t>
         </w:r>
       </w:ins>
-      <w:ins w:id="199" w:author="Eduardo Flach" w:date="2026-10-16T15:08:00Z">
+      <w:ins w:id="242" w:author="Eduardo Flach" w:date="2026-10-16T15:08:00Z">
         <w:r>
           <w:t xml:space="preserve">. This will be important for future </w:t>
         </w:r>
       </w:ins>
-      <w:ins w:id="200" w:author="Eduardo Flach" w:date="2026-10-16T15:09:00Z">
+      <w:ins w:id="243" w:author="Eduardo Flach" w:date="2026-10-16T15:09:00Z">
         <w:r>
           <w:t xml:space="preserve">investments on Instagram ads for the right target </w:t>
         </w:r>
       </w:ins>
-      <w:ins w:id="201" w:author="Eduardo Flach" w:date="2026-10-16T15:10:00Z">
+      <w:ins w:id="244" w:author="Eduardo Flach" w:date="2026-10-16T15:10:00Z">
         <w:r>
           <w:t>public.</w:t>
         </w:r>
@@ -5297,23 +5620,23 @@
         </w:numPr>
         <w:jc w:val="both"/>
         <w:rPr>
-          <w:ins w:id="202" w:author="Eduardo Flach" w:date="2026-10-12T17:14:00Z"/>
-        </w:rPr>
-        <w:pPrChange w:id="203" w:author="Eduardo Flach" w:date="2026-10-20T11:58:00Z">
+          <w:ins w:id="245" w:author="Eduardo Flach" w:date="2026-10-12T17:14:00Z"/>
+        </w:rPr>
+        <w:pPrChange w:id="246" w:author="Eduardo Flach" w:date="2026-10-20T11:58:00Z">
           <w:pPr/>
         </w:pPrChange>
       </w:pPr>
-      <w:ins w:id="204" w:author="Eduardo Flach" w:date="2026-10-16T15:10:00Z">
+      <w:ins w:id="247" w:author="Eduardo Flach" w:date="2026-10-16T15:10:00Z">
         <w:r>
           <w:t>Predict the next sales based on the previous demand. Also predict what kind of pro</w:t>
         </w:r>
       </w:ins>
-      <w:ins w:id="205" w:author="Eduardo Flach" w:date="2026-10-16T15:11:00Z">
+      <w:ins w:id="248" w:author="Eduardo Flach" w:date="2026-10-16T15:11:00Z">
         <w:r>
           <w:t>ducts and</w:t>
         </w:r>
       </w:ins>
-      <w:ins w:id="206" w:author="Eduardo Flach" w:date="2026-10-16T15:12:00Z">
+      <w:ins w:id="249" w:author="Eduardo Flach" w:date="2026-10-16T15:12:00Z">
         <w:r>
           <w:t xml:space="preserve"> colours tend to be more common.</w:t>
         </w:r>
@@ -5325,49 +5648,49 @@
         <w:spacing w:before="0"/>
         <w:jc w:val="both"/>
         <w:rPr>
-          <w:ins w:id="207" w:author="Eduardo Flach" w:date="2026-10-12T17:14:00Z"/>
-        </w:rPr>
-        <w:pPrChange w:id="208" w:author="Eduardo Flach" w:date="2026-10-20T11:58:00Z">
+          <w:ins w:id="250" w:author="Eduardo Flach" w:date="2026-10-12T17:14:00Z"/>
+        </w:rPr>
+        <w:pPrChange w:id="251" w:author="Eduardo Flach" w:date="2026-10-20T11:58:00Z">
           <w:pPr>
             <w:pStyle w:val="Ttulo1"/>
             <w:spacing w:before="0"/>
           </w:pPr>
         </w:pPrChange>
       </w:pPr>
-      <w:bookmarkStart w:id="209" w:name="_Toc243389957"/>
-      <w:ins w:id="210" w:author="Eduardo Flach" w:date="2026-10-12T17:14:00Z">
+      <w:bookmarkStart w:id="252" w:name="_Toc243389957"/>
+      <w:ins w:id="253" w:author="Eduardo Flach" w:date="2026-10-12T17:14:00Z">
         <w:r>
           <w:t>Scope</w:t>
         </w:r>
-        <w:bookmarkEnd w:id="209"/>
+        <w:bookmarkEnd w:id="252"/>
       </w:ins>
     </w:p>
     <w:p>
       <w:pPr>
         <w:jc w:val="both"/>
         <w:rPr>
-          <w:ins w:id="211" w:author="Eduardo Flach" w:date="2026-10-16T15:15:00Z"/>
-        </w:rPr>
-        <w:pPrChange w:id="212" w:author="Eduardo Flach" w:date="2026-10-20T11:58:00Z">
+          <w:ins w:id="254" w:author="Eduardo Flach" w:date="2026-10-16T15:15:00Z"/>
+        </w:rPr>
+        <w:pPrChange w:id="255" w:author="Eduardo Flach" w:date="2026-10-20T11:58:00Z">
           <w:pPr/>
         </w:pPrChange>
       </w:pPr>
-      <w:ins w:id="213" w:author="Eduardo Flach" w:date="2026-10-16T15:12:00Z">
+      <w:ins w:id="256" w:author="Eduardo Flach" w:date="2026-10-16T15:12:00Z">
         <w:r>
           <w:tab/>
         </w:r>
       </w:ins>
-      <w:ins w:id="214" w:author="Eduardo Flach" w:date="2026-10-16T15:13:00Z">
+      <w:ins w:id="257" w:author="Eduardo Flach" w:date="2026-10-16T15:13:00Z">
         <w:r>
           <w:t xml:space="preserve">Once there is no appropriate data storage, </w:t>
         </w:r>
       </w:ins>
-      <w:ins w:id="215" w:author="Eduardo Flach" w:date="2026-10-16T15:14:00Z">
+      <w:ins w:id="258" w:author="Eduardo Flach" w:date="2026-10-16T15:14:00Z">
         <w:r>
           <w:t xml:space="preserve">important features related of the products, such as </w:t>
         </w:r>
       </w:ins>
-      <w:ins w:id="216" w:author="Eduardo Flach" w:date="2026-10-16T15:15:00Z">
+      <w:ins w:id="259" w:author="Eduardo Flach" w:date="2026-10-16T15:15:00Z">
         <w:r>
           <w:t>cost of production, raw material needed, cost of suppliers, etc, will not be included at the first time.</w:t>
         </w:r>
@@ -5377,22 +5700,21 @@
       <w:pPr>
         <w:jc w:val="both"/>
         <w:rPr>
-          <w:ins w:id="217" w:author="Eduardo Flach" w:date="2026-10-12T17:14:00Z"/>
-        </w:rPr>
-        <w:pPrChange w:id="218" w:author="Eduardo Flach" w:date="2026-10-20T11:58:00Z">
+          <w:ins w:id="260" w:author="Eduardo Flach" w:date="2026-10-12T17:14:00Z"/>
+        </w:rPr>
+        <w:pPrChange w:id="261" w:author="Eduardo Flach" w:date="2026-10-20T11:58:00Z">
           <w:pPr/>
         </w:pPrChange>
       </w:pPr>
-      <w:ins w:id="219" w:author="Eduardo Flach" w:date="2026-10-16T15:15:00Z">
-        <w:r>
-          <w:lastRenderedPageBreak/>
+      <w:ins w:id="262" w:author="Eduardo Flach" w:date="2026-10-16T15:15:00Z">
+        <w:r>
           <w:tab/>
           <w:t xml:space="preserve">The project will focus on </w:t>
         </w:r>
       </w:ins>
-      <w:ins w:id="220" w:author="Eduardo Flach" w:date="2026-10-16T15:16:00Z">
-        <w:r>
-          <w:t>the target public for Ads campaigns and the prediction of what kinds of products tends to sell more.</w:t>
+      <w:ins w:id="263" w:author="Eduardo Flach" w:date="2026-10-16T15:16:00Z">
+        <w:r>
+          <w:t>the target public for Ads campaigns and the prediction of what kind of products tends to sell more.</w:t>
         </w:r>
       </w:ins>
     </w:p>
@@ -5402,75 +5724,75 @@
         <w:spacing w:before="0"/>
         <w:jc w:val="both"/>
         <w:rPr>
-          <w:ins w:id="221" w:author="Eduardo Flach" w:date="2026-10-18T19:25:00Z"/>
-        </w:rPr>
-        <w:pPrChange w:id="222" w:author="Eduardo Flach" w:date="2026-10-20T11:58:00Z">
+          <w:ins w:id="264" w:author="Eduardo Flach" w:date="2026-10-18T19:25:00Z"/>
+        </w:rPr>
+        <w:pPrChange w:id="265" w:author="Eduardo Flach" w:date="2026-10-20T11:58:00Z">
           <w:pPr>
             <w:pStyle w:val="Ttulo1"/>
             <w:spacing w:before="0"/>
           </w:pPr>
         </w:pPrChange>
       </w:pPr>
-      <w:bookmarkStart w:id="223" w:name="_Toc243389958"/>
-      <w:ins w:id="224" w:author="Eduardo Flach" w:date="2026-10-12T17:15:00Z">
+      <w:bookmarkStart w:id="266" w:name="_Toc243389958"/>
+      <w:ins w:id="267" w:author="Eduardo Flach" w:date="2026-10-12T17:15:00Z">
         <w:r>
           <w:t>Methodology</w:t>
         </w:r>
       </w:ins>
-      <w:bookmarkEnd w:id="223"/>
+      <w:bookmarkEnd w:id="266"/>
     </w:p>
     <w:p>
       <w:pPr>
         <w:jc w:val="both"/>
         <w:rPr>
-          <w:ins w:id="225" w:author="Eduardo Flach" w:date="2026-10-20T10:12:00Z"/>
-        </w:rPr>
-        <w:pPrChange w:id="226" w:author="Eduardo Flach" w:date="2026-10-20T11:58:00Z">
+          <w:ins w:id="268" w:author="Eduardo Flach" w:date="2026-10-20T10:12:00Z"/>
+        </w:rPr>
+        <w:pPrChange w:id="269" w:author="Eduardo Flach" w:date="2026-10-20T11:58:00Z">
           <w:pPr/>
         </w:pPrChange>
       </w:pPr>
-      <w:ins w:id="227" w:author="Eduardo Flach" w:date="2026-10-18T19:25:00Z">
+      <w:ins w:id="270" w:author="Eduardo Flach" w:date="2026-10-18T19:25:00Z">
         <w:r>
           <w:tab/>
           <w:t xml:space="preserve">The project will start organizing the current data in a proper document. This </w:t>
         </w:r>
       </w:ins>
-      <w:ins w:id="228" w:author="Eduardo Flach" w:date="2026-10-18T19:26:00Z">
+      <w:ins w:id="271" w:author="Eduardo Flach" w:date="2026-10-18T19:26:00Z">
         <w:r>
           <w:t xml:space="preserve">document will support either the current proposal to find out the main aims and to give the company </w:t>
         </w:r>
       </w:ins>
-      <w:ins w:id="229" w:author="Eduardo Flach" w:date="2026-10-18T19:27:00Z">
+      <w:ins w:id="272" w:author="Eduardo Flach" w:date="2026-10-18T19:27:00Z">
         <w:r>
           <w:t>a proper storage structure of the data.</w:t>
         </w:r>
       </w:ins>
-      <w:ins w:id="230" w:author="Eduardo Flach" w:date="2026-10-18T19:28:00Z">
+      <w:ins w:id="273" w:author="Eduardo Flach" w:date="2026-10-18T19:28:00Z">
         <w:r>
           <w:t xml:space="preserve"> A good amount of the time will be </w:t>
         </w:r>
       </w:ins>
-      <w:ins w:id="231" w:author="Eduardo Flach" w:date="2026-10-18T19:29:00Z">
+      <w:ins w:id="274" w:author="Eduardo Flach" w:date="2026-10-18T19:29:00Z">
         <w:r>
           <w:t>spent</w:t>
         </w:r>
       </w:ins>
-      <w:ins w:id="232" w:author="Eduardo Flach" w:date="2026-10-18T19:28:00Z">
+      <w:ins w:id="275" w:author="Eduardo Flach" w:date="2026-10-18T19:28:00Z">
         <w:r>
           <w:t xml:space="preserve"> in </w:t>
         </w:r>
       </w:ins>
-      <w:ins w:id="233" w:author="Eduardo Flach" w:date="2026-10-18T19:29:00Z">
+      <w:ins w:id="276" w:author="Eduardo Flach" w:date="2026-10-18T19:29:00Z">
         <w:r>
           <w:t>this part of the project</w:t>
         </w:r>
       </w:ins>
-      <w:ins w:id="234" w:author="Eduardo Flach" w:date="2026-10-18T19:28:00Z">
+      <w:ins w:id="277" w:author="Eduardo Flach" w:date="2026-10-18T19:28:00Z">
         <w:r>
           <w:t>, appl</w:t>
         </w:r>
       </w:ins>
-      <w:ins w:id="235" w:author="Eduardo Flach" w:date="2026-10-18T19:29:00Z">
+      <w:ins w:id="278" w:author="Eduardo Flach" w:date="2026-10-18T19:29:00Z">
         <w:r>
           <w:t>ying tools of the data preparation module in order to organise the data in a better way.</w:t>
         </w:r>
@@ -5480,30 +5802,56 @@
       <w:pPr>
         <w:jc w:val="both"/>
         <w:rPr>
-          <w:ins w:id="236" w:author="Eduardo Flach" w:date="2026-10-20T10:15:00Z"/>
-        </w:rPr>
-        <w:pPrChange w:id="237" w:author="Eduardo Flach" w:date="2026-10-20T11:58:00Z">
+          <w:ins w:id="279" w:author="Eduardo Flach" w:date="2026-10-20T10:15:00Z"/>
+        </w:rPr>
+        <w:pPrChange w:id="280" w:author="Eduardo Flach" w:date="2026-10-20T11:58:00Z">
           <w:pPr/>
         </w:pPrChange>
       </w:pPr>
-      <w:ins w:id="238" w:author="Eduardo Flach" w:date="2026-10-20T10:13:00Z">
+      <w:ins w:id="281" w:author="Eduardo Flach" w:date="2026-10-20T10:13:00Z">
         <w:r>
           <w:tab/>
+        </w:r>
+        <w:r>
+          <w:rPr>
+            <w:highlight w:val="yellow"/>
+            <w:rPrChange w:id="282" w:author="Eduardo Flach" w:date="2026-10-21T19:45:00Z">
+              <w:rPr/>
+            </w:rPrChange>
+          </w:rPr>
           <w:t xml:space="preserve">The second step is to check the data and prepare it for any further study. </w:t>
         </w:r>
       </w:ins>
-      <w:ins w:id="239" w:author="Eduardo Flach" w:date="2026-10-20T10:14:00Z">
-        <w:r>
+      <w:ins w:id="283" w:author="Eduardo Flach" w:date="2026-10-20T10:14:00Z">
+        <w:r>
+          <w:rPr>
+            <w:highlight w:val="yellow"/>
+            <w:rPrChange w:id="284" w:author="Eduardo Flach" w:date="2026-10-21T19:45:00Z">
+              <w:rPr/>
+            </w:rPrChange>
+          </w:rPr>
           <w:t xml:space="preserve">For example, checking duplicates, checking missing values, coding the data, </w:t>
         </w:r>
       </w:ins>
-      <w:ins w:id="240" w:author="Eduardo Flach" w:date="2026-10-20T11:03:00Z">
-        <w:r>
+      <w:ins w:id="285" w:author="Eduardo Flach" w:date="2026-10-20T11:03:00Z">
+        <w:r>
+          <w:rPr>
+            <w:highlight w:val="yellow"/>
+            <w:rPrChange w:id="286" w:author="Eduardo Flach" w:date="2026-10-21T19:45:00Z">
+              <w:rPr/>
+            </w:rPrChange>
+          </w:rPr>
           <w:t>scale,</w:t>
         </w:r>
       </w:ins>
-      <w:ins w:id="241" w:author="Eduardo Flach" w:date="2026-10-20T10:14:00Z">
-        <w:r>
+      <w:ins w:id="287" w:author="Eduardo Flach" w:date="2026-10-20T10:14:00Z">
+        <w:r>
+          <w:rPr>
+            <w:highlight w:val="yellow"/>
+            <w:rPrChange w:id="288" w:author="Eduardo Flach" w:date="2026-10-21T19:45:00Z">
+              <w:rPr/>
+            </w:rPrChange>
+          </w:rPr>
           <w:t xml:space="preserve"> if necessary, etc.</w:t>
         </w:r>
       </w:ins>
@@ -5513,45 +5861,45 @@
         <w:ind w:firstLine="720"/>
         <w:jc w:val="both"/>
         <w:rPr>
-          <w:ins w:id="242" w:author="Eduardo Flach" w:date="2026-10-20T10:18:00Z"/>
-        </w:rPr>
-        <w:pPrChange w:id="243" w:author="Eduardo Flach" w:date="2026-10-20T11:58:00Z">
+          <w:ins w:id="289" w:author="Eduardo Flach" w:date="2026-10-20T10:18:00Z"/>
+        </w:rPr>
+        <w:pPrChange w:id="290" w:author="Eduardo Flach" w:date="2026-10-20T11:58:00Z">
           <w:pPr>
             <w:ind w:firstLine="720"/>
           </w:pPr>
         </w:pPrChange>
       </w:pPr>
-      <w:ins w:id="244" w:author="Eduardo Flach" w:date="2026-10-20T10:16:00Z">
+      <w:ins w:id="291" w:author="Eduardo Flach" w:date="2026-10-20T10:16:00Z">
         <w:r>
           <w:t xml:space="preserve">Third step will </w:t>
         </w:r>
       </w:ins>
-      <w:ins w:id="245" w:author="Eduardo Flach" w:date="2026-10-20T10:17:00Z">
+      <w:ins w:id="292" w:author="Eduardo Flach" w:date="2026-10-20T10:17:00Z">
         <w:r>
           <w:t>focus on the evaluation of the accuracy an</w:t>
         </w:r>
       </w:ins>
-      <w:ins w:id="246" w:author="Eduardo Flach" w:date="2026-10-20T10:18:00Z">
+      <w:ins w:id="293" w:author="Eduardo Flach" w:date="2026-10-20T10:18:00Z">
         <w:r>
           <w:t>d the difference between some techniques applied on the current data.</w:t>
         </w:r>
       </w:ins>
-      <w:ins w:id="247" w:author="Eduardo Flach" w:date="2026-10-20T10:25:00Z">
+      <w:ins w:id="294" w:author="Eduardo Flach" w:date="2026-10-20T10:25:00Z">
         <w:r>
           <w:t xml:space="preserve"> It will be necessary to check different kinds of </w:t>
         </w:r>
       </w:ins>
-      <w:ins w:id="248" w:author="Eduardo Flach" w:date="2026-10-20T10:26:00Z">
+      <w:ins w:id="295" w:author="Eduardo Flach" w:date="2026-10-20T10:26:00Z">
         <w:r>
           <w:t xml:space="preserve">machine learning </w:t>
         </w:r>
       </w:ins>
-      <w:ins w:id="249" w:author="Eduardo Flach" w:date="2026-10-20T10:25:00Z">
+      <w:ins w:id="296" w:author="Eduardo Flach" w:date="2026-10-20T10:25:00Z">
         <w:r>
           <w:t>tech</w:t>
         </w:r>
       </w:ins>
-      <w:ins w:id="250" w:author="Eduardo Flach" w:date="2026-10-20T10:26:00Z">
+      <w:ins w:id="297" w:author="Eduardo Flach" w:date="2026-10-20T10:26:00Z">
         <w:r>
           <w:t>niques at first, once I do not have the data organized yet.</w:t>
         </w:r>
@@ -5562,55 +5910,55 @@
         <w:ind w:firstLine="720"/>
         <w:jc w:val="both"/>
         <w:rPr>
-          <w:ins w:id="251" w:author="Eduardo Flach" w:date="2026-10-20T10:22:00Z"/>
-        </w:rPr>
-        <w:pPrChange w:id="252" w:author="Eduardo Flach" w:date="2026-10-20T11:58:00Z">
+          <w:ins w:id="298" w:author="Eduardo Flach" w:date="2026-10-20T10:22:00Z"/>
+        </w:rPr>
+        <w:pPrChange w:id="299" w:author="Eduardo Flach" w:date="2026-10-20T11:58:00Z">
           <w:pPr>
             <w:ind w:firstLine="720"/>
           </w:pPr>
         </w:pPrChange>
       </w:pPr>
-      <w:ins w:id="253" w:author="Eduardo Flach" w:date="2026-10-20T10:20:00Z">
+      <w:ins w:id="300" w:author="Eduardo Flach" w:date="2026-10-20T10:20:00Z">
         <w:r>
           <w:t>In the fourth</w:t>
         </w:r>
       </w:ins>
-      <w:ins w:id="254" w:author="Eduardo Flach" w:date="2026-10-20T10:18:00Z">
+      <w:ins w:id="301" w:author="Eduardo Flach" w:date="2026-10-20T10:18:00Z">
         <w:r>
           <w:t xml:space="preserve"> st</w:t>
         </w:r>
       </w:ins>
-      <w:ins w:id="255" w:author="Eduardo Flach" w:date="2026-10-20T10:19:00Z">
+      <w:ins w:id="302" w:author="Eduardo Flach" w:date="2026-10-20T10:19:00Z">
         <w:r>
           <w:t>ep</w:t>
         </w:r>
       </w:ins>
-      <w:ins w:id="256" w:author="Eduardo Flach" w:date="2026-10-20T10:20:00Z">
+      <w:ins w:id="303" w:author="Eduardo Flach" w:date="2026-10-20T10:20:00Z">
         <w:r>
           <w:t>,</w:t>
         </w:r>
       </w:ins>
-      <w:ins w:id="257" w:author="Eduardo Flach" w:date="2026-10-20T10:19:00Z">
+      <w:ins w:id="304" w:author="Eduardo Flach" w:date="2026-10-20T10:19:00Z">
         <w:r>
           <w:t xml:space="preserve"> the chosen machine learning technique</w:t>
         </w:r>
       </w:ins>
-      <w:ins w:id="258" w:author="Eduardo Flach" w:date="2026-10-20T10:20:00Z">
+      <w:ins w:id="305" w:author="Eduardo Flach" w:date="2026-10-20T10:20:00Z">
         <w:r>
           <w:t xml:space="preserve"> will </w:t>
         </w:r>
       </w:ins>
-      <w:ins w:id="259" w:author="Eduardo Flach" w:date="2026-10-20T10:21:00Z">
+      <w:ins w:id="306" w:author="Eduardo Flach" w:date="2026-10-20T10:21:00Z">
         <w:r>
           <w:t>be done. Following by the model evaluation which will compare if the results answer t</w:t>
         </w:r>
       </w:ins>
-      <w:ins w:id="260" w:author="Eduardo Flach" w:date="2026-10-20T10:22:00Z">
+      <w:ins w:id="307" w:author="Eduardo Flach" w:date="2026-10-20T10:22:00Z">
         <w:r>
           <w:t xml:space="preserve">he objectives. If the results are not </w:t>
         </w:r>
       </w:ins>
-      <w:ins w:id="261" w:author="Eduardo Flach" w:date="2026-10-20T10:23:00Z">
+      <w:ins w:id="308" w:author="Eduardo Flach" w:date="2026-10-20T10:23:00Z">
         <w:r>
           <w:t>satisfactory, the task can go back to the third step.</w:t>
         </w:r>
@@ -5621,25 +5969,25 @@
         <w:ind w:firstLine="720"/>
         <w:jc w:val="both"/>
         <w:rPr>
-          <w:ins w:id="262" w:author="Eduardo Flach" w:date="2026-10-20T11:02:00Z"/>
-        </w:rPr>
-        <w:pPrChange w:id="263" w:author="Eduardo Flach" w:date="2026-10-20T11:58:00Z">
+          <w:ins w:id="309" w:author="Eduardo Flach" w:date="2026-10-20T11:02:00Z"/>
+        </w:rPr>
+        <w:pPrChange w:id="310" w:author="Eduardo Flach" w:date="2026-10-20T11:58:00Z">
           <w:pPr>
             <w:ind w:firstLine="720"/>
           </w:pPr>
         </w:pPrChange>
       </w:pPr>
-      <w:ins w:id="264" w:author="Eduardo Flach" w:date="2026-10-20T10:22:00Z">
+      <w:ins w:id="311" w:author="Eduardo Flach" w:date="2026-10-20T10:22:00Z">
         <w:r>
           <w:t xml:space="preserve">The final step is dedicated to </w:t>
         </w:r>
       </w:ins>
-      <w:ins w:id="265" w:author="Eduardo Flach" w:date="2026-10-20T10:23:00Z">
+      <w:ins w:id="312" w:author="Eduardo Flach" w:date="2026-10-20T10:23:00Z">
         <w:r>
           <w:t>the results and visualiza</w:t>
         </w:r>
       </w:ins>
-      <w:ins w:id="266" w:author="Eduardo Flach" w:date="2026-10-20T10:24:00Z">
+      <w:ins w:id="313" w:author="Eduardo Flach" w:date="2026-10-20T10:24:00Z">
         <w:r>
           <w:t>tion, according to the data visualization module.</w:t>
         </w:r>
@@ -5649,14 +5997,17 @@
       <w:pPr>
         <w:jc w:val="both"/>
         <w:rPr>
-          <w:ins w:id="267" w:author="Eduardo Flach" w:date="2026-10-12T17:15:00Z"/>
-        </w:rPr>
-        <w:pPrChange w:id="268" w:author="Eduardo Flach" w:date="2026-10-20T11:58:00Z">
+          <w:ins w:id="314" w:author="Eduardo Flach" w:date="2026-10-12T17:15:00Z"/>
+        </w:rPr>
+        <w:pPrChange w:id="315" w:author="Eduardo Flach" w:date="2026-10-20T11:58:00Z">
           <w:pPr/>
         </w:pPrChange>
       </w:pPr>
-      <w:ins w:id="269" w:author="Eduardo Flach" w:date="2026-10-20T11:02:00Z">
-        <w:r>
+      <w:ins w:id="316" w:author="Eduardo Flach" w:date="2026-10-20T11:02:00Z">
+        <w:r>
+          <w:rPr>
+            <w:noProof/>
+          </w:rPr>
           <w:drawing>
             <wp:inline distT="0" distB="0" distL="0" distR="0" wp14:anchorId="18CFD4D2" wp14:editId="5A8E2FF5">
               <wp:extent cx="5731510" cy="1393190"/>
@@ -5701,80 +6052,80 @@
         <w:spacing w:before="0"/>
         <w:jc w:val="both"/>
         <w:rPr>
-          <w:ins w:id="270" w:author="Eduardo Flach" w:date="2026-10-18T19:30:00Z"/>
-        </w:rPr>
-        <w:pPrChange w:id="271" w:author="Eduardo Flach" w:date="2026-10-20T11:58:00Z">
+          <w:ins w:id="317" w:author="Eduardo Flach" w:date="2026-10-18T19:30:00Z"/>
+        </w:rPr>
+        <w:pPrChange w:id="318" w:author="Eduardo Flach" w:date="2026-10-20T11:58:00Z">
           <w:pPr>
             <w:pStyle w:val="Ttulo1"/>
             <w:spacing w:before="0"/>
           </w:pPr>
         </w:pPrChange>
       </w:pPr>
-      <w:bookmarkStart w:id="272" w:name="_Toc243389959"/>
-      <w:ins w:id="273" w:author="Eduardo Flach" w:date="2026-10-12T17:15:00Z">
+      <w:bookmarkStart w:id="319" w:name="_Toc243389959"/>
+      <w:ins w:id="320" w:author="Eduardo Flach" w:date="2026-10-12T17:15:00Z">
         <w:r>
           <w:t>Data Sources</w:t>
         </w:r>
       </w:ins>
-      <w:bookmarkEnd w:id="272"/>
+      <w:bookmarkEnd w:id="319"/>
     </w:p>
     <w:p>
       <w:pPr>
         <w:jc w:val="both"/>
         <w:rPr>
-          <w:ins w:id="274" w:author="Eduardo Flach" w:date="2026-10-18T19:35:00Z"/>
-        </w:rPr>
-        <w:pPrChange w:id="275" w:author="Eduardo Flach" w:date="2026-10-20T11:58:00Z">
+          <w:ins w:id="321" w:author="Eduardo Flach" w:date="2026-10-18T19:35:00Z"/>
+        </w:rPr>
+        <w:pPrChange w:id="322" w:author="Eduardo Flach" w:date="2026-10-20T11:58:00Z">
           <w:pPr/>
         </w:pPrChange>
       </w:pPr>
-      <w:ins w:id="276" w:author="Eduardo Flach" w:date="2026-10-18T19:30:00Z">
+      <w:ins w:id="323" w:author="Eduardo Flach" w:date="2026-10-18T19:30:00Z">
         <w:r>
           <w:tab/>
           <w:t>As mentioned before</w:t>
         </w:r>
       </w:ins>
-      <w:ins w:id="277" w:author="Eduardo Flach" w:date="2026-10-18T19:31:00Z">
+      <w:ins w:id="324" w:author="Eduardo Flach" w:date="2026-10-18T19:31:00Z">
         <w:r>
           <w:t xml:space="preserve">, the data is coming from a </w:t>
         </w:r>
       </w:ins>
-      <w:ins w:id="278" w:author="Eduardo Flach" w:date="2026-10-18T19:33:00Z">
+      <w:ins w:id="325" w:author="Eduardo Flach" w:date="2026-10-18T19:33:00Z">
         <w:r>
           <w:t>historic sale</w:t>
         </w:r>
       </w:ins>
-      <w:ins w:id="279" w:author="Eduardo Flach" w:date="2026-10-18T19:31:00Z">
+      <w:ins w:id="326" w:author="Eduardo Flach" w:date="2026-10-18T19:31:00Z">
         <w:r>
           <w:t xml:space="preserve"> since 2020</w:t>
         </w:r>
       </w:ins>
-      <w:ins w:id="280" w:author="Eduardo Flach" w:date="2026-10-18T19:33:00Z">
+      <w:ins w:id="327" w:author="Eduardo Flach" w:date="2026-10-18T19:33:00Z">
         <w:r>
           <w:t xml:space="preserve"> from a handcraft products company based in Brazil.</w:t>
         </w:r>
       </w:ins>
-      <w:ins w:id="281" w:author="Eduardo Flach" w:date="2026-10-18T19:32:00Z">
+      <w:ins w:id="328" w:author="Eduardo Flach" w:date="2026-10-18T19:32:00Z">
         <w:r>
           <w:t xml:space="preserve"> </w:t>
         </w:r>
       </w:ins>
-      <w:ins w:id="282" w:author="Eduardo Flach" w:date="2026-10-18T19:33:00Z">
+      <w:ins w:id="329" w:author="Eduardo Flach" w:date="2026-10-18T19:33:00Z">
         <w:r>
           <w:t>W</w:t>
         </w:r>
       </w:ins>
-      <w:ins w:id="283" w:author="Eduardo Flach" w:date="2026-10-18T19:32:00Z">
+      <w:ins w:id="330" w:author="Eduardo Flach" w:date="2026-10-18T19:32:00Z">
         <w:r>
           <w:t xml:space="preserve">ith more than 500 sales </w:t>
         </w:r>
       </w:ins>
-      <w:ins w:id="284" w:author="Eduardo Flach" w:date="2026-10-18T19:33:00Z">
+      <w:ins w:id="331" w:author="Eduardo Flach" w:date="2026-10-18T19:33:00Z">
         <w:r>
           <w:t>since the beginning, the quantity of the data available to work w</w:t>
         </w:r>
       </w:ins>
-      <w:ins w:id="285" w:author="Eduardo Flach" w:date="2026-10-18T19:34:00Z">
+      <w:ins w:id="332" w:author="Eduardo Flach" w:date="2026-10-18T19:34:00Z">
         <w:r>
           <w:t xml:space="preserve">ith is expected to be higher 500. </w:t>
         </w:r>
@@ -5784,52 +6135,53 @@
       <w:pPr>
         <w:jc w:val="both"/>
         <w:rPr>
-          <w:ins w:id="286" w:author="Eduardo Flach" w:date="2026-10-12T17:15:00Z"/>
-        </w:rPr>
-        <w:pPrChange w:id="287" w:author="Eduardo Flach" w:date="2026-10-20T11:58:00Z">
+          <w:ins w:id="333" w:author="Eduardo Flach" w:date="2026-10-12T17:15:00Z"/>
+        </w:rPr>
+        <w:pPrChange w:id="334" w:author="Eduardo Flach" w:date="2026-10-20T11:58:00Z">
           <w:pPr>
             <w:pStyle w:val="Ttulo1"/>
             <w:spacing w:before="0"/>
           </w:pPr>
         </w:pPrChange>
       </w:pPr>
-      <w:ins w:id="288" w:author="Eduardo Flach" w:date="2026-10-18T19:35:00Z">
-        <w:r>
+      <w:ins w:id="335" w:author="Eduardo Flach" w:date="2026-10-18T19:35:00Z">
+        <w:r>
+          <w:lastRenderedPageBreak/>
           <w:tab/>
           <w:t xml:space="preserve">The data will have categorical and numerical variable, such as </w:t>
         </w:r>
       </w:ins>
-      <w:ins w:id="289" w:author="Eduardo Flach" w:date="2026-10-18T19:36:00Z">
+      <w:ins w:id="336" w:author="Eduardo Flach" w:date="2026-10-18T19:36:00Z">
         <w:r>
           <w:t>“zip code”, “gender”, “</w:t>
         </w:r>
       </w:ins>
-      <w:ins w:id="290" w:author="Eduardo Flach" w:date="2026-10-18T19:37:00Z">
+      <w:ins w:id="337" w:author="Eduardo Flach" w:date="2026-10-18T19:37:00Z">
         <w:r>
           <w:t>number</w:t>
         </w:r>
       </w:ins>
-      <w:ins w:id="291" w:author="Eduardo Flach" w:date="2026-10-18T19:36:00Z">
+      <w:ins w:id="338" w:author="Eduardo Flach" w:date="2026-10-18T19:36:00Z">
         <w:r>
           <w:t xml:space="preserve"> of sales”, “price”, etc</w:t>
         </w:r>
       </w:ins>
-      <w:ins w:id="292" w:author="Eduardo Flach" w:date="2026-10-18T19:37:00Z">
+      <w:ins w:id="339" w:author="Eduardo Flach" w:date="2026-10-18T19:37:00Z">
         <w:r>
           <w:t>. This project will have a huge impact on the current business</w:t>
         </w:r>
       </w:ins>
-      <w:ins w:id="293" w:author="Eduardo Flach" w:date="2026-10-18T19:38:00Z">
+      <w:ins w:id="340" w:author="Eduardo Flach" w:date="2026-10-18T19:38:00Z">
         <w:r>
           <w:t>, because it will give the owner some guidance based on fact</w:t>
         </w:r>
       </w:ins>
-      <w:ins w:id="294" w:author="Eduardo Flach" w:date="2026-10-18T19:39:00Z">
+      <w:ins w:id="341" w:author="Eduardo Flach" w:date="2026-10-18T19:39:00Z">
         <w:r>
           <w:t xml:space="preserve">s to improve the capacity of </w:t>
         </w:r>
       </w:ins>
-      <w:ins w:id="295" w:author="Eduardo Flach" w:date="2026-10-18T19:40:00Z">
+      <w:ins w:id="342" w:author="Eduardo Flach" w:date="2026-10-18T19:40:00Z">
         <w:r>
           <w:t>the business decision in important matters.</w:t>
         </w:r>
@@ -5839,9 +6191,9 @@
       <w:pPr>
         <w:jc w:val="both"/>
         <w:rPr>
-          <w:ins w:id="296" w:author="Eduardo Flach" w:date="2026-10-12T17:15:00Z"/>
-        </w:rPr>
-        <w:pPrChange w:id="297" w:author="Eduardo Flach" w:date="2026-10-20T11:58:00Z">
+          <w:ins w:id="343" w:author="Eduardo Flach" w:date="2026-10-12T17:15:00Z"/>
+        </w:rPr>
+        <w:pPrChange w:id="344" w:author="Eduardo Flach" w:date="2026-10-20T11:58:00Z">
           <w:pPr/>
         </w:pPrChange>
       </w:pPr>
@@ -5852,65 +6204,65 @@
         <w:spacing w:before="0"/>
         <w:jc w:val="both"/>
         <w:rPr>
-          <w:ins w:id="298" w:author="Eduardo Flach" w:date="2026-10-20T11:04:00Z"/>
-        </w:rPr>
-        <w:pPrChange w:id="299" w:author="Eduardo Flach" w:date="2026-10-20T11:58:00Z">
+          <w:ins w:id="345" w:author="Eduardo Flach" w:date="2026-10-20T11:04:00Z"/>
+        </w:rPr>
+        <w:pPrChange w:id="346" w:author="Eduardo Flach" w:date="2026-10-20T11:58:00Z">
           <w:pPr>
             <w:pStyle w:val="Ttulo1"/>
             <w:spacing w:before="0"/>
           </w:pPr>
         </w:pPrChange>
       </w:pPr>
-      <w:bookmarkStart w:id="300" w:name="_Toc243389960"/>
-      <w:ins w:id="301" w:author="Eduardo Flach" w:date="2026-10-12T17:16:00Z">
+      <w:bookmarkStart w:id="347" w:name="_Toc243389960"/>
+      <w:ins w:id="348" w:author="Eduardo Flach" w:date="2026-10-12T17:16:00Z">
         <w:r>
           <w:t>Expected Deliverables</w:t>
         </w:r>
       </w:ins>
-      <w:bookmarkEnd w:id="300"/>
+      <w:bookmarkEnd w:id="347"/>
     </w:p>
     <w:p>
       <w:pPr>
         <w:jc w:val="both"/>
         <w:rPr>
-          <w:ins w:id="302" w:author="Eduardo Flach" w:date="2026-10-20T11:36:00Z"/>
-        </w:rPr>
-        <w:pPrChange w:id="303" w:author="Eduardo Flach" w:date="2026-10-20T11:58:00Z">
+          <w:ins w:id="349" w:author="Eduardo Flach" w:date="2026-10-20T11:36:00Z"/>
+        </w:rPr>
+        <w:pPrChange w:id="350" w:author="Eduardo Flach" w:date="2026-10-20T11:58:00Z">
           <w:pPr/>
         </w:pPrChange>
       </w:pPr>
-      <w:ins w:id="304" w:author="Eduardo Flach" w:date="2026-10-20T11:04:00Z">
+      <w:ins w:id="351" w:author="Eduardo Flach" w:date="2026-10-20T11:04:00Z">
         <w:r>
           <w:tab/>
           <w:t>The present work expect</w:t>
         </w:r>
       </w:ins>
-      <w:ins w:id="305" w:author="Eduardo Flach" w:date="2026-10-20T11:06:00Z">
+      <w:ins w:id="352" w:author="Eduardo Flach" w:date="2026-10-20T11:06:00Z">
         <w:r>
           <w:t>s</w:t>
         </w:r>
       </w:ins>
-      <w:ins w:id="306" w:author="Eduardo Flach" w:date="2026-10-20T11:04:00Z">
+      <w:ins w:id="353" w:author="Eduardo Flach" w:date="2026-10-20T11:04:00Z">
         <w:r>
           <w:t xml:space="preserve"> to </w:t>
         </w:r>
       </w:ins>
-      <w:ins w:id="307" w:author="Eduardo Flach" w:date="2026-10-20T11:05:00Z">
+      <w:ins w:id="354" w:author="Eduardo Flach" w:date="2026-10-20T11:05:00Z">
         <w:r>
           <w:t xml:space="preserve">answer the 3 aims and objectives presented before. The </w:t>
         </w:r>
       </w:ins>
-      <w:ins w:id="308" w:author="Eduardo Flach" w:date="2026-10-20T11:06:00Z">
+      <w:ins w:id="355" w:author="Eduardo Flach" w:date="2026-10-20T11:06:00Z">
         <w:r>
           <w:t xml:space="preserve">main goal is to </w:t>
         </w:r>
       </w:ins>
-      <w:ins w:id="309" w:author="Eduardo Flach" w:date="2026-10-20T11:35:00Z">
+      <w:ins w:id="356" w:author="Eduardo Flach" w:date="2026-10-20T11:35:00Z">
         <w:r>
           <w:t>show</w:t>
         </w:r>
       </w:ins>
-      <w:ins w:id="310" w:author="Eduardo Flach" w:date="2026-10-20T11:34:00Z">
+      <w:ins w:id="357" w:author="Eduardo Flach" w:date="2026-10-20T11:34:00Z">
         <w:r>
           <w:t xml:space="preserve"> the owner the number of possibilities that a decent data storage can provide for her business. </w:t>
         </w:r>
@@ -5920,38 +6272,37 @@
       <w:pPr>
         <w:jc w:val="both"/>
         <w:rPr>
-          <w:ins w:id="311" w:author="Eduardo Flach" w:date="2026-10-12T17:16:00Z"/>
-        </w:rPr>
-        <w:pPrChange w:id="312" w:author="Eduardo Flach" w:date="2026-10-20T11:58:00Z">
+          <w:ins w:id="358" w:author="Eduardo Flach" w:date="2026-10-12T17:16:00Z"/>
+        </w:rPr>
+        <w:pPrChange w:id="359" w:author="Eduardo Flach" w:date="2026-10-20T11:58:00Z">
           <w:pPr>
             <w:pStyle w:val="Ttulo1"/>
             <w:spacing w:before="0"/>
           </w:pPr>
         </w:pPrChange>
       </w:pPr>
-      <w:ins w:id="313" w:author="Eduardo Flach" w:date="2026-10-20T11:36:00Z">
-        <w:r>
-          <w:lastRenderedPageBreak/>
+      <w:ins w:id="360" w:author="Eduardo Flach" w:date="2026-10-20T11:36:00Z">
+        <w:r>
           <w:tab/>
           <w:t>Answer the second and third question is also important for the project. It will have a huge impact o</w:t>
         </w:r>
       </w:ins>
-      <w:ins w:id="314" w:author="Eduardo Flach" w:date="2026-10-20T11:37:00Z">
+      <w:ins w:id="361" w:author="Eduardo Flach" w:date="2026-10-20T11:37:00Z">
         <w:r>
           <w:t>n</w:t>
         </w:r>
       </w:ins>
-      <w:ins w:id="315" w:author="Eduardo Flach" w:date="2026-10-20T11:35:00Z">
+      <w:ins w:id="362" w:author="Eduardo Flach" w:date="2026-10-20T11:35:00Z">
         <w:r>
           <w:t xml:space="preserve"> </w:t>
         </w:r>
       </w:ins>
-      <w:ins w:id="316" w:author="Eduardo Flach" w:date="2026-10-20T11:37:00Z">
+      <w:ins w:id="363" w:author="Eduardo Flach" w:date="2026-10-20T11:37:00Z">
         <w:r>
           <w:t>the business and it can help the owner to put the money more wisely into the business. Doing so, helps the owner to expand the brand fo</w:t>
         </w:r>
       </w:ins>
-      <w:ins w:id="317" w:author="Eduardo Flach" w:date="2026-10-20T11:38:00Z">
+      <w:ins w:id="364" w:author="Eduardo Flach" w:date="2026-10-20T11:38:00Z">
         <w:r>
           <w:t>r other markets.</w:t>
         </w:r>
@@ -5961,9 +6312,9 @@
       <w:pPr>
         <w:jc w:val="both"/>
         <w:rPr>
-          <w:ins w:id="318" w:author="Eduardo Flach" w:date="2026-10-12T17:16:00Z"/>
-        </w:rPr>
-        <w:pPrChange w:id="319" w:author="Eduardo Flach" w:date="2026-10-20T11:58:00Z">
+          <w:ins w:id="365" w:author="Eduardo Flach" w:date="2026-10-12T17:16:00Z"/>
+        </w:rPr>
+        <w:pPrChange w:id="366" w:author="Eduardo Flach" w:date="2026-10-20T11:58:00Z">
           <w:pPr/>
         </w:pPrChange>
       </w:pPr>
@@ -5974,44 +6325,44 @@
         <w:spacing w:before="0"/>
         <w:jc w:val="both"/>
         <w:rPr>
-          <w:ins w:id="320" w:author="Eduardo Flach" w:date="2026-10-20T11:48:00Z"/>
-        </w:rPr>
-        <w:pPrChange w:id="321" w:author="Eduardo Flach" w:date="2026-10-20T11:58:00Z">
+          <w:ins w:id="367" w:author="Eduardo Flach" w:date="2026-10-20T11:48:00Z"/>
+        </w:rPr>
+        <w:pPrChange w:id="368" w:author="Eduardo Flach" w:date="2026-10-20T11:58:00Z">
           <w:pPr>
             <w:pStyle w:val="Ttulo1"/>
             <w:spacing w:before="0"/>
           </w:pPr>
         </w:pPrChange>
       </w:pPr>
-      <w:bookmarkStart w:id="322" w:name="_Toc243389961"/>
-      <w:ins w:id="323" w:author="Eduardo Flach" w:date="2026-10-12T17:16:00Z">
+      <w:bookmarkStart w:id="369" w:name="_Toc243389961"/>
+      <w:ins w:id="370" w:author="Eduardo Flach" w:date="2026-10-12T17:16:00Z">
         <w:r>
           <w:t>Project Timeline</w:t>
         </w:r>
       </w:ins>
-      <w:bookmarkEnd w:id="322"/>
+      <w:bookmarkEnd w:id="369"/>
     </w:p>
     <w:p>
       <w:pPr>
         <w:jc w:val="both"/>
         <w:rPr>
-          <w:ins w:id="324" w:author="Eduardo Flach" w:date="2026-10-20T11:51:00Z"/>
-        </w:rPr>
-        <w:pPrChange w:id="325" w:author="Eduardo Flach" w:date="2026-10-20T11:58:00Z">
+          <w:ins w:id="371" w:author="Eduardo Flach" w:date="2026-10-20T11:51:00Z"/>
+        </w:rPr>
+        <w:pPrChange w:id="372" w:author="Eduardo Flach" w:date="2026-10-20T11:58:00Z">
           <w:pPr/>
         </w:pPrChange>
       </w:pPr>
-      <w:ins w:id="326" w:author="Eduardo Flach" w:date="2026-10-20T11:51:00Z">
+      <w:ins w:id="373" w:author="Eduardo Flach" w:date="2026-10-20T11:51:00Z">
         <w:r>
           <w:tab/>
         </w:r>
       </w:ins>
-      <w:ins w:id="327" w:author="Eduardo Flach" w:date="2026-10-20T11:52:00Z">
+      <w:ins w:id="374" w:author="Eduardo Flach" w:date="2026-10-20T11:52:00Z">
         <w:r>
           <w:t>The work on the project will occur during two semesters, following the steps and time proposal as below</w:t>
         </w:r>
       </w:ins>
-      <w:ins w:id="328" w:author="Eduardo Flach" w:date="2026-10-20T11:53:00Z">
+      <w:ins w:id="375" w:author="Eduardo Flach" w:date="2026-10-20T11:53:00Z">
         <w:r>
           <w:t>.</w:t>
         </w:r>
@@ -6021,17 +6372,20 @@
       <w:pPr>
         <w:jc w:val="both"/>
         <w:rPr>
-          <w:ins w:id="329" w:author="Eduardo Flach" w:date="2026-10-12T17:18:00Z"/>
-        </w:rPr>
-        <w:pPrChange w:id="330" w:author="Eduardo Flach" w:date="2026-10-20T11:58:00Z">
+          <w:ins w:id="376" w:author="Eduardo Flach" w:date="2026-10-12T17:18:00Z"/>
+        </w:rPr>
+        <w:pPrChange w:id="377" w:author="Eduardo Flach" w:date="2026-10-20T11:58:00Z">
           <w:pPr>
             <w:pStyle w:val="Ttulo1"/>
             <w:spacing w:before="0"/>
           </w:pPr>
         </w:pPrChange>
       </w:pPr>
-      <w:ins w:id="331" w:author="Eduardo Flach" w:date="2026-10-20T11:50:00Z">
-        <w:r>
+      <w:ins w:id="378" w:author="Eduardo Flach" w:date="2026-10-20T11:50:00Z">
+        <w:r>
+          <w:rPr>
+            <w:noProof/>
+          </w:rPr>
           <w:drawing>
             <wp:inline distT="0" distB="0" distL="0" distR="0" wp14:anchorId="2A8BF406" wp14:editId="44DD2230">
               <wp:extent cx="5731510" cy="1302385"/>
@@ -6074,9 +6428,9 @@
       <w:pPr>
         <w:jc w:val="both"/>
         <w:rPr>
-          <w:ins w:id="332" w:author="Eduardo Flach" w:date="2026-10-12T17:18:00Z"/>
-        </w:rPr>
-        <w:pPrChange w:id="333" w:author="Eduardo Flach" w:date="2026-10-20T11:58:00Z">
+          <w:ins w:id="379" w:author="Eduardo Flach" w:date="2026-10-12T17:18:00Z"/>
+        </w:rPr>
+        <w:pPrChange w:id="380" w:author="Eduardo Flach" w:date="2026-10-20T11:58:00Z">
           <w:pPr/>
         </w:pPrChange>
       </w:pPr>
@@ -6087,72 +6441,66 @@
         <w:spacing w:before="0"/>
         <w:jc w:val="both"/>
         <w:rPr>
-          <w:ins w:id="334" w:author="Eduardo Flach" w:date="2026-10-12T17:18:00Z"/>
-        </w:rPr>
-        <w:pPrChange w:id="335" w:author="Eduardo Flach" w:date="2026-10-20T11:58:00Z">
+          <w:ins w:id="381" w:author="Eduardo Flach" w:date="2026-10-12T17:18:00Z"/>
+        </w:rPr>
+        <w:pPrChange w:id="382" w:author="Eduardo Flach" w:date="2026-10-20T11:58:00Z">
           <w:pPr>
             <w:pStyle w:val="Ttulo1"/>
             <w:spacing w:before="0"/>
           </w:pPr>
         </w:pPrChange>
       </w:pPr>
-      <w:bookmarkStart w:id="336" w:name="_Toc243389962"/>
-      <w:ins w:id="337" w:author="Eduardo Flach" w:date="2026-10-12T17:18:00Z">
+      <w:bookmarkStart w:id="383" w:name="_Toc243389962"/>
+      <w:ins w:id="384" w:author="Eduardo Flach" w:date="2026-10-12T17:18:00Z">
         <w:r>
           <w:t>Ethical</w:t>
         </w:r>
       </w:ins>
-      <w:ins w:id="338" w:author="Eduardo Flach" w:date="2026-10-12T17:19:00Z">
+      <w:ins w:id="385" w:author="Eduardo Flach" w:date="2026-10-12T17:19:00Z">
         <w:r>
           <w:t xml:space="preserve"> and Legal Considerations</w:t>
         </w:r>
       </w:ins>
-      <w:bookmarkEnd w:id="336"/>
+      <w:bookmarkEnd w:id="383"/>
     </w:p>
     <w:p>
       <w:pPr>
         <w:jc w:val="both"/>
         <w:rPr>
-          <w:ins w:id="339" w:author="Eduardo Flach" w:date="2026-10-20T11:54:00Z"/>
-        </w:rPr>
-        <w:pPrChange w:id="340" w:author="Eduardo Flach" w:date="2026-10-20T11:58:00Z">
+          <w:ins w:id="386" w:author="Eduardo Flach" w:date="2026-10-20T11:54:00Z"/>
+        </w:rPr>
+        <w:pPrChange w:id="387" w:author="Eduardo Flach" w:date="2026-10-20T11:58:00Z">
           <w:pPr/>
         </w:pPrChange>
       </w:pPr>
-      <w:ins w:id="341" w:author="Eduardo Flach" w:date="2026-10-20T11:54:00Z">
+      <w:ins w:id="388" w:author="Eduardo Flach" w:date="2026-10-20T11:54:00Z">
         <w:r>
           <w:tab/>
         </w:r>
       </w:ins>
-      <w:ins w:id="342" w:author="Eduardo Flach" w:date="2026-10-20T11:55:00Z">
+      <w:ins w:id="389" w:author="Eduardo Flach" w:date="2026-10-20T11:55:00Z">
         <w:r>
           <w:t>The owner allows the usage</w:t>
         </w:r>
       </w:ins>
-      <w:ins w:id="343" w:author="Eduardo Flach" w:date="2026-10-20T11:56:00Z">
+      <w:ins w:id="390" w:author="Eduardo Flach" w:date="2026-10-20T11:56:00Z">
         <w:r>
           <w:t xml:space="preserve"> of the data for academic purpose</w:t>
         </w:r>
       </w:ins>
-      <w:ins w:id="344" w:author="Eduardo Flach" w:date="2026-10-20T11:57:00Z">
+      <w:ins w:id="391" w:author="Eduardo Flach" w:date="2026-10-20T11:57:00Z">
         <w:r>
           <w:t xml:space="preserve"> only,</w:t>
         </w:r>
       </w:ins>
-      <w:ins w:id="345" w:author="Eduardo Flach" w:date="2026-10-20T11:56:00Z">
+      <w:ins w:id="392" w:author="Eduardo Flach" w:date="2026-10-20T11:56:00Z">
         <w:r>
           <w:t xml:space="preserve"> inside the CCT </w:t>
         </w:r>
       </w:ins>
-      <w:ins w:id="346" w:author="Eduardo Flach" w:date="2026-10-20T11:57:00Z">
-        <w:r>
-          <w:t>environment. Therefore, t</w:t>
-        </w:r>
-        <w:r>
-          <w:t xml:space="preserve">he data should </w:t>
-        </w:r>
-        <w:r>
-          <w:t>not be used outside the CCT environment.</w:t>
+      <w:ins w:id="393" w:author="Eduardo Flach" w:date="2026-10-20T11:57:00Z">
+        <w:r>
+          <w:t>environment. Therefore, the data should not be used outside the CCT environment.</w:t>
         </w:r>
       </w:ins>
     </w:p>
@@ -6161,16 +6509,16 @@
         <w:ind w:firstLine="720"/>
         <w:jc w:val="both"/>
         <w:rPr>
-          <w:ins w:id="347" w:author="Eduardo Flach" w:date="2026-10-12T17:16:00Z"/>
-        </w:rPr>
-        <w:pPrChange w:id="348" w:author="Eduardo Flach" w:date="2026-10-20T11:58:00Z">
+          <w:ins w:id="394" w:author="Eduardo Flach" w:date="2026-10-12T17:16:00Z"/>
+        </w:rPr>
+        <w:pPrChange w:id="395" w:author="Eduardo Flach" w:date="2026-10-20T11:58:00Z">
           <w:pPr>
             <w:pStyle w:val="Ttulo1"/>
             <w:spacing w:before="0"/>
           </w:pPr>
         </w:pPrChange>
       </w:pPr>
-      <w:ins w:id="349" w:author="Eduardo Flach" w:date="2026-10-20T11:54:00Z">
+      <w:ins w:id="396" w:author="Eduardo Flach" w:date="2026-10-20T11:54:00Z">
         <w:r>
           <w:t xml:space="preserve">No further consideration regarding the data protection. </w:t>
         </w:r>
@@ -6179,9 +6527,9 @@
     <w:p>
       <w:pPr>
         <w:rPr>
-          <w:ins w:id="350" w:author="Eduardo Flach" w:date="2026-10-12T17:16:00Z"/>
-        </w:rPr>
-        <w:pPrChange w:id="351" w:author="Eduardo Flach" w:date="2026-10-12T17:16:00Z">
+          <w:del w:id="397" w:author="Eduardo Flach" w:date="2026-10-21T19:36:00Z"/>
+        </w:rPr>
+        <w:pPrChange w:id="398" w:author="Eduardo Flach" w:date="2026-10-12T17:14:00Z">
           <w:pPr>
             <w:pStyle w:val="Ttulo1"/>
             <w:spacing w:before="0"/>
@@ -6191,248 +6539,214 @@
     </w:p>
     <w:p>
       <w:pPr>
-        <w:rPr>
-          <w:ins w:id="352" w:author="Eduardo Flach" w:date="2026-10-12T17:15:00Z"/>
-        </w:rPr>
-        <w:pPrChange w:id="353" w:author="Eduardo Flach" w:date="2026-10-12T17:16:00Z">
-          <w:pPr>
-            <w:pStyle w:val="Ttulo1"/>
-            <w:spacing w:before="0"/>
-          </w:pPr>
-        </w:pPrChange>
-      </w:pPr>
-    </w:p>
-    <w:p>
-      <w:pPr>
-        <w:rPr>
-          <w:ins w:id="354" w:author="Eduardo Flach" w:date="2026-10-12T17:15:00Z"/>
-        </w:rPr>
-        <w:pPrChange w:id="355" w:author="Eduardo Flach" w:date="2026-10-12T17:15:00Z">
-          <w:pPr>
-            <w:pStyle w:val="Ttulo1"/>
-            <w:spacing w:before="0"/>
-          </w:pPr>
-        </w:pPrChange>
-      </w:pPr>
-    </w:p>
-    <w:p>
-      <w:pPr>
-        <w:rPr>
-          <w:ins w:id="356" w:author="Eduardo Flach" w:date="2026-10-12T17:14:00Z"/>
-        </w:rPr>
-        <w:pPrChange w:id="357" w:author="Eduardo Flach" w:date="2026-10-12T17:15:00Z">
-          <w:pPr>
-            <w:pStyle w:val="Ttulo1"/>
-            <w:spacing w:before="0"/>
-          </w:pPr>
-        </w:pPrChange>
-      </w:pPr>
-    </w:p>
-    <w:p>
-      <w:pPr>
-        <w:rPr>
-          <w:ins w:id="358" w:author="Eduardo Flach" w:date="2026-10-12T17:14:00Z"/>
-        </w:rPr>
-        <w:pPrChange w:id="359" w:author="Eduardo Flach" w:date="2026-10-12T17:14:00Z">
-          <w:pPr>
-            <w:pStyle w:val="Ttulo1"/>
-            <w:spacing w:before="0"/>
-          </w:pPr>
-        </w:pPrChange>
-      </w:pPr>
-    </w:p>
-    <w:p>
-      <w:pPr>
-        <w:rPr>
-          <w:ins w:id="360" w:author="Eduardo Flach" w:date="2026-10-12T17:14:00Z"/>
-        </w:rPr>
-        <w:pPrChange w:id="361" w:author="Eduardo Flach" w:date="2026-10-12T17:14:00Z">
-          <w:pPr>
-            <w:pStyle w:val="Ttulo1"/>
-            <w:spacing w:before="0"/>
-          </w:pPr>
-        </w:pPrChange>
-      </w:pPr>
-    </w:p>
-    <w:p>
-      <w:pPr>
-        <w:pPrChange w:id="362" w:author="Eduardo Flach" w:date="2026-10-12T17:14:00Z">
-          <w:pPr>
-            <w:pStyle w:val="Ttulo1"/>
-            <w:spacing w:before="0"/>
-          </w:pPr>
-        </w:pPrChange>
-      </w:pPr>
-    </w:p>
-    <w:p>
-      <w:pPr>
         <w:pStyle w:val="Ttulo2"/>
-      </w:pPr>
-      <w:bookmarkStart w:id="363" w:name="_Toc243389963"/>
-      <w:r>
-        <w:t>Chapter 1.1</w:t>
-      </w:r>
-      <w:bookmarkEnd w:id="363"/>
+        <w:rPr>
+          <w:del w:id="399" w:author="Eduardo Flach" w:date="2026-10-21T19:36:00Z"/>
+        </w:rPr>
+      </w:pPr>
+      <w:bookmarkStart w:id="400" w:name="_Toc243389963"/>
+      <w:del w:id="401" w:author="Eduardo Flach" w:date="2026-10-21T19:36:00Z">
+        <w:r>
+          <w:delText>Chapter 1.1</w:delText>
+        </w:r>
+        <w:bookmarkEnd w:id="400"/>
+      </w:del>
     </w:p>
     <w:p>
       <w:pPr>
         <w:pStyle w:val="Ttulo3"/>
-      </w:pPr>
-      <w:bookmarkStart w:id="364" w:name="_Toc243389964"/>
-      <w:r>
-        <w:t>Chapter 1.1.1.</w:t>
-      </w:r>
-      <w:bookmarkEnd w:id="364"/>
-    </w:p>
-    <w:p/>
-    <w:p>
-      <w:r>
-        <w:rPr>
-          <w:noProof/>
-        </w:rPr>
-        <w:drawing>
-          <wp:inline distT="0" distB="0" distL="0" distR="0" wp14:anchorId="3D568519" wp14:editId="3B3CDB16">
-            <wp:extent cx="3571875" cy="819150"/>
-            <wp:effectExtent l="0" t="0" r="0" b="0"/>
-            <wp:docPr id="1728545884" name="image2.png" descr="A screenshot of a computer&#10;&#10;Description automatically generated"/>
-            <wp:cNvGraphicFramePr/>
-            <a:graphic xmlns:a="http://schemas.openxmlformats.org/drawingml/2006/main">
-              <a:graphicData uri="http://schemas.openxmlformats.org/drawingml/2006/picture">
-                <pic:pic xmlns:pic="http://schemas.openxmlformats.org/drawingml/2006/picture">
-                  <pic:nvPicPr>
-                    <pic:cNvPr id="0" name="image2.png" descr="A screenshot of a computer&#10;&#10;Description automatically generated"/>
-                    <pic:cNvPicPr preferRelativeResize="0"/>
-                  </pic:nvPicPr>
-                  <pic:blipFill>
-                    <a:blip r:embed="rId17"/>
-                    <a:srcRect/>
-                    <a:stretch>
-                      <a:fillRect/>
-                    </a:stretch>
-                  </pic:blipFill>
-                  <pic:spPr>
-                    <a:xfrm>
-                      <a:off x="0" y="0"/>
-                      <a:ext cx="3571875" cy="819150"/>
-                    </a:xfrm>
-                    <a:prstGeom prst="rect">
-                      <a:avLst/>
-                    </a:prstGeom>
-                    <a:ln/>
-                  </pic:spPr>
-                </pic:pic>
-              </a:graphicData>
-            </a:graphic>
-          </wp:inline>
-        </w:drawing>
-      </w:r>
-    </w:p>
-    <w:p>
-      <w:pPr>
-        <w:rPr>
-          <w:color w:val="FF0000"/>
-        </w:rPr>
-      </w:pPr>
-    </w:p>
-    <w:p>
-      <w:pPr>
-        <w:rPr>
-          <w:color w:val="FF0000"/>
-        </w:rPr>
-      </w:pPr>
-      <w:r>
-        <w:rPr>
-          <w:color w:val="FF0000"/>
-        </w:rPr>
-        <w:lastRenderedPageBreak/>
-        <w:t>[NOTE: For the table of contents to function properly, you must use the correct headings for all your chapters and subchapters.</w:t>
-      </w:r>
-    </w:p>
-    <w:p>
-      <w:pPr>
-        <w:rPr>
-          <w:color w:val="FF0000"/>
-        </w:rPr>
-      </w:pPr>
-      <w:r>
-        <w:rPr>
-          <w:b/>
-          <w:color w:val="FF0000"/>
-        </w:rPr>
-        <w:t>Heading 1:</w:t>
-      </w:r>
-      <w:r>
-        <w:rPr>
-          <w:color w:val="FF0000"/>
-        </w:rPr>
-        <w:t xml:space="preserve"> This is the main heading and should be employed for the primary title or chapter. For example: CHAPTER 1.</w:t>
-      </w:r>
-    </w:p>
-    <w:p>
-      <w:pPr>
-        <w:rPr>
-          <w:color w:val="FF0000"/>
-        </w:rPr>
-      </w:pPr>
-      <w:r>
-        <w:rPr>
-          <w:b/>
-          <w:color w:val="FF0000"/>
-        </w:rPr>
-        <w:t>Heading 2:</w:t>
-      </w:r>
-      <w:r>
-        <w:rPr>
-          <w:color w:val="FF0000"/>
-        </w:rPr>
-        <w:t xml:space="preserve"> Use Heading 2 as a subheading. For instance: Chapter 1.1.</w:t>
-      </w:r>
-    </w:p>
-    <w:p>
-      <w:pPr>
-        <w:rPr>
-          <w:color w:val="FF0000"/>
-        </w:rPr>
-      </w:pPr>
-      <w:r>
-        <w:rPr>
-          <w:b/>
-          <w:color w:val="FF0000"/>
-        </w:rPr>
-        <w:t>Heading 3:</w:t>
-      </w:r>
-      <w:r>
-        <w:rPr>
-          <w:color w:val="FF0000"/>
-        </w:rPr>
-        <w:t xml:space="preserve"> Heading 3 provides a more detailed breakdown, such as Chapter 1.1.1.</w:t>
-      </w:r>
-    </w:p>
-    <w:p>
-      <w:pPr>
-        <w:rPr>
-          <w:color w:val="FF0000"/>
-        </w:rPr>
-      </w:pPr>
-      <w:r>
-        <w:rPr>
-          <w:color w:val="FF0000"/>
-        </w:rPr>
-        <w:t>By adhering to this hierarchical structure, you ensure an organized and effective document outline, enhancing readability and navigation. However, you are not forced to use all 3 headings, usually heading 1 and 2 are sufficient.</w:t>
-      </w:r>
-    </w:p>
-    <w:p>
-      <w:pPr>
-        <w:rPr>
-          <w:color w:val="FF0000"/>
-        </w:rPr>
-      </w:pPr>
-      <w:r>
-        <w:rPr>
-          <w:color w:val="FF0000"/>
-        </w:rPr>
-        <w:t>The remainder of your text should be written using a normal font.]</w:t>
-      </w:r>
+        <w:rPr>
+          <w:del w:id="402" w:author="Eduardo Flach" w:date="2026-10-21T19:36:00Z"/>
+        </w:rPr>
+      </w:pPr>
+      <w:bookmarkStart w:id="403" w:name="_Toc243389964"/>
+      <w:del w:id="404" w:author="Eduardo Flach" w:date="2026-10-21T19:36:00Z">
+        <w:r>
+          <w:delText>Chapter 1.1.1.</w:delText>
+        </w:r>
+        <w:bookmarkEnd w:id="403"/>
+      </w:del>
+    </w:p>
+    <w:p>
+      <w:pPr>
+        <w:rPr>
+          <w:del w:id="405" w:author="Eduardo Flach" w:date="2026-10-21T19:36:00Z"/>
+        </w:rPr>
+      </w:pPr>
+    </w:p>
+    <w:p>
+      <w:pPr>
+        <w:rPr>
+          <w:del w:id="406" w:author="Eduardo Flach" w:date="2026-10-21T19:36:00Z"/>
+        </w:rPr>
+      </w:pPr>
+      <w:del w:id="407" w:author="Eduardo Flach" w:date="2026-10-21T19:36:00Z">
+        <w:r>
+          <w:rPr>
+            <w:noProof/>
+          </w:rPr>
+          <w:drawing>
+            <wp:inline distT="0" distB="0" distL="0" distR="0" wp14:anchorId="3D568519" wp14:editId="3B3CDB16">
+              <wp:extent cx="3571875" cy="819150"/>
+              <wp:effectExtent l="0" t="0" r="0" b="0"/>
+              <wp:docPr id="1728545884" name="image2.png" descr="A screenshot of a computer&#10;&#10;Description automatically generated"/>
+              <wp:cNvGraphicFramePr/>
+              <a:graphic xmlns:a="http://schemas.openxmlformats.org/drawingml/2006/main">
+                <a:graphicData uri="http://schemas.openxmlformats.org/drawingml/2006/picture">
+                  <pic:pic xmlns:pic="http://schemas.openxmlformats.org/drawingml/2006/picture">
+                    <pic:nvPicPr>
+                      <pic:cNvPr id="0" name="image2.png" descr="A screenshot of a computer&#10;&#10;Description automatically generated"/>
+                      <pic:cNvPicPr preferRelativeResize="0"/>
+                    </pic:nvPicPr>
+                    <pic:blipFill>
+                      <a:blip r:embed="rId17"/>
+                      <a:srcRect/>
+                      <a:stretch>
+                        <a:fillRect/>
+                      </a:stretch>
+                    </pic:blipFill>
+                    <pic:spPr>
+                      <a:xfrm>
+                        <a:off x="0" y="0"/>
+                        <a:ext cx="3571875" cy="819150"/>
+                      </a:xfrm>
+                      <a:prstGeom prst="rect">
+                        <a:avLst/>
+                      </a:prstGeom>
+                      <a:ln/>
+                    </pic:spPr>
+                  </pic:pic>
+                </a:graphicData>
+              </a:graphic>
+            </wp:inline>
+          </w:drawing>
+        </w:r>
+      </w:del>
+    </w:p>
+    <w:p>
+      <w:pPr>
+        <w:rPr>
+          <w:del w:id="408" w:author="Eduardo Flach" w:date="2026-10-21T19:36:00Z"/>
+          <w:color w:val="FF0000"/>
+        </w:rPr>
+      </w:pPr>
+    </w:p>
+    <w:p>
+      <w:pPr>
+        <w:rPr>
+          <w:del w:id="409" w:author="Eduardo Flach" w:date="2026-10-21T19:36:00Z"/>
+          <w:color w:val="FF0000"/>
+        </w:rPr>
+      </w:pPr>
+      <w:del w:id="410" w:author="Eduardo Flach" w:date="2026-10-21T19:36:00Z">
+        <w:r>
+          <w:rPr>
+            <w:color w:val="FF0000"/>
+          </w:rPr>
+          <w:delText>[NOTE: For the table of contents to function properly, you must use the correct headings for all your chapters and subchapters.</w:delText>
+        </w:r>
+      </w:del>
+    </w:p>
+    <w:p>
+      <w:pPr>
+        <w:rPr>
+          <w:del w:id="411" w:author="Eduardo Flach" w:date="2026-10-21T19:36:00Z"/>
+          <w:color w:val="FF0000"/>
+        </w:rPr>
+      </w:pPr>
+      <w:del w:id="412" w:author="Eduardo Flach" w:date="2026-10-21T19:36:00Z">
+        <w:r>
+          <w:rPr>
+            <w:b/>
+            <w:color w:val="FF0000"/>
+          </w:rPr>
+          <w:delText>Heading 1:</w:delText>
+        </w:r>
+        <w:r>
+          <w:rPr>
+            <w:color w:val="FF0000"/>
+          </w:rPr>
+          <w:delText xml:space="preserve"> This is the main heading and should be employed for the primary title or chapter. For example: CHAPTER 1.</w:delText>
+        </w:r>
+      </w:del>
+    </w:p>
+    <w:p>
+      <w:pPr>
+        <w:rPr>
+          <w:del w:id="413" w:author="Eduardo Flach" w:date="2026-10-21T19:36:00Z"/>
+          <w:color w:val="FF0000"/>
+        </w:rPr>
+      </w:pPr>
+      <w:del w:id="414" w:author="Eduardo Flach" w:date="2026-10-21T19:36:00Z">
+        <w:r>
+          <w:rPr>
+            <w:b/>
+            <w:color w:val="FF0000"/>
+          </w:rPr>
+          <w:delText>Heading 2:</w:delText>
+        </w:r>
+        <w:r>
+          <w:rPr>
+            <w:color w:val="FF0000"/>
+          </w:rPr>
+          <w:delText xml:space="preserve"> Use Heading 2 as a subheading. For instance: Chapter 1.1.</w:delText>
+        </w:r>
+      </w:del>
+    </w:p>
+    <w:p>
+      <w:pPr>
+        <w:rPr>
+          <w:del w:id="415" w:author="Eduardo Flach" w:date="2026-10-21T19:36:00Z"/>
+          <w:color w:val="FF0000"/>
+        </w:rPr>
+      </w:pPr>
+      <w:del w:id="416" w:author="Eduardo Flach" w:date="2026-10-21T19:36:00Z">
+        <w:r>
+          <w:rPr>
+            <w:b/>
+            <w:color w:val="FF0000"/>
+          </w:rPr>
+          <w:delText>Heading 3:</w:delText>
+        </w:r>
+        <w:r>
+          <w:rPr>
+            <w:color w:val="FF0000"/>
+          </w:rPr>
+          <w:delText xml:space="preserve"> Heading 3 provides a more detailed breakdown, such as Chapter 1.1.1.</w:delText>
+        </w:r>
+      </w:del>
+    </w:p>
+    <w:p>
+      <w:pPr>
+        <w:rPr>
+          <w:del w:id="417" w:author="Eduardo Flach" w:date="2026-10-21T19:36:00Z"/>
+          <w:color w:val="FF0000"/>
+        </w:rPr>
+      </w:pPr>
+      <w:del w:id="418" w:author="Eduardo Flach" w:date="2026-10-21T19:36:00Z">
+        <w:r>
+          <w:rPr>
+            <w:color w:val="FF0000"/>
+          </w:rPr>
+          <w:delText>By adhering to this hierarchical structure, you ensure an organized and effective document outline, enhancing readability and navigation. However, you are not forced to use all 3 headings, usually heading 1 and 2 are sufficient.</w:delText>
+        </w:r>
+      </w:del>
+    </w:p>
+    <w:p>
+      <w:pPr>
+        <w:rPr>
+          <w:del w:id="419" w:author="Eduardo Flach" w:date="2026-10-21T19:36:00Z"/>
+          <w:color w:val="FF0000"/>
+        </w:rPr>
+      </w:pPr>
+      <w:del w:id="420" w:author="Eduardo Flach" w:date="2026-10-21T19:36:00Z">
+        <w:r>
+          <w:rPr>
+            <w:color w:val="FF0000"/>
+          </w:rPr>
+          <w:delText>The remainder of your text should be written using a normal font.]</w:delText>
+        </w:r>
+      </w:del>
     </w:p>
     <w:p/>
     <w:p/>
@@ -6443,32 +6757,245 @@
     <w:p/>
     <w:p/>
     <w:p/>
+    <w:p>
+      <w:pPr>
+        <w:rPr>
+          <w:ins w:id="421" w:author="Eduardo Flach" w:date="2026-10-21T19:37:00Z"/>
+        </w:rPr>
+      </w:pPr>
+    </w:p>
     <w:p/>
     <w:p/>
     <w:p/>
     <w:p>
       <w:pPr>
         <w:pStyle w:val="Ttulo1"/>
-      </w:pPr>
-      <w:bookmarkStart w:id="365" w:name="_Toc243389965"/>
-      <w:r>
-        <w:t>References</w:t>
-      </w:r>
-      <w:bookmarkEnd w:id="365"/>
-    </w:p>
-    <w:p/>
-    <w:p>
-      <w:pPr>
-        <w:rPr>
-          <w:color w:val="FF0000"/>
-        </w:rPr>
-      </w:pPr>
-      <w:r>
-        <w:rPr>
-          <w:color w:val="FF0000"/>
-        </w:rPr>
-        <w:t>Please list all the references you have used in your assignment alphabetically and in the Harvard style. You can find information on how to correctly reference in Harvard at this link: https://library.cct.ie/referencing/harvard</w:t>
-      </w:r>
+        <w:rPr>
+          <w:del w:id="422" w:author="Eduardo Flach" w:date="2026-10-21T20:25:00Z"/>
+        </w:rPr>
+      </w:pPr>
+      <w:bookmarkStart w:id="423" w:name="_Toc243389965"/>
+      <w:del w:id="424" w:author="Eduardo Flach" w:date="2026-10-21T20:25:00Z">
+        <w:r>
+          <w:delText>References</w:delText>
+        </w:r>
+        <w:bookmarkEnd w:id="423"/>
+      </w:del>
+    </w:p>
+    <w:customXmlInsRangeStart w:id="425" w:author="Eduardo Flach" w:date="2026-10-21T20:25:00Z"/>
+    <w:sdt>
+      <w:sdtPr>
+        <w:rPr>
+          <w:lang w:val="pt-BR"/>
+        </w:rPr>
+        <w:id w:val="1245999829"/>
+        <w:docPartObj>
+          <w:docPartGallery w:val="Bibliographies"/>
+          <w:docPartUnique/>
+        </w:docPartObj>
+      </w:sdtPr>
+      <w:sdtEndPr>
+        <w:rPr>
+          <w:rFonts w:eastAsia="Calibri" w:cs="Calibri"/>
+          <w:color w:val="auto"/>
+          <w:spacing w:val="0"/>
+          <w:kern w:val="0"/>
+          <w:sz w:val="22"/>
+          <w:szCs w:val="22"/>
+          <w:lang w:val="en-IE"/>
+        </w:rPr>
+      </w:sdtEndPr>
+      <w:sdtContent>
+        <w:customXmlInsRangeEnd w:id="425"/>
+        <w:p>
+          <w:pPr>
+            <w:pStyle w:val="Ttulo1"/>
+            <w:rPr>
+              <w:ins w:id="426" w:author="Eduardo Flach" w:date="2026-10-21T20:25:00Z"/>
+              <w:lang w:val="pt-BR"/>
+              <w:rPrChange w:id="427" w:author="Eduardo Flach" w:date="2026-10-21T20:25:00Z">
+                <w:rPr>
+                  <w:ins w:id="428" w:author="Eduardo Flach" w:date="2026-10-21T20:25:00Z"/>
+                </w:rPr>
+              </w:rPrChange>
+            </w:rPr>
+          </w:pPr>
+          <w:proofErr w:type="spellStart"/>
+          <w:ins w:id="429" w:author="Eduardo Flach" w:date="2026-10-21T20:25:00Z">
+            <w:r>
+              <w:rPr>
+                <w:lang w:val="pt-BR"/>
+              </w:rPr>
+              <w:t>References</w:t>
+            </w:r>
+            <w:proofErr w:type="spellEnd"/>
+          </w:ins>
+        </w:p>
+        <w:customXmlInsRangeStart w:id="430" w:author="Eduardo Flach" w:date="2026-10-21T20:25:00Z"/>
+        <w:sdt>
+          <w:sdtPr>
+            <w:id w:val="111145805"/>
+            <w:bibliography/>
+          </w:sdtPr>
+          <w:sdtContent>
+            <w:customXmlInsRangeEnd w:id="430"/>
+            <w:p>
+              <w:pPr>
+                <w:pStyle w:val="Bibliografia"/>
+                <w:rPr>
+                  <w:noProof/>
+                  <w:sz w:val="24"/>
+                  <w:szCs w:val="24"/>
+                  <w:lang w:val="pt-BR"/>
+                </w:rPr>
+              </w:pPr>
+              <w:ins w:id="431" w:author="Eduardo Flach" w:date="2026-10-21T20:25:00Z">
+                <w:r>
+                  <w:fldChar w:fldCharType="begin"/>
+                </w:r>
+                <w:r>
+                  <w:rPr>
+                    <w:lang w:val="pt-BR"/>
+                    <w:rPrChange w:id="432" w:author="Eduardo Flach" w:date="2026-10-21T20:25:00Z">
+                      <w:rPr/>
+                    </w:rPrChange>
+                  </w:rPr>
+                  <w:instrText>BIBLIOGRAPHY</w:instrText>
+                </w:r>
+                <w:r>
+                  <w:fldChar w:fldCharType="separate"/>
+                </w:r>
+              </w:ins>
+              <w:r>
+                <w:rPr>
+                  <w:noProof/>
+                  <w:lang w:val="pt-BR"/>
+                </w:rPr>
+                <w:t xml:space="preserve">Bernritter, S. K. P. a. S. F., 2021. Behaviorally targeted location-based mobile marketing’. </w:t>
+              </w:r>
+              <w:r>
+                <w:rPr>
+                  <w:i/>
+                  <w:iCs/>
+                  <w:noProof/>
+                  <w:lang w:val="pt-BR"/>
+                </w:rPr>
+                <w:t>Journal of the Academy of Marketing Science</w:t>
+              </w:r>
+              <w:r>
+                <w:rPr>
+                  <w:noProof/>
+                  <w:lang w:val="pt-BR"/>
+                </w:rPr>
+                <w:t>, p. 49:677–702.</w:t>
+              </w:r>
+            </w:p>
+            <w:p>
+              <w:pPr>
+                <w:pStyle w:val="Bibliografia"/>
+                <w:rPr>
+                  <w:noProof/>
+                  <w:lang w:val="pt-BR"/>
+                </w:rPr>
+              </w:pPr>
+              <w:r>
+                <w:rPr>
+                  <w:noProof/>
+                  <w:lang w:val="pt-BR"/>
+                </w:rPr>
+                <w:t xml:space="preserve">Günther, L. C. C. E. W. H.-H. B. C., 2019. Data quality assessment for improved decision-making: a methodology for small and medium-sized enterprises. </w:t>
+              </w:r>
+              <w:r>
+                <w:rPr>
+                  <w:i/>
+                  <w:iCs/>
+                  <w:noProof/>
+                  <w:lang w:val="pt-BR"/>
+                </w:rPr>
+                <w:t>Procedia Manufacturing</w:t>
+              </w:r>
+              <w:r>
+                <w:rPr>
+                  <w:noProof/>
+                  <w:lang w:val="pt-BR"/>
+                </w:rPr>
+                <w:t>, p. 583–591.</w:t>
+              </w:r>
+            </w:p>
+            <w:p>
+              <w:pPr>
+                <w:pStyle w:val="Bibliografia"/>
+                <w:rPr>
+                  <w:noProof/>
+                </w:rPr>
+              </w:pPr>
+              <w:r>
+                <w:rPr>
+                  <w:noProof/>
+                </w:rPr>
+                <w:t xml:space="preserve">Patrick ULRICH, W. B. A. F. E. R., 2018. Data Analytics Systems and SME type - a Design Science Approach. </w:t>
+              </w:r>
+              <w:r>
+                <w:rPr>
+                  <w:i/>
+                  <w:iCs/>
+                  <w:noProof/>
+                </w:rPr>
+                <w:t>ScienceDirect</w:t>
+              </w:r>
+              <w:r>
+                <w:rPr>
+                  <w:noProof/>
+                </w:rPr>
+                <w:t>, p. 1162–1170.</w:t>
+              </w:r>
+            </w:p>
+            <w:p>
+              <w:pPr>
+                <w:rPr>
+                  <w:ins w:id="433" w:author="Eduardo Flach" w:date="2026-10-21T20:25:00Z"/>
+                </w:rPr>
+              </w:pPr>
+              <w:ins w:id="434" w:author="Eduardo Flach" w:date="2026-10-21T20:25:00Z">
+                <w:r>
+                  <w:rPr>
+                    <w:b/>
+                    <w:bCs/>
+                  </w:rPr>
+                  <w:fldChar w:fldCharType="end"/>
+                </w:r>
+              </w:ins>
+            </w:p>
+            <w:customXmlInsRangeStart w:id="435" w:author="Eduardo Flach" w:date="2026-10-21T20:25:00Z"/>
+          </w:sdtContent>
+        </w:sdt>
+        <w:customXmlInsRangeEnd w:id="435"/>
+        <w:customXmlInsRangeStart w:id="436" w:author="Eduardo Flach" w:date="2026-10-21T20:25:00Z"/>
+      </w:sdtContent>
+    </w:sdt>
+    <w:customXmlInsRangeEnd w:id="436"/>
+    <w:p>
+      <w:pPr>
+        <w:rPr>
+          <w:del w:id="437" w:author="Eduardo Flach" w:date="2026-10-21T20:24:00Z"/>
+        </w:rPr>
+      </w:pPr>
+    </w:p>
+    <w:p>
+      <w:pPr>
+        <w:rPr>
+          <w:del w:id="438" w:author="Eduardo Flach" w:date="2026-10-21T20:24:00Z"/>
+          <w:color w:val="FF0000"/>
+        </w:rPr>
+      </w:pPr>
+      <w:del w:id="439" w:author="Eduardo Flach" w:date="2026-10-21T20:24:00Z">
+        <w:r>
+          <w:rPr>
+            <w:color w:val="FF0000"/>
+          </w:rPr>
+          <w:delText>Please list all the references you have used in your assignment alphabetically and in the Harvard style. You can find information on how to correctly reference in Harvard at this link: https://library.cct.ie/referencing/harvard</w:delText>
+        </w:r>
+      </w:del>
     </w:p>
     <w:p/>
     <w:p/>
@@ -6516,13 +7043,13 @@
       <w:pPr>
         <w:pStyle w:val="Ttulo1"/>
       </w:pPr>
-      <w:bookmarkStart w:id="366" w:name="_heading=h.kfkjs3rwl2c1" w:colFirst="0" w:colLast="0"/>
-      <w:bookmarkStart w:id="367" w:name="_Toc243389966"/>
-      <w:bookmarkEnd w:id="366"/>
+      <w:bookmarkStart w:id="440" w:name="_heading=h.kfkjs3rwl2c1" w:colFirst="0" w:colLast="0"/>
+      <w:bookmarkStart w:id="441" w:name="_Toc243389966"/>
+      <w:bookmarkEnd w:id="440"/>
       <w:r>
         <w:t>Appendix</w:t>
       </w:r>
-      <w:bookmarkEnd w:id="367"/>
+      <w:bookmarkEnd w:id="441"/>
     </w:p>
     <w:p/>
     <w:p>
@@ -6568,7 +7095,6 @@
         <w:rPr>
           <w:color w:val="FF0000"/>
         </w:rPr>
-        <w:lastRenderedPageBreak/>
         <w:t>If you haven't used AI tools and there's no need for supplementary data, you can remove the appendix section entirely.</w:t>
       </w:r>
     </w:p>
@@ -8695,6 +9221,14 @@
       <w:spacing w:after="0" w:line="240" w:lineRule="auto"/>
     </w:pPr>
   </w:style>
+  <w:style w:type="paragraph" w:styleId="Bibliografia">
+    <w:name w:val="Bibliography"/>
+    <w:basedOn w:val="Normal"/>
+    <w:next w:val="Normal"/>
+    <w:uiPriority w:val="37"/>
+    <w:unhideWhenUsed/>
+    <w:rsid w:val="001E1880"/>
+  </w:style>
 </w:styles>
 </file>
 
@@ -8994,10 +9528,6 @@
 </file>
 
 <file path=customXml/item1.xml><?xml version="1.0" encoding="utf-8"?>
-<b:Sources xmlns:b="http://schemas.openxmlformats.org/officeDocument/2006/bibliography" xmlns="http://schemas.openxmlformats.org/officeDocument/2006/bibliography" SelectedStyle="\APASixthEditionOfficeOnline.xsl" StyleName="APA" Version="6"/>
-</file>
-
-<file path=customXml/item2.xml><?xml version="1.0" encoding="utf-8"?>
 <ct:contentTypeSchema xmlns:ct="http://schemas.microsoft.com/office/2006/metadata/contentType" xmlns:ma="http://schemas.microsoft.com/office/2006/metadata/properties/metaAttributes" ct:_="" ma:_="" ma:contentTypeName="Document" ma:contentTypeID="0x01010091CA7052A48FB44E8BAE44044031FC77" ma:contentTypeVersion="5" ma:contentTypeDescription="Create a new document." ma:contentTypeScope="" ma:versionID="72110da391d7bf7bbbd9879cda66318c">
   <xsd:schema xmlns:xsd="http://www.w3.org/2001/XMLSchema" xmlns:xs="http://www.w3.org/2001/XMLSchema" xmlns:p="http://schemas.microsoft.com/office/2006/metadata/properties" xmlns:ns3="b16a9495-4dfd-42d3-807b-98cb11f03b43" targetNamespace="http://schemas.microsoft.com/office/2006/metadata/properties" ma:root="true" ma:fieldsID="65d4c4ab10123b5e2192ffab3149626d" ns3:_="">
     <xsd:import namespace="b16a9495-4dfd-42d3-807b-98cb11f03b43"/>
@@ -9147,21 +9677,7 @@
 </ct:contentTypeSchema>
 </file>
 
-<file path=customXml/item3.xml><?xml version="1.0" encoding="utf-8"?>
-<go:gDocsCustomXmlDataStorage xmlns:go="http://customooxmlschemas.google.com/" xmlns:r="http://schemas.openxmlformats.org/officeDocument/2006/relationships" uri="GoogleDocsCustomDataVersion2">
-  <go:docsCustomData xmlns:go="http://customooxmlschemas.google.com/" roundtripDataSignature="AMtx7miehlgh2pzFvkmpnhkVaeODs3Wnuw==">CgMxLjAyCGguZ2pkZ3hzMgloLjMwajB6bGwyCWguMWZvYjl0ZTIJaC4zem55c2g3MgloLjJldDkycDAyDmgua2ZranMzcndsMmMxOAByITF6bEVRVXYyWkdtTjZWemdfYk5uaGpmb0x1c2hhYUo3dw==</go:docsCustomData>
-</go:gDocsCustomXmlDataStorage>
-</file>
-
-<file path=customXml/item4.xml><?xml version="1.0" encoding="utf-8"?>
-<p:properties xmlns:p="http://schemas.microsoft.com/office/2006/metadata/properties" xmlns:xsi="http://www.w3.org/2001/XMLSchema-instance" xmlns:pc="http://schemas.microsoft.com/office/infopath/2007/PartnerControls">
-  <documentManagement>
-    <_activity xmlns="b16a9495-4dfd-42d3-807b-98cb11f03b43" xsi:nil="true"/>
-  </documentManagement>
-</p:properties>
-</file>
-
-<file path=customXml/item5.xml><?xml version="1.0" encoding="utf-8"?>
+<file path=customXml/item2.xml><?xml version="1.0" encoding="utf-8"?>
 <?mso-contentType ?>
 <FormTemplates xmlns="http://schemas.microsoft.com/sharepoint/v3/contenttype/forms">
   <Display>DocumentLibraryForm</Display>
@@ -9170,15 +9686,90 @@
 </FormTemplates>
 </file>
 
-<file path=customXml/itemProps1.xml><?xml version="1.0" encoding="utf-8"?>
-<ds:datastoreItem xmlns:ds="http://schemas.openxmlformats.org/officeDocument/2006/customXml" ds:itemID="{A5C61161-19E4-4D42-A5DA-EC591AFE0A7D}">
-  <ds:schemaRefs>
-    <ds:schemaRef ds:uri="http://schemas.openxmlformats.org/officeDocument/2006/bibliography"/>
-  </ds:schemaRefs>
-</ds:datastoreItem>
+<file path=customXml/item3.xml><?xml version="1.0" encoding="utf-8"?>
+<p:properties xmlns:p="http://schemas.microsoft.com/office/2006/metadata/properties" xmlns:xsi="http://www.w3.org/2001/XMLSchema-instance" xmlns:pc="http://schemas.microsoft.com/office/infopath/2007/PartnerControls">
+  <documentManagement>
+    <_activity xmlns="b16a9495-4dfd-42d3-807b-98cb11f03b43" xsi:nil="true"/>
+  </documentManagement>
+</p:properties>
 </file>
 
-<file path=customXml/itemProps2.xml><?xml version="1.0" encoding="utf-8"?>
+<file path=customXml/item4.xml><?xml version="1.0" encoding="utf-8"?>
+<go:gDocsCustomXmlDataStorage xmlns:go="http://customooxmlschemas.google.com/" xmlns:r="http://schemas.openxmlformats.org/officeDocument/2006/relationships" uri="GoogleDocsCustomDataVersion2">
+  <go:docsCustomData xmlns:go="http://customooxmlschemas.google.com/" roundtripDataSignature="AMtx7miehlgh2pzFvkmpnhkVaeODs3Wnuw==">CgMxLjAyCGguZ2pkZ3hzMgloLjMwajB6bGwyCWguMWZvYjl0ZTIJaC4zem55c2g3MgloLjJldDkycDAyDmgua2ZranMzcndsMmMxOAByITF6bEVRVXYyWkdtTjZWemdfYk5uaGpmb0x1c2hhYUo3dw==</go:docsCustomData>
+</go:gDocsCustomXmlDataStorage>
+</file>
+
+<file path=customXml/item5.xml><?xml version="1.0" encoding="utf-8"?>
+<b:Sources xmlns:b="http://schemas.openxmlformats.org/officeDocument/2006/bibliography" xmlns="http://schemas.openxmlformats.org/officeDocument/2006/bibliography" SelectedStyle="\HarvardAnglia2008OfficeOnline.xsl" StyleName="Harvard - Anglia" Version="2008">
+  <b:Source>
+    <b:Tag>Pat18</b:Tag>
+    <b:SourceType>ArticleInAPeriodical</b:SourceType>
+    <b:Guid>{5B52B951-322D-4CCD-8748-31433AF64BBC}</b:Guid>
+    <b:Title>Data Analytics Systems and SME type - a Design Science Approach</b:Title>
+    <b:Year>2018</b:Year>
+    <b:LCID>en-IE</b:LCID>
+    <b:Author>
+      <b:Author>
+        <b:NameList>
+          <b:Person>
+            <b:Last>Patrick ULRICH</b:Last>
+            <b:First>Wolfgang</b:First>
+            <b:Middle>BECKER, Alexandra FIBITZ, Eva REITELSHÖFER</b:Middle>
+          </b:Person>
+        </b:NameList>
+      </b:Author>
+    </b:Author>
+    <b:PeriodicalTitle>ScienceDirect</b:PeriodicalTitle>
+    <b:Pages>1162–1170</b:Pages>
+    <b:RefOrder>1</b:RefOrder>
+  </b:Source>
+  <b:Source>
+    <b:Tag>Gün19</b:Tag>
+    <b:SourceType>ArticleInAPeriodical</b:SourceType>
+    <b:Guid>{8B29ADD7-CF57-41D6-8460-C908A42EA451}</b:Guid>
+    <b:Author>
+      <b:Author>
+        <b:NameList>
+          <b:Person>
+            <b:Last>Günther</b:Last>
+            <b:First>Lisa</b:First>
+            <b:Middle>C., Colangelo, Eduardo, Wiendahl, Hans-Hermann, Bauer, Christian</b:Middle>
+          </b:Person>
+        </b:NameList>
+      </b:Author>
+    </b:Author>
+    <b:Title>Data quality assessment for improved decision-making: a methodology for small and medium-sized enterprises</b:Title>
+    <b:PeriodicalTitle>Procedia Manufacturing</b:PeriodicalTitle>
+    <b:Year>2019</b:Year>
+    <b:Pages>583–591</b:Pages>
+    <b:RefOrder>2</b:RefOrder>
+  </b:Source>
+  <b:Source>
+    <b:Tag>Ber21</b:Tag>
+    <b:SourceType>ArticleInAPeriodical</b:SourceType>
+    <b:Guid>{1F06AFAC-C1ED-469E-AF8B-13855CC9A64D}</b:Guid>
+    <b:Author>
+      <b:Author>
+        <b:NameList>
+          <b:Person>
+            <b:Last>Bernritter</b:Last>
+            <b:First>S.F.,</b:First>
+            <b:Middle>Ketelaar, P.E. and Sotgiu, F.</b:Middle>
+          </b:Person>
+        </b:NameList>
+      </b:Author>
+    </b:Author>
+    <b:Title>Behaviorally targeted location-based mobile marketing’</b:Title>
+    <b:PeriodicalTitle>Journal of the Academy of Marketing Science</b:PeriodicalTitle>
+    <b:Year>2021</b:Year>
+    <b:Pages>49:677–702</b:Pages>
+    <b:RefOrder>3</b:RefOrder>
+  </b:Source>
+</b:Sources>
+</file>
+
+<file path=customXml/itemProps1.xml><?xml version="1.0" encoding="utf-8"?>
 <ds:datastoreItem xmlns:ds="http://schemas.openxmlformats.org/officeDocument/2006/customXml" ds:itemID="{1CD39011-2B34-4226-8638-59B13D86301D}">
   <ds:schemaRefs>
     <ds:schemaRef ds:uri="http://schemas.microsoft.com/office/2006/metadata/contentType"/>
@@ -9196,16 +9787,15 @@
 </ds:datastoreItem>
 </file>
 
-<file path=customXml/itemProps3.xml><?xml version="1.0" encoding="utf-8"?>
-<ds:datastoreItem xmlns:ds="http://schemas.openxmlformats.org/officeDocument/2006/customXml" ds:itemID="{11111111-1234-1234-1234-123412341234}">
+<file path=customXml/itemProps2.xml><?xml version="1.0" encoding="utf-8"?>
+<ds:datastoreItem xmlns:ds="http://schemas.openxmlformats.org/officeDocument/2006/customXml" ds:itemID="{AD64260C-1345-4C21-A804-B9FBE7B91489}">
   <ds:schemaRefs>
-    <ds:schemaRef ds:uri="http://customooxmlschemas.google.com/"/>
-    <ds:schemaRef ds:uri="http://schemas.openxmlformats.org/officeDocument/2006/relationships"/>
+    <ds:schemaRef ds:uri="http://schemas.microsoft.com/sharepoint/v3/contenttype/forms"/>
   </ds:schemaRefs>
 </ds:datastoreItem>
 </file>
 
-<file path=customXml/itemProps4.xml><?xml version="1.0" encoding="utf-8"?>
+<file path=customXml/itemProps3.xml><?xml version="1.0" encoding="utf-8"?>
 <ds:datastoreItem xmlns:ds="http://schemas.openxmlformats.org/officeDocument/2006/customXml" ds:itemID="{D51EB97A-8C7A-4EE1-A3AD-E57FDBFA6BEE}">
   <ds:schemaRefs>
     <ds:schemaRef ds:uri="http://schemas.microsoft.com/office/2006/metadata/properties"/>
@@ -9215,10 +9805,19 @@
 </ds:datastoreItem>
 </file>
 
+<file path=customXml/itemProps4.xml><?xml version="1.0" encoding="utf-8"?>
+<ds:datastoreItem xmlns:ds="http://schemas.openxmlformats.org/officeDocument/2006/customXml" ds:itemID="{11111111-1234-1234-1234-123412341234}">
+  <ds:schemaRefs>
+    <ds:schemaRef ds:uri="http://customooxmlschemas.google.com/"/>
+    <ds:schemaRef ds:uri="http://schemas.openxmlformats.org/officeDocument/2006/relationships"/>
+  </ds:schemaRefs>
+</ds:datastoreItem>
+</file>
+
 <file path=customXml/itemProps5.xml><?xml version="1.0" encoding="utf-8"?>
-<ds:datastoreItem xmlns:ds="http://schemas.openxmlformats.org/officeDocument/2006/customXml" ds:itemID="{AD64260C-1345-4C21-A804-B9FBE7B91489}">
+<ds:datastoreItem xmlns:ds="http://schemas.openxmlformats.org/officeDocument/2006/customXml" ds:itemID="{28DEA961-AB56-423F-B0AE-A4C6421841DF}">
   <ds:schemaRefs>
-    <ds:schemaRef ds:uri="http://schemas.microsoft.com/sharepoint/v3/contenttype/forms"/>
+    <ds:schemaRef ds:uri="http://schemas.openxmlformats.org/officeDocument/2006/bibliography"/>
   </ds:schemaRefs>
 </ds:datastoreItem>
 </file>
</xml_diff>